<commit_message>
feat: implement global StateService with signal-based architecture and add document template file
</commit_message>
<xml_diff>
--- a/FILEBIEUMAUGOC/filebieumau_FORM_TRANG4.docx
+++ b/FILEBIEUMAUGOC/filebieumau_FORM_TRANG4.docx
@@ -1,113 +1,7 @@
 
-<file path=customXml\item1.xml><?xml version="1.0" encoding="utf-8"?>
-<b:Sources xmlns:b="http://schemas.openxmlformats.org/officeDocument/2006/bibliography" xmlns="http://schemas.openxmlformats.org/officeDocument/2006/bibliography" SelectedStyle="/APASixthEditionOfficeOnline.xsl" StyleName="APA" Version="6"/>
-</file>
-
-<file path=customXml\itemProps1.xml><?xml version="1.0" encoding="utf-8"?>
-<ds:datastoreItem xmlns:ds="http://schemas.openxmlformats.org/officeDocument/2006/customXml" ds:itemID="{4B7C3B75-6202-F241-B286-EFD9F064274F}">
-  <ds:schemaRefs>
-    <ds:schemaRef ds:uri="http://schemas.openxmlformats.org/officeDocument/2006/bibliography"/>
-  </ds:schemaRefs>
-</ds:datastoreItem>
-</file>
-
-<file path=docProps\app.xml><?xml version="1.0" encoding="utf-8"?>
-<Properties xmlns="http://schemas.openxmlformats.org/officeDocument/2006/extended-properties" xmlns:vt="http://schemas.openxmlformats.org/officeDocument/2006/docPropsVTypes">
-  <Template>Normal.dotm</Template>
-  <TotalTime>53</TotalTime>
-  <Pages>14</Pages>
-  <Words>2885</Words>
-  <Characters>16447</Characters>
-  <Application>Microsoft Office Word</Application>
-  <DocSecurity>0</DocSecurity>
-  <Lines>137</Lines>
-  <Paragraphs>38</Paragraphs>
-  <ScaleCrop>false</ScaleCrop>
-  <HeadingPairs>
-    <vt:vector size="2" baseType="variant">
-      <vt:variant>
-        <vt:lpstr>Title</vt:lpstr>
-      </vt:variant>
-      <vt:variant>
-        <vt:i4>1</vt:i4>
-      </vt:variant>
-    </vt:vector>
-  </HeadingPairs>
-  <TitlesOfParts>
-    <vt:vector size="1" baseType="lpstr">
-      <vt:lpstr/>
-    </vt:vector>
-  </TitlesOfParts>
-  <Company/>
-  <LinksUpToDate>false</LinksUpToDate>
-  <CharactersWithSpaces>19294</CharactersWithSpaces>
-  <SharedDoc>false</SharedDoc>
-  <HyperlinksChanged>false</HyperlinksChanged>
-  <AppVersion>16.0000</AppVersion>
-</Properties>
-</file>
-
-<file path=docProps\core.xml><?xml version="1.0" encoding="utf-8"?>
-<cp:coreProperties xmlns:cp="http://schemas.openxmlformats.org/package/2006/metadata/core-properties" xmlns:dc="http://purl.org/dc/elements/1.1/" xmlns:dcterms="http://purl.org/dc/terms/" xmlns:dcmitype="http://purl.org/dc/dcmitype/" xmlns:xsi="http://www.w3.org/2001/XMLSchema-instance">
-  <dc:title/>
-  <dc:subject/>
-  <dc:creator>Otada</dc:creator>
-  <cp:keywords/>
-  <dc:description/>
-  <cp:lastModifiedBy>Otada</cp:lastModifiedBy>
-  <cp:revision>17</cp:revision>
-  <cp:lastPrinted>2024-04-11T07:28:00Z</cp:lastPrinted>
-  <dcterms:created xsi:type="dcterms:W3CDTF">2024-04-15T03:29:00Z</dcterms:created>
-  <dcterms:modified xsi:type="dcterms:W3CDTF">2024-07-24T09:02:00Z</dcterms:modified>
-</cp:coreProperties>
-</file>
-
-<file path=docProps\custom.xml><?xml version="1.0" encoding="utf-8"?>
-<Properties xmlns="http://schemas.openxmlformats.org/officeDocument/2006/custom-properties" xmlns:vt="http://schemas.openxmlformats.org/officeDocument/2006/docPropsVTypes">
-  <property fmtid="{D5CDD505-2E9C-101B-9397-08002B2CF9AE}" pid="2" name="MSIP_Label_defa4170-0d19-0005-0004-bc88714345d2_Enabled">
-    <vt:lpwstr>true</vt:lpwstr>
-  </property>
-  <property fmtid="{D5CDD505-2E9C-101B-9397-08002B2CF9AE}" pid="3" name="MSIP_Label_defa4170-0d19-0005-0004-bc88714345d2_SetDate">
-    <vt:lpwstr>2024-04-03T08:56:01Z</vt:lpwstr>
-  </property>
-  <property fmtid="{D5CDD505-2E9C-101B-9397-08002B2CF9AE}" pid="4" name="MSIP_Label_defa4170-0d19-0005-0004-bc88714345d2_Method">
-    <vt:lpwstr>Standard</vt:lpwstr>
-  </property>
-  <property fmtid="{D5CDD505-2E9C-101B-9397-08002B2CF9AE}" pid="5" name="MSIP_Label_defa4170-0d19-0005-0004-bc88714345d2_Name">
-    <vt:lpwstr>defa4170-0d19-0005-0004-bc88714345d2</vt:lpwstr>
-  </property>
-  <property fmtid="{D5CDD505-2E9C-101B-9397-08002B2CF9AE}" pid="6" name="MSIP_Label_defa4170-0d19-0005-0004-bc88714345d2_SiteId">
-    <vt:lpwstr>79df7c7d-8754-492c-8c78-fff330490093</vt:lpwstr>
-  </property>
-  <property fmtid="{D5CDD505-2E9C-101B-9397-08002B2CF9AE}" pid="7" name="MSIP_Label_defa4170-0d19-0005-0004-bc88714345d2_ActionId">
-    <vt:lpwstr>25e7862c-6a76-4575-ae85-3fc3ec1ae06c</vt:lpwstr>
-  </property>
-  <property fmtid="{D5CDD505-2E9C-101B-9397-08002B2CF9AE}" pid="8" name="MSIP_Label_defa4170-0d19-0005-0004-bc88714345d2_ContentBits">
-    <vt:lpwstr>0</vt:lpwstr>
-  </property>
-</Properties>
-</file>
-
-<file path=word\document.xml><?xml version="1.0" encoding="utf-8"?>
-<w:document xmlns:wpc="http://schemas.microsoft.com/office/word/2010/wordprocessingCanvas" xmlns:cx="http://schemas.microsoft.com/office/drawing/2014/chartex" xmlns:cx1="http://schemas.microsoft.com/office/drawing/2015/9/8/chartex" xmlns:cx2="http://schemas.microsoft.com/office/drawing/2015/10/21/chartex" xmlns:cx3="http://schemas.microsoft.com/office/drawing/2016/5/9/chartex" xmlns:cx4="http://schemas.microsoft.com/office/drawing/2016/5/10/chartex" xmlns:cx5="http://schemas.microsoft.com/office/drawing/2016/5/11/chartex" xmlns:cx6="http://schemas.microsoft.com/office/drawing/2016/5/12/chartex" xmlns:cx7="http://schemas.microsoft.com/office/drawing/2016/5/13/chartex" xmlns:cx8="http://schemas.microsoft.com/office/drawing/2016/5/14/chartex" xmlns:mc="http://schemas.openxmlformats.org/markup-compatibility/2006" xmlns:aink="http://schemas.microsoft.com/office/drawing/2016/ink" xmlns:am3d="http://schemas.microsoft.com/office/drawing/2017/model3d" xmlns:o="urn:schemas-microsoft-com:office:office" xmlns:oel="http://schemas.microsoft.com/office/2019/extlst" xmlns:r="http://schemas.openxmlformats.org/officeDocument/2006/relationships" xmlns:m="http://schemas.openxmlformats.org/officeDocument/2006/math" xmlns:v="urn:schemas-microsoft-com:vml" xmlns:wp14="http://schemas.microsoft.com/office/word/2010/wordprocessingDrawing" xmlns:wp="http://schemas.openxmlformats.org/drawingml/2006/wordprocessingDrawing" xmlns:w10="urn:schemas-microsoft-com:office:word" xmlns:w="http://schemas.openxmlformats.org/wordprocessingml/2006/main" xmlns:w14="http://schemas.microsoft.com/office/word/2010/wordml" xmlns:w15="http://schemas.microsoft.com/office/word/2012/wordml" xmlns:w16cex="http://schemas.microsoft.com/office/word/2018/wordml/cex" xmlns:w16cid="http://schemas.microsoft.com/office/word/2016/wordml/cid" xmlns:w16="http://schemas.microsoft.com/office/word/2018/wordml" xmlns:w16sdtdh="http://schemas.microsoft.com/office/word/2020/wordml/sdtdatahash" xmlns:w16se="http://schemas.microsoft.com/office/word/2015/wordml/symex" xmlns:wpg="http://schemas.microsoft.com/office/word/2010/wordprocessingGroup" xmlns:wpi="http://schemas.microsoft.com/office/word/2010/wordprocessingInk" xmlns:wne="http://schemas.microsoft.com/office/word/2006/wordml" xmlns:wps="http://schemas.microsoft.com/office/word/2010/wordprocessingShape" mc:Ignorable="w14 w15 w16se w16cid w16 w16cex w16sdtdh wp14">
+<file path=word/document.xml><?xml version="1.0" encoding="utf-8"?>
+<w:document xmlns:wpc="http://schemas.microsoft.com/office/word/2010/wordprocessingCanvas" xmlns:cx="http://schemas.microsoft.com/office/drawing/2014/chartex" xmlns:cx1="http://schemas.microsoft.com/office/drawing/2015/9/8/chartex" xmlns:cx2="http://schemas.microsoft.com/office/drawing/2015/10/21/chartex" xmlns:cx3="http://schemas.microsoft.com/office/drawing/2016/5/9/chartex" xmlns:cx4="http://schemas.microsoft.com/office/drawing/2016/5/10/chartex" xmlns:cx5="http://schemas.microsoft.com/office/drawing/2016/5/11/chartex" xmlns:cx6="http://schemas.microsoft.com/office/drawing/2016/5/12/chartex" xmlns:cx7="http://schemas.microsoft.com/office/drawing/2016/5/13/chartex" xmlns:cx8="http://schemas.microsoft.com/office/drawing/2016/5/14/chartex" xmlns:mc="http://schemas.openxmlformats.org/markup-compatibility/2006" xmlns:aink="http://schemas.microsoft.com/office/drawing/2016/ink" xmlns:am3d="http://schemas.microsoft.com/office/drawing/2017/model3d" xmlns:o="urn:schemas-microsoft-com:office:office" xmlns:oel="http://schemas.microsoft.com/office/2019/extlst" xmlns:r="http://schemas.openxmlformats.org/officeDocument/2006/relationships" xmlns:m="http://schemas.openxmlformats.org/officeDocument/2006/math" xmlns:v="urn:schemas-microsoft-com:vml" xmlns:wp14="http://schemas.microsoft.com/office/word/2010/wordprocessingDrawing" xmlns:wp="http://schemas.openxmlformats.org/drawingml/2006/wordprocessingDrawing" xmlns:w10="urn:schemas-microsoft-com:office:word" xmlns:w="http://schemas.openxmlformats.org/wordprocessingml/2006/main" xmlns:w14="http://schemas.microsoft.com/office/word/2010/wordml" xmlns:w15="http://schemas.microsoft.com/office/word/2012/wordml" xmlns:w16cex="http://schemas.microsoft.com/office/word/2018/wordml/cex" xmlns:w16cid="http://schemas.microsoft.com/office/word/2016/wordml/cid" xmlns:w16="http://schemas.microsoft.com/office/word/2018/wordml" xmlns:w16du="http://schemas.microsoft.com/office/word/2023/wordml/word16du" xmlns:w16sdtdh="http://schemas.microsoft.com/office/word/2020/wordml/sdtdatahash" xmlns:w16sdtfl="http://schemas.microsoft.com/office/word/2024/wordml/sdtformatlock" xmlns:w16se="http://schemas.microsoft.com/office/word/2015/wordml/symex" xmlns:wpg="http://schemas.microsoft.com/office/word/2010/wordprocessingGroup" xmlns:wpi="http://schemas.microsoft.com/office/word/2010/wordprocessingInk" xmlns:wne="http://schemas.microsoft.com/office/word/2006/wordml" xmlns:wps="http://schemas.microsoft.com/office/word/2010/wordprocessingShape" mc:Ignorable="w14 w15 w16se w16cid w16 w16cex w16sdtdh w16sdtfl w16du wp14">
   <w:body>
-    <w:p>
-      <w:pPr>
-        <w:pStyle w:val="MCLC1"/>
-      </w:pPr>
-      <w:bookmarkStart w:id="38" w:name="_Ref164260086"/>
-      <w:r>
-        <w:t>BIỂU MẪU GHI CHÉP KẾT QUẢ PHÂN TÍCH</w:t>
-      </w:r>
-      <w:bookmarkEnd w:id="37"/>
-      <w:bookmarkEnd w:id="38"/>
-    </w:p>
-    <w:p>
-      <w:pPr>
-        <w:pStyle w:val="ListParagraph"/>
-        <w:ind w:left="0"/>
-      </w:pPr>
-    </w:p>
     <w:p>
       <w:pPr>
         <w:pStyle w:val="Subtitle"/>
@@ -128,7 +22,6 @@
           <w:sz w:val="28"/>
           <w:szCs w:val="56"/>
         </w:rPr>
-        <w:lastRenderedPageBreak/>
         <w:t>XÁC ĐỊNH DƯ LƯỢNG THUỐC BẢO VỆ THỰC VẬT NHÓM CHLOR HỮU CƠ</w:t>
       </w:r>
     </w:p>
@@ -599,7 +492,7 @@
           </mc:Choice>
           <mc:Fallback>
             <w:pict>
-              <v:rect w14:anchorId="3E774EB8" id="Rectangle 3" o:spid="_x0000_s1026" style="position:absolute;margin-left:84.15pt;margin-top:20.8pt;width:111.75pt;height:27pt;z-index:251659264;visibility:visible;mso-wrap-style:square;mso-width-percent:0;mso-height-percent:0;mso-wrap-distance-left:9pt;mso-wrap-distance-top:0;mso-wrap-distance-right:9pt;mso-wrap-distance-bottom:0;mso-position-horizontal:absolute;mso-position-horizontal-relative:text;mso-position-vertical:absolute;mso-position-vertical-relative:text;mso-width-percent:0;mso-height-percent:0;mso-width-relative:page;mso-height-relative:margin;v-text-anchor:middle" o:gfxdata="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" fillcolor="window" strokecolor="windowText" strokeweight="1pt">
+              <v:rect w14:anchorId="3E774EB8" id="Rectangle 3" o:spid="_x0000_s1026" style="position:absolute;margin-left:84.15pt;margin-top:20.8pt;width:111.75pt;height:27pt;z-index:251659264;visibility:visible;mso-wrap-style:square;mso-width-percent:0;mso-height-percent:0;mso-wrap-distance-left:9pt;mso-wrap-distance-top:0;mso-wrap-distance-right:9pt;mso-wrap-distance-bottom:0;mso-position-horizontal:absolute;mso-position-horizontal-relative:text;mso-position-vertical:absolute;mso-position-vertical-relative:text;mso-width-percent:0;mso-height-percent:0;mso-width-relative:page;mso-height-relative:margin;v-text-anchor:middle" o:gfxdata="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" fillcolor="window" strokecolor="windowText" strokeweight="1pt">
                 <v:path arrowok="t"/>
                 <v:textbox>
                   <w:txbxContent>
@@ -709,7 +602,6 @@
         <w:tc>
           <w:tcPr>
             <w:tcW w:w="1229" w:type="dxa"/>
-            <w:shd w:val="clear" w:color="auto" w:fill="auto"/>
             <w:vAlign w:val="center"/>
           </w:tcPr>
           <w:p>
@@ -738,7 +630,6 @@
         <w:tc>
           <w:tcPr>
             <w:tcW w:w="1491" w:type="dxa"/>
-            <w:shd w:val="clear" w:color="auto" w:fill="auto"/>
             <w:vAlign w:val="center"/>
           </w:tcPr>
           <w:p>
@@ -804,7 +695,6 @@
         <w:tc>
           <w:tcPr>
             <w:tcW w:w="1449" w:type="dxa"/>
-            <w:shd w:val="clear" w:color="auto" w:fill="auto"/>
             <w:vAlign w:val="center"/>
           </w:tcPr>
           <w:p>
@@ -853,7 +743,6 @@
         <w:tc>
           <w:tcPr>
             <w:tcW w:w="1229" w:type="dxa"/>
-            <w:shd w:val="clear" w:color="auto" w:fill="auto"/>
             <w:vAlign w:val="center"/>
           </w:tcPr>
           <w:p>
@@ -882,7 +771,6 @@
         <w:tc>
           <w:tcPr>
             <w:tcW w:w="1491" w:type="dxa"/>
-            <w:shd w:val="clear" w:color="auto" w:fill="auto"/>
             <w:vAlign w:val="center"/>
           </w:tcPr>
           <w:p>
@@ -911,7 +799,6 @@
         <w:tc>
           <w:tcPr>
             <w:tcW w:w="1449" w:type="dxa"/>
-            <w:shd w:val="clear" w:color="auto" w:fill="auto"/>
             <w:vAlign w:val="center"/>
           </w:tcPr>
           <w:p>
@@ -945,7 +832,6 @@
         <w:tc>
           <w:tcPr>
             <w:tcW w:w="1229" w:type="dxa"/>
-            <w:shd w:val="clear" w:color="auto" w:fill="auto"/>
             <w:vAlign w:val="center"/>
           </w:tcPr>
           <w:p>
@@ -974,7 +860,6 @@
         <w:tc>
           <w:tcPr>
             <w:tcW w:w="1491" w:type="dxa"/>
-            <w:shd w:val="clear" w:color="auto" w:fill="auto"/>
             <w:vAlign w:val="center"/>
           </w:tcPr>
           <w:p>
@@ -1003,7 +888,6 @@
         <w:tc>
           <w:tcPr>
             <w:tcW w:w="1449" w:type="dxa"/>
-            <w:shd w:val="clear" w:color="auto" w:fill="auto"/>
             <w:vAlign w:val="center"/>
           </w:tcPr>
           <w:p>
@@ -1035,7 +919,6 @@
         <w:tc>
           <w:tcPr>
             <w:tcW w:w="1229" w:type="dxa"/>
-            <w:shd w:val="clear" w:color="auto" w:fill="auto"/>
             <w:vAlign w:val="center"/>
           </w:tcPr>
           <w:p>
@@ -1064,7 +947,6 @@
         <w:tc>
           <w:tcPr>
             <w:tcW w:w="1491" w:type="dxa"/>
-            <w:shd w:val="clear" w:color="auto" w:fill="auto"/>
             <w:vAlign w:val="center"/>
           </w:tcPr>
           <w:p>
@@ -1093,7 +975,6 @@
         <w:tc>
           <w:tcPr>
             <w:tcW w:w="1449" w:type="dxa"/>
-            <w:shd w:val="clear" w:color="auto" w:fill="auto"/>
             <w:vAlign w:val="center"/>
           </w:tcPr>
           <w:p>
@@ -1125,7 +1006,6 @@
         <w:tc>
           <w:tcPr>
             <w:tcW w:w="1229" w:type="dxa"/>
-            <w:shd w:val="clear" w:color="auto" w:fill="auto"/>
             <w:vAlign w:val="center"/>
           </w:tcPr>
           <w:p>
@@ -1154,7 +1034,6 @@
         <w:tc>
           <w:tcPr>
             <w:tcW w:w="1491" w:type="dxa"/>
-            <w:shd w:val="clear" w:color="auto" w:fill="auto"/>
             <w:vAlign w:val="center"/>
           </w:tcPr>
           <w:p>
@@ -1183,7 +1062,6 @@
         <w:tc>
           <w:tcPr>
             <w:tcW w:w="1449" w:type="dxa"/>
-            <w:shd w:val="clear" w:color="auto" w:fill="auto"/>
             <w:vAlign w:val="center"/>
           </w:tcPr>
           <w:p>
@@ -1215,7 +1093,6 @@
         <w:tc>
           <w:tcPr>
             <w:tcW w:w="1229" w:type="dxa"/>
-            <w:shd w:val="clear" w:color="auto" w:fill="auto"/>
             <w:vAlign w:val="center"/>
           </w:tcPr>
           <w:p>
@@ -1244,7 +1121,6 @@
         <w:tc>
           <w:tcPr>
             <w:tcW w:w="1491" w:type="dxa"/>
-            <w:shd w:val="clear" w:color="auto" w:fill="auto"/>
             <w:vAlign w:val="center"/>
           </w:tcPr>
           <w:p>
@@ -1273,7 +1149,6 @@
         <w:tc>
           <w:tcPr>
             <w:tcW w:w="1449" w:type="dxa"/>
-            <w:shd w:val="clear" w:color="auto" w:fill="auto"/>
             <w:vAlign w:val="center"/>
           </w:tcPr>
           <w:p>
@@ -1305,7 +1180,6 @@
         <w:tc>
           <w:tcPr>
             <w:tcW w:w="1229" w:type="dxa"/>
-            <w:shd w:val="clear" w:color="auto" w:fill="auto"/>
             <w:vAlign w:val="center"/>
           </w:tcPr>
           <w:p>
@@ -1334,7 +1208,6 @@
         <w:tc>
           <w:tcPr>
             <w:tcW w:w="1491" w:type="dxa"/>
-            <w:shd w:val="clear" w:color="auto" w:fill="auto"/>
             <w:vAlign w:val="center"/>
           </w:tcPr>
           <w:p>
@@ -1363,7 +1236,6 @@
         <w:tc>
           <w:tcPr>
             <w:tcW w:w="1449" w:type="dxa"/>
-            <w:shd w:val="clear" w:color="auto" w:fill="auto"/>
             <w:vAlign w:val="center"/>
           </w:tcPr>
           <w:p>
@@ -1486,7 +1358,7 @@
                 <v:path arrowok="t" fillok="f" o:connecttype="none"/>
                 <o:lock v:ext="edit" shapetype="t"/>
               </v:shapetype>
-              <v:shape id="Đường kết nối Mũi tên Thẳng 2" o:spid="_x0000_s1026" type="#_x0000_t32" style="position:absolute;margin-left:134.95pt;margin-top:185pt;width:12.9pt;height:0;rotation:90;z-index:251663360;visibility:visible;mso-wrap-style:square;mso-width-percent:0;mso-height-percent:0;mso-wrap-distance-left:9pt;mso-wrap-distance-top:0;mso-wrap-distance-right:9pt;mso-wrap-distance-bottom:0;mso-position-horizontal:absolute;mso-position-horizontal-relative:text;mso-position-vertical:absolute;mso-position-vertical-relative:text;mso-width-percent:0;mso-height-percent:0;mso-width-relative:margin;mso-height-relative:margin" o:gfxdata="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">
+              <v:shape id="Đường kết nối Mũi tên Thẳng 2" o:spid="_x0000_s1026" type="#_x0000_t32" style="position:absolute;margin-left:134.95pt;margin-top:185pt;width:12.9pt;height:0;rotation:90;z-index:251663360;visibility:visible;mso-wrap-style:square;mso-width-percent:0;mso-height-percent:0;mso-wrap-distance-left:9pt;mso-wrap-distance-top:0;mso-wrap-distance-right:9pt;mso-wrap-distance-bottom:0;mso-position-horizontal:absolute;mso-position-horizontal-relative:text;mso-position-vertical:absolute;mso-position-vertical-relative:text;mso-width-percent:0;mso-height-percent:0;mso-width-relative:margin;mso-height-relative:margin" o:gfxdata="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">
                 <v:stroke endarrow="open"/>
                 <o:lock v:ext="edit" shapetype="f"/>
               </v:shape>
@@ -1581,7 +1453,7 @@
           </mc:Choice>
           <mc:Fallback>
             <w:pict>
-              <v:rect w14:anchorId="1F66EF05" id="Rectangle 1" o:spid="_x0000_s1027" style="position:absolute;margin-left:90.35pt;margin-top:191.3pt;width:100.5pt;height:22.5pt;z-index:251662336;visibility:visible;mso-wrap-style:square;mso-width-percent:0;mso-height-percent:0;mso-wrap-distance-left:9pt;mso-wrap-distance-top:0;mso-wrap-distance-right:9pt;mso-wrap-distance-bottom:0;mso-position-horizontal:absolute;mso-position-horizontal-relative:text;mso-position-vertical:absolute;mso-position-vertical-relative:text;mso-width-percent:0;mso-height-percent:0;mso-width-relative:page;mso-height-relative:margin;v-text-anchor:middle" o:gfxdata="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" fillcolor="window" strokecolor="windowText" strokeweight="1pt">
+              <v:rect w14:anchorId="1F66EF05" id="Rectangle 1" o:spid="_x0000_s1027" style="position:absolute;margin-left:90.35pt;margin-top:191.3pt;width:100.5pt;height:22.5pt;z-index:251662336;visibility:visible;mso-wrap-style:square;mso-width-percent:0;mso-height-percent:0;mso-wrap-distance-left:9pt;mso-wrap-distance-top:0;mso-wrap-distance-right:9pt;mso-wrap-distance-bottom:0;mso-position-horizontal:absolute;mso-position-horizontal-relative:text;mso-position-vertical:absolute;mso-position-vertical-relative:text;mso-width-percent:0;mso-height-percent:0;mso-width-relative:page;mso-height-relative:margin;v-text-anchor:middle" o:gfxdata="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" fillcolor="window" strokecolor="windowText" strokeweight="1pt">
                 <v:path arrowok="t"/>
                 <v:textbox>
                   <w:txbxContent>
@@ -1676,7 +1548,7 @@
           </mc:Choice>
           <mc:Fallback>
             <w:pict>
-              <v:shape w14:anchorId="3ED19C9C" id="Đường kết nối Mũi tên Thẳng 2" o:spid="_x0000_s1026" type="#_x0000_t32" style="position:absolute;margin-left:134.25pt;margin-top:17.2pt;width:14.3pt;height:0;rotation:90;z-index:251660288;visibility:visible;mso-wrap-style:square;mso-width-percent:0;mso-height-percent:0;mso-wrap-distance-left:9pt;mso-wrap-distance-top:0;mso-wrap-distance-right:9pt;mso-wrap-distance-bottom:0;mso-position-horizontal:absolute;mso-position-horizontal-relative:text;mso-position-vertical:absolute;mso-position-vertical-relative:text;mso-width-percent:0;mso-height-percent:0;mso-width-relative:margin;mso-height-relative:margin" o:gfxdata="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">
+              <v:shape w14:anchorId="3ED19C9C" id="Đường kết nối Mũi tên Thẳng 2" o:spid="_x0000_s1026" type="#_x0000_t32" style="position:absolute;margin-left:134.25pt;margin-top:17.2pt;width:14.3pt;height:0;rotation:90;z-index:251660288;visibility:visible;mso-wrap-style:square;mso-width-percent:0;mso-height-percent:0;mso-wrap-distance-left:9pt;mso-wrap-distance-top:0;mso-wrap-distance-right:9pt;mso-wrap-distance-bottom:0;mso-position-horizontal:absolute;mso-position-horizontal-relative:text;mso-position-vertical:absolute;mso-position-vertical-relative:text;mso-width-percent:0;mso-height-percent:0;mso-width-relative:margin;mso-height-relative:margin" o:gfxdata="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">
                 <v:stroke endarrow="open"/>
                 <o:lock v:ext="edit" shapetype="f"/>
               </v:shape>
@@ -2017,7 +1889,7 @@
           </mc:Choice>
           <mc:Fallback>
             <w:pict>
-              <v:rect w14:anchorId="4C3758B3" id="Rectangle 2" o:spid="_x0000_s1028" style="position:absolute;margin-left:15.95pt;margin-top:24.5pt;width:252.75pt;height:152.5pt;z-index:251661312;visibility:visible;mso-wrap-style:square;mso-width-percent:0;mso-height-percent:0;mso-wrap-distance-left:9pt;mso-wrap-distance-top:0;mso-wrap-distance-right:9pt;mso-wrap-distance-bottom:0;mso-position-horizontal:absolute;mso-position-horizontal-relative:text;mso-position-vertical:absolute;mso-position-vertical-relative:text;mso-width-percent:0;mso-height-percent:0;mso-width-relative:margin;mso-height-relative:margin;v-text-anchor:middle" o:gfxdata="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" fillcolor="window" strokecolor="windowText" strokeweight="1pt">
+              <v:rect w14:anchorId="4C3758B3" id="Rectangle 2" o:spid="_x0000_s1028" style="position:absolute;margin-left:15.95pt;margin-top:24.5pt;width:252.75pt;height:152.5pt;z-index:251661312;visibility:visible;mso-wrap-style:square;mso-width-percent:0;mso-height-percent:0;mso-wrap-distance-left:9pt;mso-wrap-distance-top:0;mso-wrap-distance-right:9pt;mso-wrap-distance-bottom:0;mso-position-horizontal:absolute;mso-position-horizontal-relative:text;mso-position-vertical:absolute;mso-position-vertical-relative:text;mso-width-percent:0;mso-height-percent:0;mso-width-relative:margin;mso-height-relative:margin;v-text-anchor:middle" o:gfxdata="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" fillcolor="window" strokecolor="windowText" strokeweight="1pt">
                 <v:path arrowok="t"/>
                 <v:textbox>
                   <w:txbxContent>
@@ -2430,7 +2302,6 @@
         <w:tc>
           <w:tcPr>
             <w:tcW w:w="3095" w:type="dxa"/>
-            <w:shd w:val="clear" w:color="auto" w:fill="auto"/>
           </w:tcPr>
           <w:p>
             <w:pPr>
@@ -2458,7 +2329,6 @@
         <w:tc>
           <w:tcPr>
             <w:tcW w:w="2825" w:type="dxa"/>
-            <w:shd w:val="clear" w:color="auto" w:fill="auto"/>
           </w:tcPr>
           <w:p>
             <w:pPr>
@@ -2486,7 +2356,6 @@
         <w:tc>
           <w:tcPr>
             <w:tcW w:w="3367" w:type="dxa"/>
-            <w:shd w:val="clear" w:color="auto" w:fill="auto"/>
           </w:tcPr>
           <w:p>
             <w:pPr>
@@ -2520,7 +2389,6 @@
         <w:tc>
           <w:tcPr>
             <w:tcW w:w="3095" w:type="dxa"/>
-            <w:shd w:val="clear" w:color="auto" w:fill="auto"/>
           </w:tcPr>
           <w:p>
             <w:pPr>
@@ -2542,7 +2410,6 @@
         <w:tc>
           <w:tcPr>
             <w:tcW w:w="2825" w:type="dxa"/>
-            <w:shd w:val="clear" w:color="auto" w:fill="auto"/>
           </w:tcPr>
           <w:p>
             <w:pPr>
@@ -2568,7 +2435,6 @@
         <w:tc>
           <w:tcPr>
             <w:tcW w:w="3367" w:type="dxa"/>
-            <w:shd w:val="clear" w:color="auto" w:fill="auto"/>
             <w:vAlign w:val="center"/>
           </w:tcPr>
           <w:p>
@@ -2601,7 +2467,6 @@
         <w:tc>
           <w:tcPr>
             <w:tcW w:w="3095" w:type="dxa"/>
-            <w:shd w:val="clear" w:color="auto" w:fill="auto"/>
           </w:tcPr>
           <w:p>
             <w:pPr>
@@ -2634,7 +2499,6 @@
         <w:tc>
           <w:tcPr>
             <w:tcW w:w="2825" w:type="dxa"/>
-            <w:shd w:val="clear" w:color="auto" w:fill="auto"/>
             <w:vAlign w:val="center"/>
           </w:tcPr>
           <w:p>
@@ -2681,7 +2545,6 @@
         <w:tc>
           <w:tcPr>
             <w:tcW w:w="3367" w:type="dxa"/>
-            <w:shd w:val="clear" w:color="auto" w:fill="auto"/>
             <w:vAlign w:val="center"/>
           </w:tcPr>
           <w:p>
@@ -2714,7 +2577,6 @@
         <w:tc>
           <w:tcPr>
             <w:tcW w:w="3095" w:type="dxa"/>
-            <w:shd w:val="clear" w:color="auto" w:fill="auto"/>
           </w:tcPr>
           <w:p>
             <w:pPr>
@@ -2740,7 +2602,6 @@
         <w:tc>
           <w:tcPr>
             <w:tcW w:w="2825" w:type="dxa"/>
-            <w:shd w:val="clear" w:color="auto" w:fill="auto"/>
             <w:vAlign w:val="center"/>
           </w:tcPr>
           <w:p>
@@ -2766,7 +2627,6 @@
         <w:tc>
           <w:tcPr>
             <w:tcW w:w="3367" w:type="dxa"/>
-            <w:shd w:val="clear" w:color="auto" w:fill="auto"/>
             <w:vAlign w:val="center"/>
           </w:tcPr>
           <w:p>
@@ -2799,7 +2659,6 @@
         <w:tc>
           <w:tcPr>
             <w:tcW w:w="3095" w:type="dxa"/>
-            <w:shd w:val="clear" w:color="auto" w:fill="auto"/>
           </w:tcPr>
           <w:p>
             <w:pPr>
@@ -2827,7 +2686,6 @@
         <w:tc>
           <w:tcPr>
             <w:tcW w:w="2825" w:type="dxa"/>
-            <w:shd w:val="clear" w:color="auto" w:fill="auto"/>
           </w:tcPr>
           <w:p>
             <w:pPr>
@@ -2861,7 +2719,6 @@
         <w:tc>
           <w:tcPr>
             <w:tcW w:w="3367" w:type="dxa"/>
-            <w:shd w:val="clear" w:color="auto" w:fill="auto"/>
             <w:vAlign w:val="center"/>
           </w:tcPr>
           <w:p>
@@ -2894,7 +2751,6 @@
         <w:tc>
           <w:tcPr>
             <w:tcW w:w="3095" w:type="dxa"/>
-            <w:shd w:val="clear" w:color="auto" w:fill="auto"/>
           </w:tcPr>
           <w:p>
             <w:pPr>
@@ -2927,7 +2783,6 @@
         <w:tc>
           <w:tcPr>
             <w:tcW w:w="2825" w:type="dxa"/>
-            <w:shd w:val="clear" w:color="auto" w:fill="auto"/>
           </w:tcPr>
           <w:p>
             <w:pPr>
@@ -2953,7 +2808,6 @@
         <w:tc>
           <w:tcPr>
             <w:tcW w:w="3367" w:type="dxa"/>
-            <w:shd w:val="clear" w:color="auto" w:fill="auto"/>
             <w:vAlign w:val="center"/>
           </w:tcPr>
           <w:p>
@@ -2987,7 +2841,6 @@
           <w:tcPr>
             <w:tcW w:w="5920" w:type="dxa"/>
             <w:gridSpan w:val="2"/>
-            <w:shd w:val="clear" w:color="auto" w:fill="auto"/>
           </w:tcPr>
           <w:p>
             <w:pPr>
@@ -3015,7 +2868,6 @@
         <w:tc>
           <w:tcPr>
             <w:tcW w:w="3367" w:type="dxa"/>
-            <w:shd w:val="clear" w:color="auto" w:fill="auto"/>
             <w:vAlign w:val="center"/>
           </w:tcPr>
           <w:p>
@@ -3188,9 +3040,8 @@
     <w:p>
       <w:pPr>
         <w:sectPr>
-          <w:headerReference w:type="default" r:id="rId17"/>
-          <w:footerReference w:type="default" r:id="rId10"/>
-          &gt;
+          <w:headerReference w:type="default" r:id="rId8"/>
+          <w:footerReference w:type="default" r:id="rId9"/>
           <w:pgSz w:w="11909" w:h="16834" w:code="9"/>
           <w:pgMar w:top="851" w:right="851" w:bottom="851" w:left="1134" w:header="720" w:footer="720" w:gutter="0"/>
           <w:cols w:space="708"/>
@@ -3257,7 +3108,6 @@
           <w:tcPr>
             <w:tcW w:w="3397" w:type="dxa"/>
             <w:vMerge w:val="restart"/>
-            <w:shd w:val="clear" w:color="auto" w:fill="auto"/>
             <w:vAlign w:val="center"/>
           </w:tcPr>
           <w:p>
@@ -3281,7 +3131,6 @@
           <w:tcPr>
             <w:tcW w:w="1379" w:type="dxa"/>
             <w:vMerge w:val="restart"/>
-            <w:shd w:val="clear" w:color="auto" w:fill="auto"/>
             <w:vAlign w:val="center"/>
           </w:tcPr>
           <w:p>
@@ -3305,7 +3154,6 @@
           <w:tcPr>
             <w:tcW w:w="5168" w:type="dxa"/>
             <w:gridSpan w:val="3"/>
-            <w:shd w:val="clear" w:color="auto" w:fill="auto"/>
             <w:vAlign w:val="center"/>
           </w:tcPr>
           <w:p>
@@ -3334,7 +3182,6 @@
           <w:tcPr>
             <w:tcW w:w="3397" w:type="dxa"/>
             <w:vMerge/>
-            <w:shd w:val="clear" w:color="auto" w:fill="auto"/>
             <w:vAlign w:val="center"/>
           </w:tcPr>
           <w:p>
@@ -3351,7 +3198,6 @@
           <w:tcPr>
             <w:tcW w:w="1379" w:type="dxa"/>
             <w:vMerge/>
-            <w:shd w:val="clear" w:color="auto" w:fill="auto"/>
             <w:vAlign w:val="center"/>
           </w:tcPr>
           <w:p>
@@ -3367,7 +3213,6 @@
         <w:tc>
           <w:tcPr>
             <w:tcW w:w="1701" w:type="dxa"/>
-            <w:shd w:val="clear" w:color="auto" w:fill="auto"/>
             <w:vAlign w:val="center"/>
           </w:tcPr>
           <w:p>
@@ -3390,7 +3235,6 @@
         <w:tc>
           <w:tcPr>
             <w:tcW w:w="1561" w:type="dxa"/>
-            <w:shd w:val="clear" w:color="auto" w:fill="auto"/>
             <w:vAlign w:val="center"/>
           </w:tcPr>
           <w:p>
@@ -3422,7 +3266,6 @@
         <w:tc>
           <w:tcPr>
             <w:tcW w:w="1906" w:type="dxa"/>
-            <w:shd w:val="clear" w:color="auto" w:fill="auto"/>
             <w:vAlign w:val="center"/>
           </w:tcPr>
           <w:p>
@@ -3450,7 +3293,6 @@
         <w:tc>
           <w:tcPr>
             <w:tcW w:w="3397" w:type="dxa"/>
-            <w:shd w:val="clear" w:color="auto" w:fill="auto"/>
             <w:vAlign w:val="center"/>
           </w:tcPr>
           <w:p>
@@ -3473,7 +3315,6 @@
         <w:tc>
           <w:tcPr>
             <w:tcW w:w="1379" w:type="dxa"/>
-            <w:shd w:val="clear" w:color="auto" w:fill="auto"/>
             <w:vAlign w:val="center"/>
           </w:tcPr>
           <w:p>
@@ -3496,7 +3337,6 @@
         <w:tc>
           <w:tcPr>
             <w:tcW w:w="1701" w:type="dxa"/>
-            <w:shd w:val="clear" w:color="auto" w:fill="auto"/>
             <w:vAlign w:val="center"/>
           </w:tcPr>
           <w:p>
@@ -3538,7 +3378,6 @@
         <w:tc>
           <w:tcPr>
             <w:tcW w:w="1561" w:type="dxa"/>
-            <w:shd w:val="clear" w:color="auto" w:fill="auto"/>
             <w:vAlign w:val="center"/>
           </w:tcPr>
           <w:p>
@@ -3580,7 +3419,6 @@
         <w:tc>
           <w:tcPr>
             <w:tcW w:w="1906" w:type="dxa"/>
-            <w:shd w:val="clear" w:color="auto" w:fill="auto"/>
             <w:vAlign w:val="center"/>
           </w:tcPr>
           <w:p>
@@ -3627,7 +3465,6 @@
         <w:tc>
           <w:tcPr>
             <w:tcW w:w="3397" w:type="dxa"/>
-            <w:shd w:val="clear" w:color="auto" w:fill="auto"/>
             <w:vAlign w:val="center"/>
           </w:tcPr>
           <w:p>
@@ -3657,7 +3494,6 @@
         <w:tc>
           <w:tcPr>
             <w:tcW w:w="1379" w:type="dxa"/>
-            <w:shd w:val="clear" w:color="auto" w:fill="auto"/>
             <w:vAlign w:val="center"/>
           </w:tcPr>
           <w:p>
@@ -3680,7 +3516,6 @@
         <w:tc>
           <w:tcPr>
             <w:tcW w:w="1701" w:type="dxa"/>
-            <w:shd w:val="clear" w:color="auto" w:fill="auto"/>
             <w:vAlign w:val="center"/>
           </w:tcPr>
           <w:p>
@@ -3718,7 +3553,6 @@
         <w:tc>
           <w:tcPr>
             <w:tcW w:w="1561" w:type="dxa"/>
-            <w:shd w:val="clear" w:color="auto" w:fill="auto"/>
             <w:vAlign w:val="center"/>
           </w:tcPr>
           <w:p>
@@ -3756,7 +3590,6 @@
         <w:tc>
           <w:tcPr>
             <w:tcW w:w="1906" w:type="dxa"/>
-            <w:shd w:val="clear" w:color="auto" w:fill="auto"/>
             <w:vAlign w:val="center"/>
           </w:tcPr>
           <w:p>
@@ -3799,7 +3632,6 @@
         <w:tc>
           <w:tcPr>
             <w:tcW w:w="3397" w:type="dxa"/>
-            <w:shd w:val="clear" w:color="auto" w:fill="auto"/>
             <w:vAlign w:val="center"/>
           </w:tcPr>
           <w:p>
@@ -3822,7 +3654,6 @@
         <w:tc>
           <w:tcPr>
             <w:tcW w:w="1379" w:type="dxa"/>
-            <w:shd w:val="clear" w:color="auto" w:fill="auto"/>
             <w:vAlign w:val="center"/>
           </w:tcPr>
           <w:p>
@@ -3845,7 +3676,6 @@
         <w:tc>
           <w:tcPr>
             <w:tcW w:w="1701" w:type="dxa"/>
-            <w:shd w:val="clear" w:color="auto" w:fill="auto"/>
             <w:vAlign w:val="center"/>
           </w:tcPr>
           <w:p>
@@ -3883,7 +3713,6 @@
         <w:tc>
           <w:tcPr>
             <w:tcW w:w="1561" w:type="dxa"/>
-            <w:shd w:val="clear" w:color="auto" w:fill="auto"/>
             <w:vAlign w:val="center"/>
           </w:tcPr>
           <w:p>
@@ -3921,7 +3750,6 @@
         <w:tc>
           <w:tcPr>
             <w:tcW w:w="1906" w:type="dxa"/>
-            <w:shd w:val="clear" w:color="auto" w:fill="auto"/>
             <w:vAlign w:val="center"/>
           </w:tcPr>
           <w:p>
@@ -3964,7 +3792,6 @@
         <w:tc>
           <w:tcPr>
             <w:tcW w:w="3397" w:type="dxa"/>
-            <w:shd w:val="clear" w:color="auto" w:fill="auto"/>
             <w:vAlign w:val="center"/>
           </w:tcPr>
           <w:p>
@@ -3987,7 +3814,6 @@
         <w:tc>
           <w:tcPr>
             <w:tcW w:w="1379" w:type="dxa"/>
-            <w:shd w:val="clear" w:color="auto" w:fill="auto"/>
             <w:vAlign w:val="center"/>
           </w:tcPr>
           <w:p>
@@ -4010,7 +3836,6 @@
         <w:tc>
           <w:tcPr>
             <w:tcW w:w="1701" w:type="dxa"/>
-            <w:shd w:val="clear" w:color="auto" w:fill="auto"/>
             <w:vAlign w:val="center"/>
           </w:tcPr>
           <w:p>
@@ -4048,7 +3873,6 @@
         <w:tc>
           <w:tcPr>
             <w:tcW w:w="1561" w:type="dxa"/>
-            <w:shd w:val="clear" w:color="auto" w:fill="auto"/>
             <w:vAlign w:val="center"/>
           </w:tcPr>
           <w:p>
@@ -4086,7 +3910,6 @@
         <w:tc>
           <w:tcPr>
             <w:tcW w:w="1906" w:type="dxa"/>
-            <w:shd w:val="clear" w:color="auto" w:fill="auto"/>
             <w:vAlign w:val="center"/>
           </w:tcPr>
           <w:p>
@@ -4129,7 +3952,6 @@
         <w:tc>
           <w:tcPr>
             <w:tcW w:w="3397" w:type="dxa"/>
-            <w:shd w:val="clear" w:color="auto" w:fill="auto"/>
             <w:vAlign w:val="center"/>
           </w:tcPr>
           <w:p>
@@ -4152,7 +3974,6 @@
         <w:tc>
           <w:tcPr>
             <w:tcW w:w="1379" w:type="dxa"/>
-            <w:shd w:val="clear" w:color="auto" w:fill="auto"/>
             <w:vAlign w:val="center"/>
           </w:tcPr>
           <w:p>
@@ -4175,7 +3996,6 @@
         <w:tc>
           <w:tcPr>
             <w:tcW w:w="1701" w:type="dxa"/>
-            <w:shd w:val="clear" w:color="auto" w:fill="auto"/>
             <w:vAlign w:val="center"/>
           </w:tcPr>
           <w:p>
@@ -4213,7 +4033,6 @@
         <w:tc>
           <w:tcPr>
             <w:tcW w:w="1561" w:type="dxa"/>
-            <w:shd w:val="clear" w:color="auto" w:fill="auto"/>
             <w:vAlign w:val="center"/>
           </w:tcPr>
           <w:p>
@@ -4251,7 +4070,6 @@
         <w:tc>
           <w:tcPr>
             <w:tcW w:w="1906" w:type="dxa"/>
-            <w:shd w:val="clear" w:color="auto" w:fill="auto"/>
             <w:vAlign w:val="center"/>
           </w:tcPr>
           <w:p>
@@ -4294,7 +4112,6 @@
         <w:tc>
           <w:tcPr>
             <w:tcW w:w="3397" w:type="dxa"/>
-            <w:shd w:val="clear" w:color="auto" w:fill="auto"/>
             <w:vAlign w:val="center"/>
           </w:tcPr>
           <w:p>
@@ -4317,7 +4134,6 @@
         <w:tc>
           <w:tcPr>
             <w:tcW w:w="1379" w:type="dxa"/>
-            <w:shd w:val="clear" w:color="auto" w:fill="auto"/>
             <w:vAlign w:val="center"/>
           </w:tcPr>
           <w:p>
@@ -4340,7 +4156,6 @@
         <w:tc>
           <w:tcPr>
             <w:tcW w:w="1701" w:type="dxa"/>
-            <w:shd w:val="clear" w:color="auto" w:fill="auto"/>
             <w:vAlign w:val="center"/>
           </w:tcPr>
           <w:p>
@@ -4378,7 +4193,6 @@
         <w:tc>
           <w:tcPr>
             <w:tcW w:w="1561" w:type="dxa"/>
-            <w:shd w:val="clear" w:color="auto" w:fill="auto"/>
             <w:vAlign w:val="center"/>
           </w:tcPr>
           <w:p>
@@ -4416,7 +4230,6 @@
         <w:tc>
           <w:tcPr>
             <w:tcW w:w="1906" w:type="dxa"/>
-            <w:shd w:val="clear" w:color="auto" w:fill="auto"/>
             <w:vAlign w:val="center"/>
           </w:tcPr>
           <w:p>
@@ -4459,7 +4272,6 @@
         <w:tc>
           <w:tcPr>
             <w:tcW w:w="3397" w:type="dxa"/>
-            <w:shd w:val="clear" w:color="auto" w:fill="auto"/>
             <w:vAlign w:val="center"/>
           </w:tcPr>
           <w:p>
@@ -4482,7 +4294,6 @@
         <w:tc>
           <w:tcPr>
             <w:tcW w:w="1379" w:type="dxa"/>
-            <w:shd w:val="clear" w:color="auto" w:fill="auto"/>
             <w:vAlign w:val="center"/>
           </w:tcPr>
           <w:p>
@@ -4505,7 +4316,6 @@
         <w:tc>
           <w:tcPr>
             <w:tcW w:w="1701" w:type="dxa"/>
-            <w:shd w:val="clear" w:color="auto" w:fill="auto"/>
             <w:vAlign w:val="center"/>
           </w:tcPr>
           <w:p>
@@ -4543,7 +4353,6 @@
         <w:tc>
           <w:tcPr>
             <w:tcW w:w="1561" w:type="dxa"/>
-            <w:shd w:val="clear" w:color="auto" w:fill="auto"/>
             <w:vAlign w:val="center"/>
           </w:tcPr>
           <w:p>
@@ -4581,7 +4390,6 @@
         <w:tc>
           <w:tcPr>
             <w:tcW w:w="1906" w:type="dxa"/>
-            <w:shd w:val="clear" w:color="auto" w:fill="auto"/>
             <w:vAlign w:val="center"/>
           </w:tcPr>
           <w:p>
@@ -4624,7 +4432,6 @@
         <w:tc>
           <w:tcPr>
             <w:tcW w:w="3397" w:type="dxa"/>
-            <w:shd w:val="clear" w:color="auto" w:fill="auto"/>
             <w:vAlign w:val="center"/>
           </w:tcPr>
           <w:p>
@@ -4647,7 +4454,6 @@
         <w:tc>
           <w:tcPr>
             <w:tcW w:w="1379" w:type="dxa"/>
-            <w:shd w:val="clear" w:color="auto" w:fill="auto"/>
             <w:vAlign w:val="center"/>
           </w:tcPr>
           <w:p>
@@ -4670,7 +4476,6 @@
         <w:tc>
           <w:tcPr>
             <w:tcW w:w="1701" w:type="dxa"/>
-            <w:shd w:val="clear" w:color="auto" w:fill="auto"/>
             <w:vAlign w:val="center"/>
           </w:tcPr>
           <w:p>
@@ -4708,7 +4513,6 @@
         <w:tc>
           <w:tcPr>
             <w:tcW w:w="1561" w:type="dxa"/>
-            <w:shd w:val="clear" w:color="auto" w:fill="auto"/>
             <w:vAlign w:val="center"/>
           </w:tcPr>
           <w:p>
@@ -4746,7 +4550,6 @@
         <w:tc>
           <w:tcPr>
             <w:tcW w:w="1906" w:type="dxa"/>
-            <w:shd w:val="clear" w:color="auto" w:fill="auto"/>
             <w:vAlign w:val="center"/>
           </w:tcPr>
           <w:p>
@@ -4789,7 +4592,6 @@
         <w:tc>
           <w:tcPr>
             <w:tcW w:w="3397" w:type="dxa"/>
-            <w:shd w:val="clear" w:color="auto" w:fill="auto"/>
             <w:vAlign w:val="center"/>
           </w:tcPr>
           <w:p>
@@ -4812,7 +4614,6 @@
         <w:tc>
           <w:tcPr>
             <w:tcW w:w="1379" w:type="dxa"/>
-            <w:shd w:val="clear" w:color="auto" w:fill="auto"/>
             <w:vAlign w:val="center"/>
           </w:tcPr>
           <w:p>
@@ -4835,7 +4636,6 @@
         <w:tc>
           <w:tcPr>
             <w:tcW w:w="1701" w:type="dxa"/>
-            <w:shd w:val="clear" w:color="auto" w:fill="auto"/>
             <w:vAlign w:val="center"/>
           </w:tcPr>
           <w:p>
@@ -4873,7 +4673,6 @@
         <w:tc>
           <w:tcPr>
             <w:tcW w:w="1561" w:type="dxa"/>
-            <w:shd w:val="clear" w:color="auto" w:fill="auto"/>
             <w:vAlign w:val="center"/>
           </w:tcPr>
           <w:p>
@@ -4911,7 +4710,6 @@
         <w:tc>
           <w:tcPr>
             <w:tcW w:w="1906" w:type="dxa"/>
-            <w:shd w:val="clear" w:color="auto" w:fill="auto"/>
             <w:vAlign w:val="center"/>
           </w:tcPr>
           <w:p>
@@ -4954,7 +4752,6 @@
         <w:tc>
           <w:tcPr>
             <w:tcW w:w="3397" w:type="dxa"/>
-            <w:shd w:val="clear" w:color="auto" w:fill="auto"/>
             <w:vAlign w:val="center"/>
           </w:tcPr>
           <w:p>
@@ -4977,7 +4774,6 @@
         <w:tc>
           <w:tcPr>
             <w:tcW w:w="1379" w:type="dxa"/>
-            <w:shd w:val="clear" w:color="auto" w:fill="auto"/>
             <w:vAlign w:val="center"/>
           </w:tcPr>
           <w:p>
@@ -5000,7 +4796,6 @@
         <w:tc>
           <w:tcPr>
             <w:tcW w:w="1701" w:type="dxa"/>
-            <w:shd w:val="clear" w:color="auto" w:fill="auto"/>
             <w:vAlign w:val="center"/>
           </w:tcPr>
           <w:p>
@@ -5038,7 +4833,6 @@
         <w:tc>
           <w:tcPr>
             <w:tcW w:w="1561" w:type="dxa"/>
-            <w:shd w:val="clear" w:color="auto" w:fill="auto"/>
             <w:vAlign w:val="center"/>
           </w:tcPr>
           <w:p>
@@ -5076,7 +4870,6 @@
         <w:tc>
           <w:tcPr>
             <w:tcW w:w="1906" w:type="dxa"/>
-            <w:shd w:val="clear" w:color="auto" w:fill="auto"/>
             <w:vAlign w:val="center"/>
           </w:tcPr>
           <w:p>
@@ -5119,7 +4912,6 @@
         <w:tc>
           <w:tcPr>
             <w:tcW w:w="3397" w:type="dxa"/>
-            <w:shd w:val="clear" w:color="auto" w:fill="auto"/>
             <w:vAlign w:val="center"/>
           </w:tcPr>
           <w:p>
@@ -5142,7 +4934,6 @@
         <w:tc>
           <w:tcPr>
             <w:tcW w:w="1379" w:type="dxa"/>
-            <w:shd w:val="clear" w:color="auto" w:fill="auto"/>
             <w:vAlign w:val="center"/>
           </w:tcPr>
           <w:p>
@@ -5165,7 +4956,6 @@
         <w:tc>
           <w:tcPr>
             <w:tcW w:w="1701" w:type="dxa"/>
-            <w:shd w:val="clear" w:color="auto" w:fill="auto"/>
             <w:vAlign w:val="center"/>
           </w:tcPr>
           <w:p>
@@ -5203,7 +4993,6 @@
         <w:tc>
           <w:tcPr>
             <w:tcW w:w="1561" w:type="dxa"/>
-            <w:shd w:val="clear" w:color="auto" w:fill="auto"/>
             <w:vAlign w:val="center"/>
           </w:tcPr>
           <w:p>
@@ -5241,7 +5030,6 @@
         <w:tc>
           <w:tcPr>
             <w:tcW w:w="1906" w:type="dxa"/>
-            <w:shd w:val="clear" w:color="auto" w:fill="auto"/>
             <w:vAlign w:val="center"/>
           </w:tcPr>
           <w:p>
@@ -5284,7 +5072,6 @@
         <w:tc>
           <w:tcPr>
             <w:tcW w:w="3397" w:type="dxa"/>
-            <w:shd w:val="clear" w:color="auto" w:fill="auto"/>
             <w:vAlign w:val="center"/>
           </w:tcPr>
           <w:p>
@@ -5307,7 +5094,6 @@
         <w:tc>
           <w:tcPr>
             <w:tcW w:w="1379" w:type="dxa"/>
-            <w:shd w:val="clear" w:color="auto" w:fill="auto"/>
             <w:vAlign w:val="center"/>
           </w:tcPr>
           <w:p>
@@ -5330,7 +5116,6 @@
         <w:tc>
           <w:tcPr>
             <w:tcW w:w="1701" w:type="dxa"/>
-            <w:shd w:val="clear" w:color="auto" w:fill="auto"/>
             <w:vAlign w:val="center"/>
           </w:tcPr>
           <w:p>
@@ -5368,7 +5153,6 @@
         <w:tc>
           <w:tcPr>
             <w:tcW w:w="1561" w:type="dxa"/>
-            <w:shd w:val="clear" w:color="auto" w:fill="auto"/>
             <w:vAlign w:val="center"/>
           </w:tcPr>
           <w:p>
@@ -5406,7 +5190,6 @@
         <w:tc>
           <w:tcPr>
             <w:tcW w:w="1906" w:type="dxa"/>
-            <w:shd w:val="clear" w:color="auto" w:fill="auto"/>
             <w:vAlign w:val="center"/>
           </w:tcPr>
           <w:p>
@@ -5449,7 +5232,6 @@
         <w:tc>
           <w:tcPr>
             <w:tcW w:w="3397" w:type="dxa"/>
-            <w:shd w:val="clear" w:color="auto" w:fill="auto"/>
             <w:vAlign w:val="center"/>
           </w:tcPr>
           <w:p>
@@ -5472,7 +5254,6 @@
         <w:tc>
           <w:tcPr>
             <w:tcW w:w="1379" w:type="dxa"/>
-            <w:shd w:val="clear" w:color="auto" w:fill="auto"/>
             <w:vAlign w:val="center"/>
           </w:tcPr>
           <w:p>
@@ -5495,7 +5276,6 @@
         <w:tc>
           <w:tcPr>
             <w:tcW w:w="1701" w:type="dxa"/>
-            <w:shd w:val="clear" w:color="auto" w:fill="auto"/>
             <w:vAlign w:val="center"/>
           </w:tcPr>
           <w:p>
@@ -5533,7 +5313,6 @@
         <w:tc>
           <w:tcPr>
             <w:tcW w:w="1561" w:type="dxa"/>
-            <w:shd w:val="clear" w:color="auto" w:fill="auto"/>
             <w:vAlign w:val="center"/>
           </w:tcPr>
           <w:p>
@@ -5571,7 +5350,6 @@
         <w:tc>
           <w:tcPr>
             <w:tcW w:w="1906" w:type="dxa"/>
-            <w:shd w:val="clear" w:color="auto" w:fill="auto"/>
             <w:vAlign w:val="center"/>
           </w:tcPr>
           <w:p>
@@ -5614,7 +5392,6 @@
         <w:tc>
           <w:tcPr>
             <w:tcW w:w="3397" w:type="dxa"/>
-            <w:shd w:val="clear" w:color="auto" w:fill="auto"/>
             <w:vAlign w:val="center"/>
           </w:tcPr>
           <w:p>
@@ -5637,7 +5414,6 @@
         <w:tc>
           <w:tcPr>
             <w:tcW w:w="1379" w:type="dxa"/>
-            <w:shd w:val="clear" w:color="auto" w:fill="auto"/>
             <w:vAlign w:val="center"/>
           </w:tcPr>
           <w:p>
@@ -5660,7 +5436,6 @@
         <w:tc>
           <w:tcPr>
             <w:tcW w:w="1701" w:type="dxa"/>
-            <w:shd w:val="clear" w:color="auto" w:fill="auto"/>
             <w:vAlign w:val="center"/>
           </w:tcPr>
           <w:p>
@@ -5698,7 +5473,6 @@
         <w:tc>
           <w:tcPr>
             <w:tcW w:w="1561" w:type="dxa"/>
-            <w:shd w:val="clear" w:color="auto" w:fill="auto"/>
             <w:vAlign w:val="center"/>
           </w:tcPr>
           <w:p>
@@ -5736,7 +5510,6 @@
         <w:tc>
           <w:tcPr>
             <w:tcW w:w="1906" w:type="dxa"/>
-            <w:shd w:val="clear" w:color="auto" w:fill="auto"/>
             <w:vAlign w:val="center"/>
           </w:tcPr>
           <w:p>
@@ -5779,7 +5552,6 @@
         <w:tc>
           <w:tcPr>
             <w:tcW w:w="3397" w:type="dxa"/>
-            <w:shd w:val="clear" w:color="auto" w:fill="auto"/>
             <w:vAlign w:val="center"/>
           </w:tcPr>
           <w:p>
@@ -5802,7 +5574,6 @@
         <w:tc>
           <w:tcPr>
             <w:tcW w:w="1379" w:type="dxa"/>
-            <w:shd w:val="clear" w:color="auto" w:fill="auto"/>
             <w:vAlign w:val="center"/>
           </w:tcPr>
           <w:p>
@@ -5825,7 +5596,6 @@
         <w:tc>
           <w:tcPr>
             <w:tcW w:w="1701" w:type="dxa"/>
-            <w:shd w:val="clear" w:color="auto" w:fill="auto"/>
             <w:vAlign w:val="center"/>
           </w:tcPr>
           <w:p>
@@ -5863,7 +5633,6 @@
         <w:tc>
           <w:tcPr>
             <w:tcW w:w="1561" w:type="dxa"/>
-            <w:shd w:val="clear" w:color="auto" w:fill="auto"/>
             <w:vAlign w:val="center"/>
           </w:tcPr>
           <w:p>
@@ -5901,7 +5670,6 @@
         <w:tc>
           <w:tcPr>
             <w:tcW w:w="1906" w:type="dxa"/>
-            <w:shd w:val="clear" w:color="auto" w:fill="auto"/>
             <w:vAlign w:val="center"/>
           </w:tcPr>
           <w:p>
@@ -5944,7 +5712,6 @@
         <w:tc>
           <w:tcPr>
             <w:tcW w:w="3397" w:type="dxa"/>
-            <w:shd w:val="clear" w:color="auto" w:fill="auto"/>
             <w:vAlign w:val="center"/>
           </w:tcPr>
           <w:p>
@@ -5967,7 +5734,6 @@
         <w:tc>
           <w:tcPr>
             <w:tcW w:w="1379" w:type="dxa"/>
-            <w:shd w:val="clear" w:color="auto" w:fill="auto"/>
             <w:vAlign w:val="center"/>
           </w:tcPr>
           <w:p>
@@ -5990,7 +5756,6 @@
         <w:tc>
           <w:tcPr>
             <w:tcW w:w="1701" w:type="dxa"/>
-            <w:shd w:val="clear" w:color="auto" w:fill="auto"/>
             <w:vAlign w:val="center"/>
           </w:tcPr>
           <w:p>
@@ -6028,7 +5793,6 @@
         <w:tc>
           <w:tcPr>
             <w:tcW w:w="1561" w:type="dxa"/>
-            <w:shd w:val="clear" w:color="auto" w:fill="auto"/>
             <w:vAlign w:val="center"/>
           </w:tcPr>
           <w:p>
@@ -6066,7 +5830,6 @@
         <w:tc>
           <w:tcPr>
             <w:tcW w:w="1906" w:type="dxa"/>
-            <w:shd w:val="clear" w:color="auto" w:fill="auto"/>
             <w:vAlign w:val="center"/>
           </w:tcPr>
           <w:p>
@@ -6109,7 +5872,6 @@
         <w:tc>
           <w:tcPr>
             <w:tcW w:w="3397" w:type="dxa"/>
-            <w:shd w:val="clear" w:color="auto" w:fill="auto"/>
             <w:vAlign w:val="center"/>
           </w:tcPr>
           <w:p>
@@ -6132,7 +5894,6 @@
         <w:tc>
           <w:tcPr>
             <w:tcW w:w="1379" w:type="dxa"/>
-            <w:shd w:val="clear" w:color="auto" w:fill="auto"/>
             <w:vAlign w:val="center"/>
           </w:tcPr>
           <w:p>
@@ -6155,7 +5916,6 @@
         <w:tc>
           <w:tcPr>
             <w:tcW w:w="1701" w:type="dxa"/>
-            <w:shd w:val="clear" w:color="auto" w:fill="auto"/>
             <w:vAlign w:val="center"/>
           </w:tcPr>
           <w:p>
@@ -6193,7 +5953,6 @@
         <w:tc>
           <w:tcPr>
             <w:tcW w:w="1561" w:type="dxa"/>
-            <w:shd w:val="clear" w:color="auto" w:fill="auto"/>
             <w:vAlign w:val="center"/>
           </w:tcPr>
           <w:p>
@@ -6231,7 +5990,6 @@
         <w:tc>
           <w:tcPr>
             <w:tcW w:w="1906" w:type="dxa"/>
-            <w:shd w:val="clear" w:color="auto" w:fill="auto"/>
             <w:vAlign w:val="center"/>
           </w:tcPr>
           <w:p>
@@ -6274,7 +6032,6 @@
         <w:tc>
           <w:tcPr>
             <w:tcW w:w="3397" w:type="dxa"/>
-            <w:shd w:val="clear" w:color="auto" w:fill="auto"/>
             <w:vAlign w:val="center"/>
           </w:tcPr>
           <w:p>
@@ -6297,7 +6054,6 @@
         <w:tc>
           <w:tcPr>
             <w:tcW w:w="1379" w:type="dxa"/>
-            <w:shd w:val="clear" w:color="auto" w:fill="auto"/>
             <w:vAlign w:val="center"/>
           </w:tcPr>
           <w:p>
@@ -6320,7 +6076,6 @@
         <w:tc>
           <w:tcPr>
             <w:tcW w:w="1701" w:type="dxa"/>
-            <w:shd w:val="clear" w:color="auto" w:fill="auto"/>
             <w:vAlign w:val="center"/>
           </w:tcPr>
           <w:p>
@@ -6358,7 +6113,6 @@
         <w:tc>
           <w:tcPr>
             <w:tcW w:w="1561" w:type="dxa"/>
-            <w:shd w:val="clear" w:color="auto" w:fill="auto"/>
             <w:vAlign w:val="center"/>
           </w:tcPr>
           <w:p>
@@ -6396,7 +6150,6 @@
         <w:tc>
           <w:tcPr>
             <w:tcW w:w="1906" w:type="dxa"/>
-            <w:shd w:val="clear" w:color="auto" w:fill="auto"/>
             <w:vAlign w:val="center"/>
           </w:tcPr>
           <w:p>
@@ -6439,7 +6192,6 @@
         <w:tc>
           <w:tcPr>
             <w:tcW w:w="3397" w:type="dxa"/>
-            <w:shd w:val="clear" w:color="auto" w:fill="auto"/>
             <w:vAlign w:val="center"/>
           </w:tcPr>
           <w:p>
@@ -6462,7 +6214,6 @@
         <w:tc>
           <w:tcPr>
             <w:tcW w:w="1379" w:type="dxa"/>
-            <w:shd w:val="clear" w:color="auto" w:fill="auto"/>
             <w:vAlign w:val="center"/>
           </w:tcPr>
           <w:p>
@@ -6485,7 +6236,6 @@
         <w:tc>
           <w:tcPr>
             <w:tcW w:w="1701" w:type="dxa"/>
-            <w:shd w:val="clear" w:color="auto" w:fill="auto"/>
             <w:vAlign w:val="center"/>
           </w:tcPr>
           <w:p>
@@ -6523,7 +6273,6 @@
         <w:tc>
           <w:tcPr>
             <w:tcW w:w="1561" w:type="dxa"/>
-            <w:shd w:val="clear" w:color="auto" w:fill="auto"/>
             <w:vAlign w:val="center"/>
           </w:tcPr>
           <w:p>
@@ -6561,7 +6310,6 @@
         <w:tc>
           <w:tcPr>
             <w:tcW w:w="1906" w:type="dxa"/>
-            <w:shd w:val="clear" w:color="auto" w:fill="auto"/>
             <w:vAlign w:val="center"/>
           </w:tcPr>
           <w:p>
@@ -6604,7 +6352,6 @@
         <w:tc>
           <w:tcPr>
             <w:tcW w:w="3397" w:type="dxa"/>
-            <w:shd w:val="clear" w:color="auto" w:fill="auto"/>
             <w:vAlign w:val="center"/>
           </w:tcPr>
           <w:p>
@@ -6627,7 +6374,6 @@
         <w:tc>
           <w:tcPr>
             <w:tcW w:w="1379" w:type="dxa"/>
-            <w:shd w:val="clear" w:color="auto" w:fill="auto"/>
             <w:vAlign w:val="center"/>
           </w:tcPr>
           <w:p>
@@ -6650,7 +6396,6 @@
         <w:tc>
           <w:tcPr>
             <w:tcW w:w="1701" w:type="dxa"/>
-            <w:shd w:val="clear" w:color="auto" w:fill="auto"/>
             <w:vAlign w:val="center"/>
           </w:tcPr>
           <w:p>
@@ -6688,7 +6433,6 @@
         <w:tc>
           <w:tcPr>
             <w:tcW w:w="1561" w:type="dxa"/>
-            <w:shd w:val="clear" w:color="auto" w:fill="auto"/>
             <w:vAlign w:val="center"/>
           </w:tcPr>
           <w:p>
@@ -6726,7 +6470,6 @@
         <w:tc>
           <w:tcPr>
             <w:tcW w:w="1906" w:type="dxa"/>
-            <w:shd w:val="clear" w:color="auto" w:fill="auto"/>
             <w:vAlign w:val="center"/>
           </w:tcPr>
           <w:p>
@@ -6769,7 +6512,6 @@
         <w:tc>
           <w:tcPr>
             <w:tcW w:w="3397" w:type="dxa"/>
-            <w:shd w:val="clear" w:color="auto" w:fill="auto"/>
             <w:vAlign w:val="center"/>
           </w:tcPr>
           <w:p>
@@ -6792,7 +6534,6 @@
         <w:tc>
           <w:tcPr>
             <w:tcW w:w="1379" w:type="dxa"/>
-            <w:shd w:val="clear" w:color="auto" w:fill="auto"/>
             <w:vAlign w:val="center"/>
           </w:tcPr>
           <w:p>
@@ -6815,7 +6556,6 @@
         <w:tc>
           <w:tcPr>
             <w:tcW w:w="1701" w:type="dxa"/>
-            <w:shd w:val="clear" w:color="auto" w:fill="auto"/>
             <w:vAlign w:val="center"/>
           </w:tcPr>
           <w:p>
@@ -6853,7 +6593,6 @@
         <w:tc>
           <w:tcPr>
             <w:tcW w:w="1561" w:type="dxa"/>
-            <w:shd w:val="clear" w:color="auto" w:fill="auto"/>
             <w:vAlign w:val="center"/>
           </w:tcPr>
           <w:p>
@@ -6891,7 +6630,6 @@
         <w:tc>
           <w:tcPr>
             <w:tcW w:w="1906" w:type="dxa"/>
-            <w:shd w:val="clear" w:color="auto" w:fill="auto"/>
             <w:vAlign w:val="center"/>
           </w:tcPr>
           <w:p>
@@ -6934,7 +6672,6 @@
         <w:tc>
           <w:tcPr>
             <w:tcW w:w="3397" w:type="dxa"/>
-            <w:shd w:val="clear" w:color="auto" w:fill="auto"/>
             <w:vAlign w:val="center"/>
           </w:tcPr>
           <w:p>
@@ -6957,7 +6694,6 @@
         <w:tc>
           <w:tcPr>
             <w:tcW w:w="1379" w:type="dxa"/>
-            <w:shd w:val="clear" w:color="auto" w:fill="auto"/>
             <w:vAlign w:val="center"/>
           </w:tcPr>
           <w:p>
@@ -6980,7 +6716,6 @@
         <w:tc>
           <w:tcPr>
             <w:tcW w:w="1701" w:type="dxa"/>
-            <w:shd w:val="clear" w:color="auto" w:fill="auto"/>
             <w:vAlign w:val="center"/>
           </w:tcPr>
           <w:p>
@@ -7018,7 +6753,6 @@
         <w:tc>
           <w:tcPr>
             <w:tcW w:w="1561" w:type="dxa"/>
-            <w:shd w:val="clear" w:color="auto" w:fill="auto"/>
             <w:vAlign w:val="center"/>
           </w:tcPr>
           <w:p>
@@ -7056,7 +6790,6 @@
         <w:tc>
           <w:tcPr>
             <w:tcW w:w="1906" w:type="dxa"/>
-            <w:shd w:val="clear" w:color="auto" w:fill="auto"/>
             <w:vAlign w:val="center"/>
           </w:tcPr>
           <w:p>
@@ -7099,7 +6832,6 @@
         <w:tc>
           <w:tcPr>
             <w:tcW w:w="3397" w:type="dxa"/>
-            <w:shd w:val="clear" w:color="auto" w:fill="auto"/>
             <w:vAlign w:val="center"/>
           </w:tcPr>
           <w:p>
@@ -7122,7 +6854,6 @@
         <w:tc>
           <w:tcPr>
             <w:tcW w:w="1379" w:type="dxa"/>
-            <w:shd w:val="clear" w:color="auto" w:fill="auto"/>
             <w:vAlign w:val="center"/>
           </w:tcPr>
           <w:p>
@@ -7145,7 +6876,6 @@
         <w:tc>
           <w:tcPr>
             <w:tcW w:w="1701" w:type="dxa"/>
-            <w:shd w:val="clear" w:color="auto" w:fill="auto"/>
             <w:vAlign w:val="center"/>
           </w:tcPr>
           <w:p>
@@ -7183,7 +6913,6 @@
         <w:tc>
           <w:tcPr>
             <w:tcW w:w="1561" w:type="dxa"/>
-            <w:shd w:val="clear" w:color="auto" w:fill="auto"/>
             <w:vAlign w:val="center"/>
           </w:tcPr>
           <w:p>
@@ -7221,7 +6950,6 @@
         <w:tc>
           <w:tcPr>
             <w:tcW w:w="1906" w:type="dxa"/>
-            <w:shd w:val="clear" w:color="auto" w:fill="auto"/>
             <w:vAlign w:val="center"/>
           </w:tcPr>
           <w:p>
@@ -7264,7 +6992,6 @@
         <w:tc>
           <w:tcPr>
             <w:tcW w:w="3397" w:type="dxa"/>
-            <w:shd w:val="clear" w:color="auto" w:fill="auto"/>
             <w:vAlign w:val="center"/>
           </w:tcPr>
           <w:p>
@@ -7287,7 +7014,6 @@
         <w:tc>
           <w:tcPr>
             <w:tcW w:w="1379" w:type="dxa"/>
-            <w:shd w:val="clear" w:color="auto" w:fill="auto"/>
             <w:vAlign w:val="center"/>
           </w:tcPr>
           <w:p>
@@ -7310,7 +7036,6 @@
         <w:tc>
           <w:tcPr>
             <w:tcW w:w="1701" w:type="dxa"/>
-            <w:shd w:val="clear" w:color="auto" w:fill="auto"/>
             <w:vAlign w:val="center"/>
           </w:tcPr>
           <w:p>
@@ -7348,7 +7073,6 @@
         <w:tc>
           <w:tcPr>
             <w:tcW w:w="1561" w:type="dxa"/>
-            <w:shd w:val="clear" w:color="auto" w:fill="auto"/>
             <w:vAlign w:val="center"/>
           </w:tcPr>
           <w:p>
@@ -7386,7 +7110,6 @@
         <w:tc>
           <w:tcPr>
             <w:tcW w:w="1906" w:type="dxa"/>
-            <w:shd w:val="clear" w:color="auto" w:fill="auto"/>
             <w:vAlign w:val="center"/>
           </w:tcPr>
           <w:p>
@@ -7429,7 +7152,6 @@
         <w:tc>
           <w:tcPr>
             <w:tcW w:w="3397" w:type="dxa"/>
-            <w:shd w:val="clear" w:color="auto" w:fill="auto"/>
             <w:vAlign w:val="center"/>
           </w:tcPr>
           <w:p>
@@ -7452,7 +7174,6 @@
         <w:tc>
           <w:tcPr>
             <w:tcW w:w="1379" w:type="dxa"/>
-            <w:shd w:val="clear" w:color="auto" w:fill="auto"/>
             <w:vAlign w:val="center"/>
           </w:tcPr>
           <w:p>
@@ -7475,7 +7196,6 @@
         <w:tc>
           <w:tcPr>
             <w:tcW w:w="1701" w:type="dxa"/>
-            <w:shd w:val="clear" w:color="auto" w:fill="auto"/>
             <w:vAlign w:val="center"/>
           </w:tcPr>
           <w:p>
@@ -7513,7 +7233,6 @@
         <w:tc>
           <w:tcPr>
             <w:tcW w:w="1561" w:type="dxa"/>
-            <w:shd w:val="clear" w:color="auto" w:fill="auto"/>
             <w:vAlign w:val="center"/>
           </w:tcPr>
           <w:p>
@@ -7551,7 +7270,6 @@
         <w:tc>
           <w:tcPr>
             <w:tcW w:w="1906" w:type="dxa"/>
-            <w:shd w:val="clear" w:color="auto" w:fill="auto"/>
             <w:vAlign w:val="center"/>
           </w:tcPr>
           <w:p>
@@ -7594,7 +7312,6 @@
         <w:tc>
           <w:tcPr>
             <w:tcW w:w="3397" w:type="dxa"/>
-            <w:shd w:val="clear" w:color="auto" w:fill="auto"/>
             <w:vAlign w:val="center"/>
           </w:tcPr>
           <w:p>
@@ -7617,7 +7334,6 @@
         <w:tc>
           <w:tcPr>
             <w:tcW w:w="1379" w:type="dxa"/>
-            <w:shd w:val="clear" w:color="auto" w:fill="auto"/>
             <w:vAlign w:val="center"/>
           </w:tcPr>
           <w:p>
@@ -7640,7 +7356,6 @@
         <w:tc>
           <w:tcPr>
             <w:tcW w:w="1701" w:type="dxa"/>
-            <w:shd w:val="clear" w:color="auto" w:fill="auto"/>
             <w:vAlign w:val="center"/>
           </w:tcPr>
           <w:p>
@@ -7678,7 +7393,6 @@
         <w:tc>
           <w:tcPr>
             <w:tcW w:w="1561" w:type="dxa"/>
-            <w:shd w:val="clear" w:color="auto" w:fill="auto"/>
             <w:vAlign w:val="center"/>
           </w:tcPr>
           <w:p>
@@ -7716,7 +7430,6 @@
         <w:tc>
           <w:tcPr>
             <w:tcW w:w="1906" w:type="dxa"/>
-            <w:shd w:val="clear" w:color="auto" w:fill="auto"/>
             <w:vAlign w:val="center"/>
           </w:tcPr>
           <w:p>
@@ -7759,7 +7472,6 @@
         <w:tc>
           <w:tcPr>
             <w:tcW w:w="3397" w:type="dxa"/>
-            <w:shd w:val="clear" w:color="auto" w:fill="auto"/>
             <w:vAlign w:val="center"/>
           </w:tcPr>
           <w:p>
@@ -7782,7 +7494,6 @@
         <w:tc>
           <w:tcPr>
             <w:tcW w:w="1379" w:type="dxa"/>
-            <w:shd w:val="clear" w:color="auto" w:fill="auto"/>
             <w:vAlign w:val="center"/>
           </w:tcPr>
           <w:p>
@@ -7805,7 +7516,6 @@
         <w:tc>
           <w:tcPr>
             <w:tcW w:w="1701" w:type="dxa"/>
-            <w:shd w:val="clear" w:color="auto" w:fill="auto"/>
             <w:vAlign w:val="center"/>
           </w:tcPr>
           <w:p>
@@ -7843,7 +7553,6 @@
         <w:tc>
           <w:tcPr>
             <w:tcW w:w="1561" w:type="dxa"/>
-            <w:shd w:val="clear" w:color="auto" w:fill="auto"/>
             <w:vAlign w:val="center"/>
           </w:tcPr>
           <w:p>
@@ -7881,7 +7590,6 @@
         <w:tc>
           <w:tcPr>
             <w:tcW w:w="1906" w:type="dxa"/>
-            <w:shd w:val="clear" w:color="auto" w:fill="auto"/>
             <w:vAlign w:val="center"/>
           </w:tcPr>
           <w:p>
@@ -7924,7 +7632,6 @@
         <w:tc>
           <w:tcPr>
             <w:tcW w:w="3397" w:type="dxa"/>
-            <w:shd w:val="clear" w:color="auto" w:fill="auto"/>
             <w:vAlign w:val="center"/>
           </w:tcPr>
           <w:p>
@@ -7947,7 +7654,6 @@
         <w:tc>
           <w:tcPr>
             <w:tcW w:w="1379" w:type="dxa"/>
-            <w:shd w:val="clear" w:color="auto" w:fill="auto"/>
             <w:vAlign w:val="center"/>
           </w:tcPr>
           <w:p>
@@ -7970,7 +7676,6 @@
         <w:tc>
           <w:tcPr>
             <w:tcW w:w="1701" w:type="dxa"/>
-            <w:shd w:val="clear" w:color="auto" w:fill="auto"/>
             <w:vAlign w:val="center"/>
           </w:tcPr>
           <w:p>
@@ -8008,7 +7713,6 @@
         <w:tc>
           <w:tcPr>
             <w:tcW w:w="1561" w:type="dxa"/>
-            <w:shd w:val="clear" w:color="auto" w:fill="auto"/>
             <w:vAlign w:val="center"/>
           </w:tcPr>
           <w:p>
@@ -8046,7 +7750,6 @@
         <w:tc>
           <w:tcPr>
             <w:tcW w:w="1906" w:type="dxa"/>
-            <w:shd w:val="clear" w:color="auto" w:fill="auto"/>
             <w:vAlign w:val="center"/>
           </w:tcPr>
           <w:p>
@@ -8090,7 +7793,6 @@
           <w:tcPr>
             <w:tcW w:w="9944" w:type="dxa"/>
             <w:gridSpan w:val="5"/>
-            <w:shd w:val="clear" w:color="auto" w:fill="auto"/>
             <w:vAlign w:val="center"/>
           </w:tcPr>
           <w:p>
@@ -8124,9 +7826,8 @@
       </w:pPr>
     </w:p>
     <w:sectPr>
-      <w:headerReference w:type="default" r:id="rId17"/>
-      <w:footerReference w:type="default" r:id="rId10"/>
-      &gt;
+      <w:headerReference w:type="default" r:id="rId10"/>
+      <w:footerReference w:type="default" r:id="rId11"/>
       <w:pgSz w:w="11906" w:h="16838" w:code="9"/>
       <w:pgMar w:top="1134" w:right="849" w:bottom="1134" w:left="1134" w:header="709" w:footer="709" w:gutter="0"/>
       <w:cols w:space="487"/>
@@ -8137,8 +7838,8 @@
 </w:document>
 </file>
 
-<file path=word\endnotes.xml><?xml version="1.0" encoding="utf-8"?>
-<w:endnotes xmlns:wpc="http://schemas.microsoft.com/office/word/2010/wordprocessingCanvas" xmlns:cx="http://schemas.microsoft.com/office/drawing/2014/chartex" xmlns:cx1="http://schemas.microsoft.com/office/drawing/2015/9/8/chartex" xmlns:cx2="http://schemas.microsoft.com/office/drawing/2015/10/21/chartex" xmlns:cx3="http://schemas.microsoft.com/office/drawing/2016/5/9/chartex" xmlns:cx4="http://schemas.microsoft.com/office/drawing/2016/5/10/chartex" xmlns:cx5="http://schemas.microsoft.com/office/drawing/2016/5/11/chartex" xmlns:cx6="http://schemas.microsoft.com/office/drawing/2016/5/12/chartex" xmlns:cx7="http://schemas.microsoft.com/office/drawing/2016/5/13/chartex" xmlns:cx8="http://schemas.microsoft.com/office/drawing/2016/5/14/chartex" xmlns:mc="http://schemas.openxmlformats.org/markup-compatibility/2006" xmlns:aink="http://schemas.microsoft.com/office/drawing/2016/ink" xmlns:am3d="http://schemas.microsoft.com/office/drawing/2017/model3d" xmlns:o="urn:schemas-microsoft-com:office:office" xmlns:oel="http://schemas.microsoft.com/office/2019/extlst" xmlns:r="http://schemas.openxmlformats.org/officeDocument/2006/relationships" xmlns:m="http://schemas.openxmlformats.org/officeDocument/2006/math" xmlns:v="urn:schemas-microsoft-com:vml" xmlns:wp14="http://schemas.microsoft.com/office/word/2010/wordprocessingDrawing" xmlns:wp="http://schemas.openxmlformats.org/drawingml/2006/wordprocessingDrawing" xmlns:w10="urn:schemas-microsoft-com:office:word" xmlns:w="http://schemas.openxmlformats.org/wordprocessingml/2006/main" xmlns:w14="http://schemas.microsoft.com/office/word/2010/wordml" xmlns:w15="http://schemas.microsoft.com/office/word/2012/wordml" xmlns:w16cex="http://schemas.microsoft.com/office/word/2018/wordml/cex" xmlns:w16cid="http://schemas.microsoft.com/office/word/2016/wordml/cid" xmlns:w16="http://schemas.microsoft.com/office/word/2018/wordml" xmlns:w16sdtdh="http://schemas.microsoft.com/office/word/2020/wordml/sdtdatahash" xmlns:w16se="http://schemas.microsoft.com/office/word/2015/wordml/symex" xmlns:wpg="http://schemas.microsoft.com/office/word/2010/wordprocessingGroup" xmlns:wpi="http://schemas.microsoft.com/office/word/2010/wordprocessingInk" xmlns:wne="http://schemas.microsoft.com/office/word/2006/wordml" xmlns:wps="http://schemas.microsoft.com/office/word/2010/wordprocessingShape" mc:Ignorable="w14 w15 w16se w16cid w16 w16cex w16sdtdh wp14">
+<file path=word/endnotes.xml><?xml version="1.0" encoding="utf-8"?>
+<w:endnotes xmlns:wpc="http://schemas.microsoft.com/office/word/2010/wordprocessingCanvas" xmlns:cx="http://schemas.microsoft.com/office/drawing/2014/chartex" xmlns:cx1="http://schemas.microsoft.com/office/drawing/2015/9/8/chartex" xmlns:cx2="http://schemas.microsoft.com/office/drawing/2015/10/21/chartex" xmlns:cx3="http://schemas.microsoft.com/office/drawing/2016/5/9/chartex" xmlns:cx4="http://schemas.microsoft.com/office/drawing/2016/5/10/chartex" xmlns:cx5="http://schemas.microsoft.com/office/drawing/2016/5/11/chartex" xmlns:cx6="http://schemas.microsoft.com/office/drawing/2016/5/12/chartex" xmlns:cx7="http://schemas.microsoft.com/office/drawing/2016/5/13/chartex" xmlns:cx8="http://schemas.microsoft.com/office/drawing/2016/5/14/chartex" xmlns:mc="http://schemas.openxmlformats.org/markup-compatibility/2006" xmlns:aink="http://schemas.microsoft.com/office/drawing/2016/ink" xmlns:am3d="http://schemas.microsoft.com/office/drawing/2017/model3d" xmlns:o="urn:schemas-microsoft-com:office:office" xmlns:oel="http://schemas.microsoft.com/office/2019/extlst" xmlns:r="http://schemas.openxmlformats.org/officeDocument/2006/relationships" xmlns:m="http://schemas.openxmlformats.org/officeDocument/2006/math" xmlns:v="urn:schemas-microsoft-com:vml" xmlns:wp14="http://schemas.microsoft.com/office/word/2010/wordprocessingDrawing" xmlns:wp="http://schemas.openxmlformats.org/drawingml/2006/wordprocessingDrawing" xmlns:w10="urn:schemas-microsoft-com:office:word" xmlns:w="http://schemas.openxmlformats.org/wordprocessingml/2006/main" xmlns:w14="http://schemas.microsoft.com/office/word/2010/wordml" xmlns:w15="http://schemas.microsoft.com/office/word/2012/wordml" xmlns:w16cex="http://schemas.microsoft.com/office/word/2018/wordml/cex" xmlns:w16cid="http://schemas.microsoft.com/office/word/2016/wordml/cid" xmlns:w16="http://schemas.microsoft.com/office/word/2018/wordml" xmlns:w16du="http://schemas.microsoft.com/office/word/2023/wordml/word16du" xmlns:w16sdtdh="http://schemas.microsoft.com/office/word/2020/wordml/sdtdatahash" xmlns:w16sdtfl="http://schemas.microsoft.com/office/word/2024/wordml/sdtformatlock" xmlns:w16se="http://schemas.microsoft.com/office/word/2015/wordml/symex" xmlns:wpg="http://schemas.microsoft.com/office/word/2010/wordprocessingGroup" xmlns:wpi="http://schemas.microsoft.com/office/word/2010/wordprocessingInk" xmlns:wne="http://schemas.microsoft.com/office/word/2006/wordml" xmlns:wps="http://schemas.microsoft.com/office/word/2010/wordprocessingShape" mc:Ignorable="w14 w15 w16se w16cid w16 w16cex w16sdtdh w16sdtfl w16du wp14">
   <w:endnote w:type="separator" w:id="-1">
     <w:p>
       <w:pPr>
@@ -8164,62 +7865,8 @@
 </w:endnotes>
 </file>
 
-<file path=word\fontTable.xml><?xml version="1.0" encoding="utf-8"?>
-<w:fonts xmlns:mc="http://schemas.openxmlformats.org/markup-compatibility/2006" xmlns:r="http://schemas.openxmlformats.org/officeDocument/2006/relationships" xmlns:w="http://schemas.openxmlformats.org/wordprocessingml/2006/main" xmlns:w14="http://schemas.microsoft.com/office/word/2010/wordml" xmlns:w15="http://schemas.microsoft.com/office/word/2012/wordml" xmlns:w16cex="http://schemas.microsoft.com/office/word/2018/wordml/cex" xmlns:w16cid="http://schemas.microsoft.com/office/word/2016/wordml/cid" xmlns:w16="http://schemas.microsoft.com/office/word/2018/wordml" xmlns:w16sdtdh="http://schemas.microsoft.com/office/word/2020/wordml/sdtdatahash" xmlns:w16se="http://schemas.microsoft.com/office/word/2015/wordml/symex" mc:Ignorable="w14 w15 w16se w16cid w16 w16cex w16sdtdh">
-  <w:font w:name="Times New Roman">
-    <w:panose1 w:val="02020603050405020304"/>
-    <w:charset w:val="00"/>
-    <w:family w:val="roman"/>
-    <w:pitch w:val="variable"/>
-    <w:sig w:usb0="E0002EFF" w:usb1="C000785B" w:usb2="00000009" w:usb3="00000000" w:csb0="000001FF" w:csb1="00000000"/>
-  </w:font>
-  <w:font w:name="Aptos">
-    <w:panose1 w:val="020B0004020202020204"/>
-    <w:charset w:val="00"/>
-    <w:family w:val="swiss"/>
-    <w:pitch w:val="variable"/>
-    <w:sig w:usb0="20000287" w:usb1="00000003" w:usb2="00000000" w:usb3="00000000" w:csb0="0000019F" w:csb1="00000000"/>
-  </w:font>
-  <w:font w:name="Aptos Display">
-    <w:panose1 w:val="020B0004020202020204"/>
-    <w:charset w:val="00"/>
-    <w:family w:val="swiss"/>
-    <w:pitch w:val="variable"/>
-    <w:sig w:usb0="20000287" w:usb1="00000003" w:usb2="00000000" w:usb3="00000000" w:csb0="0000019F" w:csb1="00000000"/>
-  </w:font>
-  <w:font w:name="Arial">
-    <w:panose1 w:val="020B0604020202020204"/>
-    <w:charset w:val="00"/>
-    <w:family w:val="swiss"/>
-    <w:pitch w:val="variable"/>
-    <w:sig w:usb0="E0002EFF" w:usb1="C000785B" w:usb2="00000009" w:usb3="00000000" w:csb0="000001FF" w:csb1="00000000"/>
-  </w:font>
-  <w:font w:name="Symbol">
-    <w:panose1 w:val="05050102010706020507"/>
-    <w:charset w:val="02"/>
-    <w:family w:val="decorative"/>
-    <w:pitch w:val="variable"/>
-    <w:sig w:usb0="00000000" w:usb1="10000000" w:usb2="00000000" w:usb3="00000000" w:csb0="80000000" w:csb1="00000000"/>
-  </w:font>
-  <w:font w:name="Cambria">
-    <w:panose1 w:val="02040503050406030204"/>
-    <w:charset w:val="00"/>
-    <w:family w:val="roman"/>
-    <w:pitch w:val="variable"/>
-    <w:sig w:usb0="E00006FF" w:usb1="420024FF" w:usb2="02000000" w:usb3="00000000" w:csb0="0000019F" w:csb1="00000000"/>
-  </w:font>
-  <w:font w:name="Calibri">
-    <w:panose1 w:val="020F0502020204030204"/>
-    <w:charset w:val="00"/>
-    <w:family w:val="swiss"/>
-    <w:pitch w:val="variable"/>
-    <w:sig w:usb0="E4002EFF" w:usb1="C200247B" w:usb2="00000009" w:usb3="00000000" w:csb0="000001FF" w:csb1="00000000"/>
-  </w:font>
-</w:fonts>
-</file>
-
-<file path=word\footer1.xml><?xml version="1.0" encoding="utf-8"?>
-<w:ftr xmlns:wpc="http://schemas.microsoft.com/office/word/2010/wordprocessingCanvas" xmlns:cx="http://schemas.microsoft.com/office/drawing/2014/chartex" xmlns:cx1="http://schemas.microsoft.com/office/drawing/2015/9/8/chartex" xmlns:cx2="http://schemas.microsoft.com/office/drawing/2015/10/21/chartex" xmlns:cx3="http://schemas.microsoft.com/office/drawing/2016/5/9/chartex" xmlns:cx4="http://schemas.microsoft.com/office/drawing/2016/5/10/chartex" xmlns:cx5="http://schemas.microsoft.com/office/drawing/2016/5/11/chartex" xmlns:cx6="http://schemas.microsoft.com/office/drawing/2016/5/12/chartex" xmlns:cx7="http://schemas.microsoft.com/office/drawing/2016/5/13/chartex" xmlns:cx8="http://schemas.microsoft.com/office/drawing/2016/5/14/chartex" xmlns:mc="http://schemas.openxmlformats.org/markup-compatibility/2006" xmlns:aink="http://schemas.microsoft.com/office/drawing/2016/ink" xmlns:am3d="http://schemas.microsoft.com/office/drawing/2017/model3d" xmlns:o="urn:schemas-microsoft-com:office:office" xmlns:oel="http://schemas.microsoft.com/office/2019/extlst" xmlns:r="http://schemas.openxmlformats.org/officeDocument/2006/relationships" xmlns:m="http://schemas.openxmlformats.org/officeDocument/2006/math" xmlns:v="urn:schemas-microsoft-com:vml" xmlns:wp14="http://schemas.microsoft.com/office/word/2010/wordprocessingDrawing" xmlns:wp="http://schemas.openxmlformats.org/drawingml/2006/wordprocessingDrawing" xmlns:w10="urn:schemas-microsoft-com:office:word" xmlns:w="http://schemas.openxmlformats.org/wordprocessingml/2006/main" xmlns:w14="http://schemas.microsoft.com/office/word/2010/wordml" xmlns:w15="http://schemas.microsoft.com/office/word/2012/wordml" xmlns:w16cex="http://schemas.microsoft.com/office/word/2018/wordml/cex" xmlns:w16cid="http://schemas.microsoft.com/office/word/2016/wordml/cid" xmlns:w16="http://schemas.microsoft.com/office/word/2018/wordml" xmlns:w16sdtdh="http://schemas.microsoft.com/office/word/2020/wordml/sdtdatahash" xmlns:w16se="http://schemas.microsoft.com/office/word/2015/wordml/symex" xmlns:wpg="http://schemas.microsoft.com/office/word/2010/wordprocessingGroup" xmlns:wpi="http://schemas.microsoft.com/office/word/2010/wordprocessingInk" xmlns:wne="http://schemas.microsoft.com/office/word/2006/wordml" xmlns:wps="http://schemas.microsoft.com/office/word/2010/wordprocessingShape" mc:Ignorable="w14 w15 w16se w16cid w16 w16cex w16sdtdh wp14">
+<file path=word/footer1.xml><?xml version="1.0" encoding="utf-8"?>
+<w:ftr xmlns:wpc="http://schemas.microsoft.com/office/word/2010/wordprocessingCanvas" xmlns:cx="http://schemas.microsoft.com/office/drawing/2014/chartex" xmlns:cx1="http://schemas.microsoft.com/office/drawing/2015/9/8/chartex" xmlns:cx2="http://schemas.microsoft.com/office/drawing/2015/10/21/chartex" xmlns:cx3="http://schemas.microsoft.com/office/drawing/2016/5/9/chartex" xmlns:cx4="http://schemas.microsoft.com/office/drawing/2016/5/10/chartex" xmlns:cx5="http://schemas.microsoft.com/office/drawing/2016/5/11/chartex" xmlns:cx6="http://schemas.microsoft.com/office/drawing/2016/5/12/chartex" xmlns:cx7="http://schemas.microsoft.com/office/drawing/2016/5/13/chartex" xmlns:cx8="http://schemas.microsoft.com/office/drawing/2016/5/14/chartex" xmlns:mc="http://schemas.openxmlformats.org/markup-compatibility/2006" xmlns:aink="http://schemas.microsoft.com/office/drawing/2016/ink" xmlns:am3d="http://schemas.microsoft.com/office/drawing/2017/model3d" xmlns:o="urn:schemas-microsoft-com:office:office" xmlns:oel="http://schemas.microsoft.com/office/2019/extlst" xmlns:r="http://schemas.openxmlformats.org/officeDocument/2006/relationships" xmlns:m="http://schemas.openxmlformats.org/officeDocument/2006/math" xmlns:v="urn:schemas-microsoft-com:vml" xmlns:wp14="http://schemas.microsoft.com/office/word/2010/wordprocessingDrawing" xmlns:wp="http://schemas.openxmlformats.org/drawingml/2006/wordprocessingDrawing" xmlns:w10="urn:schemas-microsoft-com:office:word" xmlns:w="http://schemas.openxmlformats.org/wordprocessingml/2006/main" xmlns:w14="http://schemas.microsoft.com/office/word/2010/wordml" xmlns:w15="http://schemas.microsoft.com/office/word/2012/wordml" xmlns:w16cex="http://schemas.microsoft.com/office/word/2018/wordml/cex" xmlns:w16cid="http://schemas.microsoft.com/office/word/2016/wordml/cid" xmlns:w16="http://schemas.microsoft.com/office/word/2018/wordml" xmlns:w16du="http://schemas.microsoft.com/office/word/2023/wordml/word16du" xmlns:w16sdtdh="http://schemas.microsoft.com/office/word/2020/wordml/sdtdatahash" xmlns:w16sdtfl="http://schemas.microsoft.com/office/word/2024/wordml/sdtformatlock" xmlns:w16se="http://schemas.microsoft.com/office/word/2015/wordml/symex" xmlns:wpg="http://schemas.microsoft.com/office/word/2010/wordprocessingGroup" xmlns:wpi="http://schemas.microsoft.com/office/word/2010/wordprocessingInk" xmlns:wne="http://schemas.microsoft.com/office/word/2006/wordml" xmlns:wps="http://schemas.microsoft.com/office/word/2010/wordprocessingShape" mc:Ignorable="w14 w15 w16se w16cid w16 w16cex w16sdtdh w16sdtfl w16du wp14">
   <w:p>
     <w:pPr>
       <w:pStyle w:val="Footer"/>
@@ -8256,23 +7903,8 @@
 </w:ftr>
 </file>
 
-<file path=word\footer2.xml><?xml version="1.0" encoding="utf-8"?>
-<w:ftr xmlns:wpc="http://schemas.microsoft.com/office/word/2010/wordprocessingCanvas" xmlns:cx="http://schemas.microsoft.com/office/drawing/2014/chartex" xmlns:cx1="http://schemas.microsoft.com/office/drawing/2015/9/8/chartex" xmlns:cx2="http://schemas.microsoft.com/office/drawing/2015/10/21/chartex" xmlns:cx3="http://schemas.microsoft.com/office/drawing/2016/5/9/chartex" xmlns:cx4="http://schemas.microsoft.com/office/drawing/2016/5/10/chartex" xmlns:cx5="http://schemas.microsoft.com/office/drawing/2016/5/11/chartex" xmlns:cx6="http://schemas.microsoft.com/office/drawing/2016/5/12/chartex" xmlns:cx7="http://schemas.microsoft.com/office/drawing/2016/5/13/chartex" xmlns:cx8="http://schemas.microsoft.com/office/drawing/2016/5/14/chartex" xmlns:mc="http://schemas.openxmlformats.org/markup-compatibility/2006" xmlns:aink="http://schemas.microsoft.com/office/drawing/2016/ink" xmlns:am3d="http://schemas.microsoft.com/office/drawing/2017/model3d" xmlns:o="urn:schemas-microsoft-com:office:office" xmlns:oel="http://schemas.microsoft.com/office/2019/extlst" xmlns:r="http://schemas.openxmlformats.org/officeDocument/2006/relationships" xmlns:m="http://schemas.openxmlformats.org/officeDocument/2006/math" xmlns:v="urn:schemas-microsoft-com:vml" xmlns:wp14="http://schemas.microsoft.com/office/word/2010/wordprocessingDrawing" xmlns:wp="http://schemas.openxmlformats.org/drawingml/2006/wordprocessingDrawing" xmlns:w10="urn:schemas-microsoft-com:office:word" xmlns:w="http://schemas.openxmlformats.org/wordprocessingml/2006/main" xmlns:w14="http://schemas.microsoft.com/office/word/2010/wordml" xmlns:w15="http://schemas.microsoft.com/office/word/2012/wordml" xmlns:w16cex="http://schemas.microsoft.com/office/word/2018/wordml/cex" xmlns:w16cid="http://schemas.microsoft.com/office/word/2016/wordml/cid" xmlns:w16="http://schemas.microsoft.com/office/word/2018/wordml" xmlns:w16sdtdh="http://schemas.microsoft.com/office/word/2020/wordml/sdtdatahash" xmlns:w16se="http://schemas.microsoft.com/office/word/2015/wordml/symex" xmlns:wpg="http://schemas.microsoft.com/office/word/2010/wordprocessingGroup" xmlns:wpi="http://schemas.microsoft.com/office/word/2010/wordprocessingInk" xmlns:wne="http://schemas.microsoft.com/office/word/2006/wordml" xmlns:wps="http://schemas.microsoft.com/office/word/2010/wordprocessingShape" mc:Ignorable="w14 w15 w16se w16cid w16 w16cex w16sdtdh wp14">
-  <w:p>
-    <w:pPr>
-      <w:pStyle w:val="Footer"/>
-      <w:tabs>
-        <w:tab w:val="clear" w:pos="9360"/>
-        <w:tab w:val="left" w:pos="142"/>
-        <w:tab w:val="right" w:pos="9781"/>
-      </w:tabs>
-    </w:pPr>
-  </w:p>
-</w:ftr>
-</file>
-
-<file path=word\footer3.xml><?xml version="1.0" encoding="utf-8"?>
-<w:ftr xmlns:wpc="http://schemas.microsoft.com/office/word/2010/wordprocessingCanvas" xmlns:cx="http://schemas.microsoft.com/office/drawing/2014/chartex" xmlns:cx1="http://schemas.microsoft.com/office/drawing/2015/9/8/chartex" xmlns:cx2="http://schemas.microsoft.com/office/drawing/2015/10/21/chartex" xmlns:cx3="http://schemas.microsoft.com/office/drawing/2016/5/9/chartex" xmlns:cx4="http://schemas.microsoft.com/office/drawing/2016/5/10/chartex" xmlns:cx5="http://schemas.microsoft.com/office/drawing/2016/5/11/chartex" xmlns:cx6="http://schemas.microsoft.com/office/drawing/2016/5/12/chartex" xmlns:cx7="http://schemas.microsoft.com/office/drawing/2016/5/13/chartex" xmlns:cx8="http://schemas.microsoft.com/office/drawing/2016/5/14/chartex" xmlns:mc="http://schemas.openxmlformats.org/markup-compatibility/2006" xmlns:aink="http://schemas.microsoft.com/office/drawing/2016/ink" xmlns:am3d="http://schemas.microsoft.com/office/drawing/2017/model3d" xmlns:o="urn:schemas-microsoft-com:office:office" xmlns:oel="http://schemas.microsoft.com/office/2019/extlst" xmlns:r="http://schemas.openxmlformats.org/officeDocument/2006/relationships" xmlns:m="http://schemas.openxmlformats.org/officeDocument/2006/math" xmlns:v="urn:schemas-microsoft-com:vml" xmlns:wp14="http://schemas.microsoft.com/office/word/2010/wordprocessingDrawing" xmlns:wp="http://schemas.openxmlformats.org/drawingml/2006/wordprocessingDrawing" xmlns:w10="urn:schemas-microsoft-com:office:word" xmlns:w="http://schemas.openxmlformats.org/wordprocessingml/2006/main" xmlns:w14="http://schemas.microsoft.com/office/word/2010/wordml" xmlns:w15="http://schemas.microsoft.com/office/word/2012/wordml" xmlns:w16cex="http://schemas.microsoft.com/office/word/2018/wordml/cex" xmlns:w16cid="http://schemas.microsoft.com/office/word/2016/wordml/cid" xmlns:w16="http://schemas.microsoft.com/office/word/2018/wordml" xmlns:w16sdtdh="http://schemas.microsoft.com/office/word/2020/wordml/sdtdatahash" xmlns:w16se="http://schemas.microsoft.com/office/word/2015/wordml/symex" xmlns:wpg="http://schemas.microsoft.com/office/word/2010/wordprocessingGroup" xmlns:wpi="http://schemas.microsoft.com/office/word/2010/wordprocessingInk" xmlns:wne="http://schemas.microsoft.com/office/word/2006/wordml" xmlns:wps="http://schemas.microsoft.com/office/word/2010/wordprocessingShape" mc:Ignorable="w14 w15 w16se w16cid w16 w16cex w16sdtdh wp14">
+<file path=word/footer2.xml><?xml version="1.0" encoding="utf-8"?>
+<w:ftr xmlns:wpc="http://schemas.microsoft.com/office/word/2010/wordprocessingCanvas" xmlns:cx="http://schemas.microsoft.com/office/drawing/2014/chartex" xmlns:cx1="http://schemas.microsoft.com/office/drawing/2015/9/8/chartex" xmlns:cx2="http://schemas.microsoft.com/office/drawing/2015/10/21/chartex" xmlns:cx3="http://schemas.microsoft.com/office/drawing/2016/5/9/chartex" xmlns:cx4="http://schemas.microsoft.com/office/drawing/2016/5/10/chartex" xmlns:cx5="http://schemas.microsoft.com/office/drawing/2016/5/11/chartex" xmlns:cx6="http://schemas.microsoft.com/office/drawing/2016/5/12/chartex" xmlns:cx7="http://schemas.microsoft.com/office/drawing/2016/5/13/chartex" xmlns:cx8="http://schemas.microsoft.com/office/drawing/2016/5/14/chartex" xmlns:mc="http://schemas.openxmlformats.org/markup-compatibility/2006" xmlns:aink="http://schemas.microsoft.com/office/drawing/2016/ink" xmlns:am3d="http://schemas.microsoft.com/office/drawing/2017/model3d" xmlns:o="urn:schemas-microsoft-com:office:office" xmlns:oel="http://schemas.microsoft.com/office/2019/extlst" xmlns:r="http://schemas.openxmlformats.org/officeDocument/2006/relationships" xmlns:m="http://schemas.openxmlformats.org/officeDocument/2006/math" xmlns:v="urn:schemas-microsoft-com:vml" xmlns:wp14="http://schemas.microsoft.com/office/word/2010/wordprocessingDrawing" xmlns:wp="http://schemas.openxmlformats.org/drawingml/2006/wordprocessingDrawing" xmlns:w10="urn:schemas-microsoft-com:office:word" xmlns:w="http://schemas.openxmlformats.org/wordprocessingml/2006/main" xmlns:w14="http://schemas.microsoft.com/office/word/2010/wordml" xmlns:w15="http://schemas.microsoft.com/office/word/2012/wordml" xmlns:w16cex="http://schemas.microsoft.com/office/word/2018/wordml/cex" xmlns:w16cid="http://schemas.microsoft.com/office/word/2016/wordml/cid" xmlns:w16="http://schemas.microsoft.com/office/word/2018/wordml" xmlns:w16du="http://schemas.microsoft.com/office/word/2023/wordml/word16du" xmlns:w16sdtdh="http://schemas.microsoft.com/office/word/2020/wordml/sdtdatahash" xmlns:w16sdtfl="http://schemas.microsoft.com/office/word/2024/wordml/sdtformatlock" xmlns:w16se="http://schemas.microsoft.com/office/word/2015/wordml/symex" xmlns:wpg="http://schemas.microsoft.com/office/word/2010/wordprocessingGroup" xmlns:wpi="http://schemas.microsoft.com/office/word/2010/wordprocessingInk" xmlns:wne="http://schemas.microsoft.com/office/word/2006/wordml" xmlns:wps="http://schemas.microsoft.com/office/word/2010/wordprocessingShape" mc:Ignorable="w14 w15 w16se w16cid w16 w16cex w16sdtdh w16sdtfl w16du wp14">
   <w:p>
     <w:pPr>
       <w:pStyle w:val="Footer"/>
@@ -8296,8 +7928,6 @@
     </w:pPr>
     <w:r>
       <w:tab/>
-    </w:r>
-    <w:r>
       <w:t>Lần ban hành: 04</w:t>
     </w:r>
     <w:r>
@@ -8311,8 +7941,8 @@
 </w:ftr>
 </file>
 
-<file path=word\footnotes.xml><?xml version="1.0" encoding="utf-8"?>
-<w:footnotes xmlns:wpc="http://schemas.microsoft.com/office/word/2010/wordprocessingCanvas" xmlns:cx="http://schemas.microsoft.com/office/drawing/2014/chartex" xmlns:cx1="http://schemas.microsoft.com/office/drawing/2015/9/8/chartex" xmlns:cx2="http://schemas.microsoft.com/office/drawing/2015/10/21/chartex" xmlns:cx3="http://schemas.microsoft.com/office/drawing/2016/5/9/chartex" xmlns:cx4="http://schemas.microsoft.com/office/drawing/2016/5/10/chartex" xmlns:cx5="http://schemas.microsoft.com/office/drawing/2016/5/11/chartex" xmlns:cx6="http://schemas.microsoft.com/office/drawing/2016/5/12/chartex" xmlns:cx7="http://schemas.microsoft.com/office/drawing/2016/5/13/chartex" xmlns:cx8="http://schemas.microsoft.com/office/drawing/2016/5/14/chartex" xmlns:mc="http://schemas.openxmlformats.org/markup-compatibility/2006" xmlns:aink="http://schemas.microsoft.com/office/drawing/2016/ink" xmlns:am3d="http://schemas.microsoft.com/office/drawing/2017/model3d" xmlns:o="urn:schemas-microsoft-com:office:office" xmlns:oel="http://schemas.microsoft.com/office/2019/extlst" xmlns:r="http://schemas.openxmlformats.org/officeDocument/2006/relationships" xmlns:m="http://schemas.openxmlformats.org/officeDocument/2006/math" xmlns:v="urn:schemas-microsoft-com:vml" xmlns:wp14="http://schemas.microsoft.com/office/word/2010/wordprocessingDrawing" xmlns:wp="http://schemas.openxmlformats.org/drawingml/2006/wordprocessingDrawing" xmlns:w10="urn:schemas-microsoft-com:office:word" xmlns:w="http://schemas.openxmlformats.org/wordprocessingml/2006/main" xmlns:w14="http://schemas.microsoft.com/office/word/2010/wordml" xmlns:w15="http://schemas.microsoft.com/office/word/2012/wordml" xmlns:w16cex="http://schemas.microsoft.com/office/word/2018/wordml/cex" xmlns:w16cid="http://schemas.microsoft.com/office/word/2016/wordml/cid" xmlns:w16="http://schemas.microsoft.com/office/word/2018/wordml" xmlns:w16sdtdh="http://schemas.microsoft.com/office/word/2020/wordml/sdtdatahash" xmlns:w16se="http://schemas.microsoft.com/office/word/2015/wordml/symex" xmlns:wpg="http://schemas.microsoft.com/office/word/2010/wordprocessingGroup" xmlns:wpi="http://schemas.microsoft.com/office/word/2010/wordprocessingInk" xmlns:wne="http://schemas.microsoft.com/office/word/2006/wordml" xmlns:wps="http://schemas.microsoft.com/office/word/2010/wordprocessingShape" mc:Ignorable="w14 w15 w16se w16cid w16 w16cex w16sdtdh wp14">
+<file path=word/footnotes.xml><?xml version="1.0" encoding="utf-8"?>
+<w:footnotes xmlns:wpc="http://schemas.microsoft.com/office/word/2010/wordprocessingCanvas" xmlns:cx="http://schemas.microsoft.com/office/drawing/2014/chartex" xmlns:cx1="http://schemas.microsoft.com/office/drawing/2015/9/8/chartex" xmlns:cx2="http://schemas.microsoft.com/office/drawing/2015/10/21/chartex" xmlns:cx3="http://schemas.microsoft.com/office/drawing/2016/5/9/chartex" xmlns:cx4="http://schemas.microsoft.com/office/drawing/2016/5/10/chartex" xmlns:cx5="http://schemas.microsoft.com/office/drawing/2016/5/11/chartex" xmlns:cx6="http://schemas.microsoft.com/office/drawing/2016/5/12/chartex" xmlns:cx7="http://schemas.microsoft.com/office/drawing/2016/5/13/chartex" xmlns:cx8="http://schemas.microsoft.com/office/drawing/2016/5/14/chartex" xmlns:mc="http://schemas.openxmlformats.org/markup-compatibility/2006" xmlns:aink="http://schemas.microsoft.com/office/drawing/2016/ink" xmlns:am3d="http://schemas.microsoft.com/office/drawing/2017/model3d" xmlns:o="urn:schemas-microsoft-com:office:office" xmlns:oel="http://schemas.microsoft.com/office/2019/extlst" xmlns:r="http://schemas.openxmlformats.org/officeDocument/2006/relationships" xmlns:m="http://schemas.openxmlformats.org/officeDocument/2006/math" xmlns:v="urn:schemas-microsoft-com:vml" xmlns:wp14="http://schemas.microsoft.com/office/word/2010/wordprocessingDrawing" xmlns:wp="http://schemas.openxmlformats.org/drawingml/2006/wordprocessingDrawing" xmlns:w10="urn:schemas-microsoft-com:office:word" xmlns:w="http://schemas.openxmlformats.org/wordprocessingml/2006/main" xmlns:w14="http://schemas.microsoft.com/office/word/2010/wordml" xmlns:w15="http://schemas.microsoft.com/office/word/2012/wordml" xmlns:w16cex="http://schemas.microsoft.com/office/word/2018/wordml/cex" xmlns:w16cid="http://schemas.microsoft.com/office/word/2016/wordml/cid" xmlns:w16="http://schemas.microsoft.com/office/word/2018/wordml" xmlns:w16du="http://schemas.microsoft.com/office/word/2023/wordml/word16du" xmlns:w16sdtdh="http://schemas.microsoft.com/office/word/2020/wordml/sdtdatahash" xmlns:w16sdtfl="http://schemas.microsoft.com/office/word/2024/wordml/sdtformatlock" xmlns:w16se="http://schemas.microsoft.com/office/word/2015/wordml/symex" xmlns:wpg="http://schemas.microsoft.com/office/word/2010/wordprocessingGroup" xmlns:wpi="http://schemas.microsoft.com/office/word/2010/wordprocessingInk" xmlns:wne="http://schemas.microsoft.com/office/word/2006/wordml" xmlns:wps="http://schemas.microsoft.com/office/word/2010/wordprocessingShape" mc:Ignorable="w14 w15 w16se w16cid w16 w16cex w16sdtdh w16sdtfl w16du wp14">
   <w:footnote w:type="separator" w:id="-1">
     <w:p>
       <w:pPr>
@@ -8338,226 +7968,8 @@
 </w:footnotes>
 </file>
 
-<file path=word\header1.xml><?xml version="1.0" encoding="utf-8"?>
-<w:hdr xmlns:wpc="http://schemas.microsoft.com/office/word/2010/wordprocessingCanvas" xmlns:cx="http://schemas.microsoft.com/office/drawing/2014/chartex" xmlns:cx1="http://schemas.microsoft.com/office/drawing/2015/9/8/chartex" xmlns:cx2="http://schemas.microsoft.com/office/drawing/2015/10/21/chartex" xmlns:cx3="http://schemas.microsoft.com/office/drawing/2016/5/9/chartex" xmlns:cx4="http://schemas.microsoft.com/office/drawing/2016/5/10/chartex" xmlns:cx5="http://schemas.microsoft.com/office/drawing/2016/5/11/chartex" xmlns:cx6="http://schemas.microsoft.com/office/drawing/2016/5/12/chartex" xmlns:cx7="http://schemas.microsoft.com/office/drawing/2016/5/13/chartex" xmlns:cx8="http://schemas.microsoft.com/office/drawing/2016/5/14/chartex" xmlns:mc="http://schemas.openxmlformats.org/markup-compatibility/2006" xmlns:aink="http://schemas.microsoft.com/office/drawing/2016/ink" xmlns:am3d="http://schemas.microsoft.com/office/drawing/2017/model3d" xmlns:o="urn:schemas-microsoft-com:office:office" xmlns:oel="http://schemas.microsoft.com/office/2019/extlst" xmlns:r="http://schemas.openxmlformats.org/officeDocument/2006/relationships" xmlns:m="http://schemas.openxmlformats.org/officeDocument/2006/math" xmlns:v="urn:schemas-microsoft-com:vml" xmlns:wp14="http://schemas.microsoft.com/office/word/2010/wordprocessingDrawing" xmlns:wp="http://schemas.openxmlformats.org/drawingml/2006/wordprocessingDrawing" xmlns:w10="urn:schemas-microsoft-com:office:word" xmlns:w="http://schemas.openxmlformats.org/wordprocessingml/2006/main" xmlns:w14="http://schemas.microsoft.com/office/word/2010/wordml" xmlns:w15="http://schemas.microsoft.com/office/word/2012/wordml" xmlns:w16cex="http://schemas.microsoft.com/office/word/2018/wordml/cex" xmlns:w16cid="http://schemas.microsoft.com/office/word/2016/wordml/cid" xmlns:w16="http://schemas.microsoft.com/office/word/2018/wordml" xmlns:w16sdtdh="http://schemas.microsoft.com/office/word/2020/wordml/sdtdatahash" xmlns:w16se="http://schemas.microsoft.com/office/word/2015/wordml/symex" xmlns:wpg="http://schemas.microsoft.com/office/word/2010/wordprocessingGroup" xmlns:wpi="http://schemas.microsoft.com/office/word/2010/wordprocessingInk" xmlns:wne="http://schemas.microsoft.com/office/word/2006/wordml" xmlns:wps="http://schemas.microsoft.com/office/word/2010/wordprocessingShape" mc:Ignorable="w14 w15 w16se w16cid w16 w16cex w16sdtdh wp14">
-  <w:sdt>
-    <w:sdtPr>
-      <w:rPr>
-        <w:rStyle w:val="PageNumber"/>
-      </w:rPr>
-      <w:id w:val="-1566330820"/>
-      <w:docPartObj>
-        <w:docPartGallery w:val="Page Numbers (Top of Page)"/>
-        <w:docPartUnique/>
-      </w:docPartObj>
-    </w:sdtPr>
-    <w:sdtContent>
-      <w:p>
-        <w:pPr>
-          <w:pStyle w:val="Header"/>
-          <w:framePr w:wrap="none" w:vAnchor="text" w:hAnchor="margin" w:xAlign="right" w:y="1"/>
-          <w:rPr>
-            <w:rStyle w:val="PageNumber"/>
-          </w:rPr>
-        </w:pPr>
-        <w:r>
-          <w:rPr>
-            <w:rStyle w:val="PageNumber"/>
-          </w:rPr>
-          <w:fldChar w:fldCharType="begin"/>
-        </w:r>
-        <w:r>
-          <w:rPr>
-            <w:rStyle w:val="PageNumber"/>
-          </w:rPr>
-          <w:instrText xml:space="preserve"> PAGE </w:instrText>
-        </w:r>
-        <w:r>
-          <w:rPr>
-            <w:rStyle w:val="PageNumber"/>
-          </w:rPr>
-          <w:fldChar w:fldCharType="end"/>
-        </w:r>
-      </w:p>
-    </w:sdtContent>
-  </w:sdt>
-  <w:sdt>
-    <w:sdtPr>
-      <w:rPr>
-        <w:rStyle w:val="PageNumber"/>
-      </w:rPr>
-      <w:id w:val="-1193617627"/>
-      <w:docPartObj>
-        <w:docPartGallery w:val="Page Numbers (Top of Page)"/>
-        <w:docPartUnique/>
-      </w:docPartObj>
-    </w:sdtPr>
-    <w:sdtContent>
-      <w:p>
-        <w:pPr>
-          <w:pStyle w:val="Header"/>
-          <w:framePr w:wrap="none" w:vAnchor="text" w:hAnchor="margin" w:xAlign="right" w:y="1"/>
-          <w:ind w:right="360"/>
-          <w:rPr>
-            <w:rStyle w:val="PageNumber"/>
-          </w:rPr>
-        </w:pPr>
-        <w:r>
-          <w:rPr>
-            <w:rStyle w:val="PageNumber"/>
-          </w:rPr>
-          <w:fldChar w:fldCharType="begin"/>
-        </w:r>
-        <w:r>
-          <w:rPr>
-            <w:rStyle w:val="PageNumber"/>
-          </w:rPr>
-          <w:instrText xml:space="preserve"> PAGE </w:instrText>
-        </w:r>
-        <w:r>
-          <w:rPr>
-            <w:rStyle w:val="PageNumber"/>
-          </w:rPr>
-          <w:fldChar w:fldCharType="end"/>
-        </w:r>
-      </w:p>
-    </w:sdtContent>
-  </w:sdt>
-  <w:p>
-    <w:pPr>
-      <w:pStyle w:val="Header"/>
-      <w:ind w:right="360"/>
-    </w:pPr>
-  </w:p>
-</w:hdr>
-</file>
-
-<file path=word\header2.xml><?xml version="1.0" encoding="utf-8"?>
-<w:hdr xmlns:wpc="http://schemas.microsoft.com/office/word/2010/wordprocessingCanvas" xmlns:cx="http://schemas.microsoft.com/office/drawing/2014/chartex" xmlns:cx1="http://schemas.microsoft.com/office/drawing/2015/9/8/chartex" xmlns:cx2="http://schemas.microsoft.com/office/drawing/2015/10/21/chartex" xmlns:cx3="http://schemas.microsoft.com/office/drawing/2016/5/9/chartex" xmlns:cx4="http://schemas.microsoft.com/office/drawing/2016/5/10/chartex" xmlns:cx5="http://schemas.microsoft.com/office/drawing/2016/5/11/chartex" xmlns:cx6="http://schemas.microsoft.com/office/drawing/2016/5/12/chartex" xmlns:cx7="http://schemas.microsoft.com/office/drawing/2016/5/13/chartex" xmlns:cx8="http://schemas.microsoft.com/office/drawing/2016/5/14/chartex" xmlns:mc="http://schemas.openxmlformats.org/markup-compatibility/2006" xmlns:aink="http://schemas.microsoft.com/office/drawing/2016/ink" xmlns:am3d="http://schemas.microsoft.com/office/drawing/2017/model3d" xmlns:o="urn:schemas-microsoft-com:office:office" xmlns:oel="http://schemas.microsoft.com/office/2019/extlst" xmlns:r="http://schemas.openxmlformats.org/officeDocument/2006/relationships" xmlns:m="http://schemas.openxmlformats.org/officeDocument/2006/math" xmlns:v="urn:schemas-microsoft-com:vml" xmlns:wp14="http://schemas.microsoft.com/office/word/2010/wordprocessingDrawing" xmlns:wp="http://schemas.openxmlformats.org/drawingml/2006/wordprocessingDrawing" xmlns:w10="urn:schemas-microsoft-com:office:word" xmlns:w="http://schemas.openxmlformats.org/wordprocessingml/2006/main" xmlns:w14="http://schemas.microsoft.com/office/word/2010/wordml" xmlns:w15="http://schemas.microsoft.com/office/word/2012/wordml" xmlns:w16cex="http://schemas.microsoft.com/office/word/2018/wordml/cex" xmlns:w16cid="http://schemas.microsoft.com/office/word/2016/wordml/cid" xmlns:w16="http://schemas.microsoft.com/office/word/2018/wordml" xmlns:w16sdtdh="http://schemas.microsoft.com/office/word/2020/wordml/sdtdatahash" xmlns:w16se="http://schemas.microsoft.com/office/word/2015/wordml/symex" xmlns:wpg="http://schemas.microsoft.com/office/word/2010/wordprocessingGroup" xmlns:wpi="http://schemas.microsoft.com/office/word/2010/wordprocessingInk" xmlns:wne="http://schemas.microsoft.com/office/word/2006/wordml" xmlns:wps="http://schemas.microsoft.com/office/word/2010/wordprocessingShape" mc:Ignorable="w14 w15 w16se w16cid w16 w16cex w16sdtdh wp14">
-  <w:p>
-    <w:pPr>
-      <w:pStyle w:val="Header"/>
-      <w:pBdr>
-        <w:bottom w:val="single" w:sz="6" w:space="1" w:color="auto"/>
-      </w:pBdr>
-      <w:tabs>
-        <w:tab w:val="clear" w:pos="9360"/>
-        <w:tab w:val="left" w:pos="142"/>
-        <w:tab w:val="right" w:pos="9356"/>
-      </w:tabs>
-      <w:ind w:right="360"/>
-    </w:pPr>
-    <w:r>
-      <w:tab/>
-    </w:r>
-    <w:r>
-      <w:t>05.2.9.16-ST</w:t>
-    </w:r>
-    <w:r>
-      <w:tab/>
-    </w:r>
-    <w:r>
-      <w:tab/>
-      <w:t>Trang:</w:t>
-    </w:r>
-    <w:r>
-      <w:t xml:space="preserve"> </w:t>
-    </w:r>
-    <w:r>
-      <w:fldChar w:fldCharType="begin"/>
-    </w:r>
-    <w:r>
-      <w:instrText xml:space="preserve"> PAGE </w:instrText>
-    </w:r>
-    <w:r>
-      <w:fldChar w:fldCharType="separate"/>
-    </w:r>
-    <w:r>
-      <w:t>1</w:t>
-    </w:r>
-    <w:r>
-      <w:fldChar w:fldCharType="end"/>
-    </w:r>
-    <w:r>
-      <w:t>/</w:t>
-    </w:r>
-    <w:r>
-      <w:fldChar w:fldCharType="begin"/>
-    </w:r>
-    <w:r>
-      <w:instrText xml:space="preserve"> NUMPAGES </w:instrText>
-    </w:r>
-    <w:r>
-      <w:fldChar w:fldCharType="separate"/>
-    </w:r>
-    <w:r>
-      <w:t>15</w:t>
-    </w:r>
-    <w:r>
-      <w:fldChar w:fldCharType="end"/>
-    </w:r>
-  </w:p>
-  <w:p>
-    <w:pPr>
-      <w:pStyle w:val="Header"/>
-      <w:ind w:right="360"/>
-    </w:pPr>
-  </w:p>
-</w:hdr>
-</file>
-
-<file path=word\header3.xml><?xml version="1.0" encoding="utf-8"?>
-<w:hdr xmlns:wpc="http://schemas.microsoft.com/office/word/2010/wordprocessingCanvas" xmlns:cx="http://schemas.microsoft.com/office/drawing/2014/chartex" xmlns:cx1="http://schemas.microsoft.com/office/drawing/2015/9/8/chartex" xmlns:cx2="http://schemas.microsoft.com/office/drawing/2015/10/21/chartex" xmlns:cx3="http://schemas.microsoft.com/office/drawing/2016/5/9/chartex" xmlns:cx4="http://schemas.microsoft.com/office/drawing/2016/5/10/chartex" xmlns:cx5="http://schemas.microsoft.com/office/drawing/2016/5/11/chartex" xmlns:cx6="http://schemas.microsoft.com/office/drawing/2016/5/12/chartex" xmlns:cx7="http://schemas.microsoft.com/office/drawing/2016/5/13/chartex" xmlns:cx8="http://schemas.microsoft.com/office/drawing/2016/5/14/chartex" xmlns:mc="http://schemas.openxmlformats.org/markup-compatibility/2006" xmlns:aink="http://schemas.microsoft.com/office/drawing/2016/ink" xmlns:am3d="http://schemas.microsoft.com/office/drawing/2017/model3d" xmlns:o="urn:schemas-microsoft-com:office:office" xmlns:oel="http://schemas.microsoft.com/office/2019/extlst" xmlns:r="http://schemas.openxmlformats.org/officeDocument/2006/relationships" xmlns:m="http://schemas.openxmlformats.org/officeDocument/2006/math" xmlns:v="urn:schemas-microsoft-com:vml" xmlns:wp14="http://schemas.microsoft.com/office/word/2010/wordprocessingDrawing" xmlns:wp="http://schemas.openxmlformats.org/drawingml/2006/wordprocessingDrawing" xmlns:w10="urn:schemas-microsoft-com:office:word" xmlns:w="http://schemas.openxmlformats.org/wordprocessingml/2006/main" xmlns:w14="http://schemas.microsoft.com/office/word/2010/wordml" xmlns:w15="http://schemas.microsoft.com/office/word/2012/wordml" xmlns:w16cex="http://schemas.microsoft.com/office/word/2018/wordml/cex" xmlns:w16cid="http://schemas.microsoft.com/office/word/2016/wordml/cid" xmlns:w16="http://schemas.microsoft.com/office/word/2018/wordml" xmlns:w16sdtdh="http://schemas.microsoft.com/office/word/2020/wordml/sdtdatahash" xmlns:w16se="http://schemas.microsoft.com/office/word/2015/wordml/symex" xmlns:wpg="http://schemas.microsoft.com/office/word/2010/wordprocessingGroup" xmlns:wpi="http://schemas.microsoft.com/office/word/2010/wordprocessingInk" xmlns:wne="http://schemas.microsoft.com/office/word/2006/wordml" xmlns:wps="http://schemas.microsoft.com/office/word/2010/wordprocessingShape" mc:Ignorable="w14 w15 w16se w16cid w16 w16cex w16sdtdh wp14">
-  <w:p>
-    <w:pPr>
-      <w:pStyle w:val="Title"/>
-      <w:rPr>
-        <w:b w:val="0"/>
-        <w:bCs/>
-      </w:rPr>
-    </w:pPr>
-    <w:r>
-      <w:rPr>
-        <w:b w:val="0"/>
-        <w:bCs/>
-      </w:rPr>
-      <w:t>TRUNG TÂM CHẤT LƯỢNG, CHẾ BIẾN VÀ PHÁT TRIỂN THỊ TRƯỜNG VÙNG 6</w:t>
-    </w:r>
-  </w:p>
-  <w:p>
-    <w:pPr>
-      <w:pStyle w:val="Subtitle"/>
-      <w:pBdr>
-        <w:bottom w:val="single" w:sz="6" w:space="1" w:color="auto"/>
-      </w:pBdr>
-      <w:jc w:val="center"/>
-    </w:pPr>
-    <w:r>
-      <w:t xml:space="preserve">PHÒNG KIỂM </w:t>
-    </w:r>
-    <w:r>
-      <w:t>NGHIỆM</w:t>
-    </w:r>
-    <w:r>
-      <w:t xml:space="preserve"> HÓA HỌC</w:t>
-    </w:r>
-  </w:p>
-  <w:p/>
-</w:hdr>
-</file>
-
-<file path=word\header4.xml><?xml version="1.0" encoding="utf-8"?>
-<w:hdr xmlns:wpc="http://schemas.microsoft.com/office/word/2010/wordprocessingCanvas" xmlns:cx="http://schemas.microsoft.com/office/drawing/2014/chartex" xmlns:cx1="http://schemas.microsoft.com/office/drawing/2015/9/8/chartex" xmlns:cx2="http://schemas.microsoft.com/office/drawing/2015/10/21/chartex" xmlns:cx3="http://schemas.microsoft.com/office/drawing/2016/5/9/chartex" xmlns:cx4="http://schemas.microsoft.com/office/drawing/2016/5/10/chartex" xmlns:cx5="http://schemas.microsoft.com/office/drawing/2016/5/11/chartex" xmlns:cx6="http://schemas.microsoft.com/office/drawing/2016/5/12/chartex" xmlns:cx7="http://schemas.microsoft.com/office/drawing/2016/5/13/chartex" xmlns:cx8="http://schemas.microsoft.com/office/drawing/2016/5/14/chartex" xmlns:mc="http://schemas.openxmlformats.org/markup-compatibility/2006" xmlns:aink="http://schemas.microsoft.com/office/drawing/2016/ink" xmlns:am3d="http://schemas.microsoft.com/office/drawing/2017/model3d" xmlns:o="urn:schemas-microsoft-com:office:office" xmlns:oel="http://schemas.microsoft.com/office/2019/extlst" xmlns:r="http://schemas.openxmlformats.org/officeDocument/2006/relationships" xmlns:m="http://schemas.openxmlformats.org/officeDocument/2006/math" xmlns:v="urn:schemas-microsoft-com:vml" xmlns:wp14="http://schemas.microsoft.com/office/word/2010/wordprocessingDrawing" xmlns:wp="http://schemas.openxmlformats.org/drawingml/2006/wordprocessingDrawing" xmlns:w10="urn:schemas-microsoft-com:office:word" xmlns:w="http://schemas.openxmlformats.org/wordprocessingml/2006/main" xmlns:w14="http://schemas.microsoft.com/office/word/2010/wordml" xmlns:w15="http://schemas.microsoft.com/office/word/2012/wordml" xmlns:w16cex="http://schemas.microsoft.com/office/word/2018/wordml/cex" xmlns:w16cid="http://schemas.microsoft.com/office/word/2016/wordml/cid" xmlns:w16="http://schemas.microsoft.com/office/word/2018/wordml" xmlns:w16sdtdh="http://schemas.microsoft.com/office/word/2020/wordml/sdtdatahash" xmlns:w16se="http://schemas.microsoft.com/office/word/2015/wordml/symex" xmlns:wpg="http://schemas.microsoft.com/office/word/2010/wordprocessingGroup" xmlns:wpi="http://schemas.microsoft.com/office/word/2010/wordprocessingInk" xmlns:wne="http://schemas.microsoft.com/office/word/2006/wordml" xmlns:wps="http://schemas.microsoft.com/office/word/2010/wordprocessingShape" mc:Ignorable="w14 w15 w16se w16cid w16 w16cex w16sdtdh wp14">
-  <w:p>
-    <w:pPr>
-      <w:pStyle w:val="Header"/>
-    </w:pPr>
-  </w:p>
-</w:hdr>
-</file>
-
-<file path=word\header5.xml><?xml version="1.0" encoding="utf-8"?>
-<w:hdr xmlns:wpc="http://schemas.microsoft.com/office/word/2010/wordprocessingCanvas" xmlns:cx="http://schemas.microsoft.com/office/drawing/2014/chartex" xmlns:cx1="http://schemas.microsoft.com/office/drawing/2015/9/8/chartex" xmlns:cx2="http://schemas.microsoft.com/office/drawing/2015/10/21/chartex" xmlns:cx3="http://schemas.microsoft.com/office/drawing/2016/5/9/chartex" xmlns:cx4="http://schemas.microsoft.com/office/drawing/2016/5/10/chartex" xmlns:cx5="http://schemas.microsoft.com/office/drawing/2016/5/11/chartex" xmlns:cx6="http://schemas.microsoft.com/office/drawing/2016/5/12/chartex" xmlns:cx7="http://schemas.microsoft.com/office/drawing/2016/5/13/chartex" xmlns:cx8="http://schemas.microsoft.com/office/drawing/2016/5/14/chartex" xmlns:mc="http://schemas.openxmlformats.org/markup-compatibility/2006" xmlns:aink="http://schemas.microsoft.com/office/drawing/2016/ink" xmlns:am3d="http://schemas.microsoft.com/office/drawing/2017/model3d" xmlns:o="urn:schemas-microsoft-com:office:office" xmlns:oel="http://schemas.microsoft.com/office/2019/extlst" xmlns:r="http://schemas.openxmlformats.org/officeDocument/2006/relationships" xmlns:m="http://schemas.openxmlformats.org/officeDocument/2006/math" xmlns:v="urn:schemas-microsoft-com:vml" xmlns:wp14="http://schemas.microsoft.com/office/word/2010/wordprocessingDrawing" xmlns:wp="http://schemas.openxmlformats.org/drawingml/2006/wordprocessingDrawing" xmlns:w10="urn:schemas-microsoft-com:office:word" xmlns:w="http://schemas.openxmlformats.org/wordprocessingml/2006/main" xmlns:w14="http://schemas.microsoft.com/office/word/2010/wordml" xmlns:w15="http://schemas.microsoft.com/office/word/2012/wordml" xmlns:w16cex="http://schemas.microsoft.com/office/word/2018/wordml/cex" xmlns:w16cid="http://schemas.microsoft.com/office/word/2016/wordml/cid" xmlns:w16="http://schemas.microsoft.com/office/word/2018/wordml" xmlns:w16sdtdh="http://schemas.microsoft.com/office/word/2020/wordml/sdtdatahash" xmlns:w16se="http://schemas.microsoft.com/office/word/2015/wordml/symex" xmlns:wpg="http://schemas.microsoft.com/office/word/2010/wordprocessingGroup" xmlns:wpi="http://schemas.microsoft.com/office/word/2010/wordprocessingInk" xmlns:wne="http://schemas.microsoft.com/office/word/2006/wordml" xmlns:wps="http://schemas.microsoft.com/office/word/2010/wordprocessingShape" mc:Ignorable="w14 w15 w16se w16cid w16 w16cex w16sdtdh wp14">
+<file path=word/header1.xml><?xml version="1.0" encoding="utf-8"?>
+<w:hdr xmlns:wpc="http://schemas.microsoft.com/office/word/2010/wordprocessingCanvas" xmlns:cx="http://schemas.microsoft.com/office/drawing/2014/chartex" xmlns:cx1="http://schemas.microsoft.com/office/drawing/2015/9/8/chartex" xmlns:cx2="http://schemas.microsoft.com/office/drawing/2015/10/21/chartex" xmlns:cx3="http://schemas.microsoft.com/office/drawing/2016/5/9/chartex" xmlns:cx4="http://schemas.microsoft.com/office/drawing/2016/5/10/chartex" xmlns:cx5="http://schemas.microsoft.com/office/drawing/2016/5/11/chartex" xmlns:cx6="http://schemas.microsoft.com/office/drawing/2016/5/12/chartex" xmlns:cx7="http://schemas.microsoft.com/office/drawing/2016/5/13/chartex" xmlns:cx8="http://schemas.microsoft.com/office/drawing/2016/5/14/chartex" xmlns:mc="http://schemas.openxmlformats.org/markup-compatibility/2006" xmlns:aink="http://schemas.microsoft.com/office/drawing/2016/ink" xmlns:am3d="http://schemas.microsoft.com/office/drawing/2017/model3d" xmlns:o="urn:schemas-microsoft-com:office:office" xmlns:oel="http://schemas.microsoft.com/office/2019/extlst" xmlns:r="http://schemas.openxmlformats.org/officeDocument/2006/relationships" xmlns:m="http://schemas.openxmlformats.org/officeDocument/2006/math" xmlns:v="urn:schemas-microsoft-com:vml" xmlns:wp14="http://schemas.microsoft.com/office/word/2010/wordprocessingDrawing" xmlns:wp="http://schemas.openxmlformats.org/drawingml/2006/wordprocessingDrawing" xmlns:w10="urn:schemas-microsoft-com:office:word" xmlns:w="http://schemas.openxmlformats.org/wordprocessingml/2006/main" xmlns:w14="http://schemas.microsoft.com/office/word/2010/wordml" xmlns:w15="http://schemas.microsoft.com/office/word/2012/wordml" xmlns:w16cex="http://schemas.microsoft.com/office/word/2018/wordml/cex" xmlns:w16cid="http://schemas.microsoft.com/office/word/2016/wordml/cid" xmlns:w16="http://schemas.microsoft.com/office/word/2018/wordml" xmlns:w16du="http://schemas.microsoft.com/office/word/2023/wordml/word16du" xmlns:w16sdtdh="http://schemas.microsoft.com/office/word/2020/wordml/sdtdatahash" xmlns:w16sdtfl="http://schemas.microsoft.com/office/word/2024/wordml/sdtformatlock" xmlns:w16se="http://schemas.microsoft.com/office/word/2015/wordml/symex" xmlns:wpg="http://schemas.microsoft.com/office/word/2010/wordprocessingGroup" xmlns:wpi="http://schemas.microsoft.com/office/word/2010/wordprocessingInk" xmlns:wne="http://schemas.microsoft.com/office/word/2006/wordml" xmlns:wps="http://schemas.microsoft.com/office/word/2010/wordprocessingShape" mc:Ignorable="w14 w15 w16se w16cid w16 w16cex w16sdtdh w16sdtfl w16du wp14">
   <w:p>
     <w:pPr>
       <w:pStyle w:val="Header"/>
@@ -8619,8 +8031,71 @@
 </w:hdr>
 </file>
 
-<file path=word\numbering.xml><?xml version="1.0" encoding="utf-8"?>
-<w:numbering xmlns:wpc="http://schemas.microsoft.com/office/word/2010/wordprocessingCanvas" xmlns:cx="http://schemas.microsoft.com/office/drawing/2014/chartex" xmlns:cx1="http://schemas.microsoft.com/office/drawing/2015/9/8/chartex" xmlns:cx2="http://schemas.microsoft.com/office/drawing/2015/10/21/chartex" xmlns:cx3="http://schemas.microsoft.com/office/drawing/2016/5/9/chartex" xmlns:cx4="http://schemas.microsoft.com/office/drawing/2016/5/10/chartex" xmlns:cx5="http://schemas.microsoft.com/office/drawing/2016/5/11/chartex" xmlns:cx6="http://schemas.microsoft.com/office/drawing/2016/5/12/chartex" xmlns:cx7="http://schemas.microsoft.com/office/drawing/2016/5/13/chartex" xmlns:cx8="http://schemas.microsoft.com/office/drawing/2016/5/14/chartex" xmlns:mc="http://schemas.openxmlformats.org/markup-compatibility/2006" xmlns:aink="http://schemas.microsoft.com/office/drawing/2016/ink" xmlns:am3d="http://schemas.microsoft.com/office/drawing/2017/model3d" xmlns:o="urn:schemas-microsoft-com:office:office" xmlns:oel="http://schemas.microsoft.com/office/2019/extlst" xmlns:r="http://schemas.openxmlformats.org/officeDocument/2006/relationships" xmlns:m="http://schemas.openxmlformats.org/officeDocument/2006/math" xmlns:v="urn:schemas-microsoft-com:vml" xmlns:wp14="http://schemas.microsoft.com/office/word/2010/wordprocessingDrawing" xmlns:wp="http://schemas.openxmlformats.org/drawingml/2006/wordprocessingDrawing" xmlns:w10="urn:schemas-microsoft-com:office:word" xmlns:w="http://schemas.openxmlformats.org/wordprocessingml/2006/main" xmlns:w14="http://schemas.microsoft.com/office/word/2010/wordml" xmlns:w15="http://schemas.microsoft.com/office/word/2012/wordml" xmlns:w16cex="http://schemas.microsoft.com/office/word/2018/wordml/cex" xmlns:w16cid="http://schemas.microsoft.com/office/word/2016/wordml/cid" xmlns:w16="http://schemas.microsoft.com/office/word/2018/wordml" xmlns:w16sdtdh="http://schemas.microsoft.com/office/word/2020/wordml/sdtdatahash" xmlns:w16se="http://schemas.microsoft.com/office/word/2015/wordml/symex" xmlns:wpg="http://schemas.microsoft.com/office/word/2010/wordprocessingGroup" xmlns:wpi="http://schemas.microsoft.com/office/word/2010/wordprocessingInk" xmlns:wne="http://schemas.microsoft.com/office/word/2006/wordml" xmlns:wps="http://schemas.microsoft.com/office/word/2010/wordprocessingShape" mc:Ignorable="w14 w15 w16se w16cid w16 w16cex w16sdtdh wp14">
+<file path=word/header2.xml><?xml version="1.0" encoding="utf-8"?>
+<w:hdr xmlns:wpc="http://schemas.microsoft.com/office/word/2010/wordprocessingCanvas" xmlns:cx="http://schemas.microsoft.com/office/drawing/2014/chartex" xmlns:cx1="http://schemas.microsoft.com/office/drawing/2015/9/8/chartex" xmlns:cx2="http://schemas.microsoft.com/office/drawing/2015/10/21/chartex" xmlns:cx3="http://schemas.microsoft.com/office/drawing/2016/5/9/chartex" xmlns:cx4="http://schemas.microsoft.com/office/drawing/2016/5/10/chartex" xmlns:cx5="http://schemas.microsoft.com/office/drawing/2016/5/11/chartex" xmlns:cx6="http://schemas.microsoft.com/office/drawing/2016/5/12/chartex" xmlns:cx7="http://schemas.microsoft.com/office/drawing/2016/5/13/chartex" xmlns:cx8="http://schemas.microsoft.com/office/drawing/2016/5/14/chartex" xmlns:mc="http://schemas.openxmlformats.org/markup-compatibility/2006" xmlns:aink="http://schemas.microsoft.com/office/drawing/2016/ink" xmlns:am3d="http://schemas.microsoft.com/office/drawing/2017/model3d" xmlns:o="urn:schemas-microsoft-com:office:office" xmlns:oel="http://schemas.microsoft.com/office/2019/extlst" xmlns:r="http://schemas.openxmlformats.org/officeDocument/2006/relationships" xmlns:m="http://schemas.openxmlformats.org/officeDocument/2006/math" xmlns:v="urn:schemas-microsoft-com:vml" xmlns:wp14="http://schemas.microsoft.com/office/word/2010/wordprocessingDrawing" xmlns:wp="http://schemas.openxmlformats.org/drawingml/2006/wordprocessingDrawing" xmlns:w10="urn:schemas-microsoft-com:office:word" xmlns:w="http://schemas.openxmlformats.org/wordprocessingml/2006/main" xmlns:w14="http://schemas.microsoft.com/office/word/2010/wordml" xmlns:w15="http://schemas.microsoft.com/office/word/2012/wordml" xmlns:w16cex="http://schemas.microsoft.com/office/word/2018/wordml/cex" xmlns:w16cid="http://schemas.microsoft.com/office/word/2016/wordml/cid" xmlns:w16="http://schemas.microsoft.com/office/word/2018/wordml" xmlns:w16du="http://schemas.microsoft.com/office/word/2023/wordml/word16du" xmlns:w16sdtdh="http://schemas.microsoft.com/office/word/2020/wordml/sdtdatahash" xmlns:w16sdtfl="http://schemas.microsoft.com/office/word/2024/wordml/sdtformatlock" xmlns:w16se="http://schemas.microsoft.com/office/word/2015/wordml/symex" xmlns:wpg="http://schemas.microsoft.com/office/word/2010/wordprocessingGroup" xmlns:wpi="http://schemas.microsoft.com/office/word/2010/wordprocessingInk" xmlns:wne="http://schemas.microsoft.com/office/word/2006/wordml" xmlns:wps="http://schemas.microsoft.com/office/word/2010/wordprocessingShape" mc:Ignorable="w14 w15 w16se w16cid w16 w16cex w16sdtdh w16sdtfl w16du wp14">
+  <w:p>
+    <w:pPr>
+      <w:pStyle w:val="Header"/>
+      <w:pBdr>
+        <w:bottom w:val="single" w:sz="6" w:space="1" w:color="auto"/>
+      </w:pBdr>
+      <w:tabs>
+        <w:tab w:val="clear" w:pos="9360"/>
+        <w:tab w:val="left" w:pos="142"/>
+        <w:tab w:val="right" w:pos="9781"/>
+      </w:tabs>
+      <w:ind w:right="1"/>
+    </w:pPr>
+    <w:r>
+      <w:tab/>
+      <w:t>05.2.9.</w:t>
+    </w:r>
+    <w:r>
+      <w:t>4</w:t>
+    </w:r>
+    <w:r>
+      <w:t>-ST</w:t>
+    </w:r>
+    <w:r>
+      <w:tab/>
+    </w:r>
+    <w:r>
+      <w:tab/>
+      <w:t xml:space="preserve">Trang: </w:t>
+    </w:r>
+    <w:r>
+      <w:fldChar w:fldCharType="begin"/>
+    </w:r>
+    <w:r>
+      <w:instrText xml:space="preserve"> PAGE </w:instrText>
+    </w:r>
+    <w:r>
+      <w:fldChar w:fldCharType="separate"/>
+    </w:r>
+    <w:r>
+      <w:t>1</w:t>
+    </w:r>
+    <w:r>
+      <w:fldChar w:fldCharType="end"/>
+    </w:r>
+    <w:r>
+      <w:t>/</w:t>
+    </w:r>
+    <w:r>
+      <w:t>12</w:t>
+    </w:r>
+  </w:p>
+  <w:p>
+    <w:pPr>
+      <w:pStyle w:val="Header"/>
+      <w:ind w:right="360"/>
+    </w:pPr>
+  </w:p>
+</w:hdr>
+</file>
+
+<file path=word/numbering.xml><?xml version="1.0" encoding="utf-8"?>
+<w:numbering xmlns:wpc="http://schemas.microsoft.com/office/word/2010/wordprocessingCanvas" xmlns:cx="http://schemas.microsoft.com/office/drawing/2014/chartex" xmlns:cx1="http://schemas.microsoft.com/office/drawing/2015/9/8/chartex" xmlns:cx2="http://schemas.microsoft.com/office/drawing/2015/10/21/chartex" xmlns:cx3="http://schemas.microsoft.com/office/drawing/2016/5/9/chartex" xmlns:cx4="http://schemas.microsoft.com/office/drawing/2016/5/10/chartex" xmlns:cx5="http://schemas.microsoft.com/office/drawing/2016/5/11/chartex" xmlns:cx6="http://schemas.microsoft.com/office/drawing/2016/5/12/chartex" xmlns:cx7="http://schemas.microsoft.com/office/drawing/2016/5/13/chartex" xmlns:cx8="http://schemas.microsoft.com/office/drawing/2016/5/14/chartex" xmlns:mc="http://schemas.openxmlformats.org/markup-compatibility/2006" xmlns:aink="http://schemas.microsoft.com/office/drawing/2016/ink" xmlns:am3d="http://schemas.microsoft.com/office/drawing/2017/model3d" xmlns:o="urn:schemas-microsoft-com:office:office" xmlns:oel="http://schemas.microsoft.com/office/2019/extlst" xmlns:r="http://schemas.openxmlformats.org/officeDocument/2006/relationships" xmlns:m="http://schemas.openxmlformats.org/officeDocument/2006/math" xmlns:v="urn:schemas-microsoft-com:vml" xmlns:wp14="http://schemas.microsoft.com/office/word/2010/wordprocessingDrawing" xmlns:wp="http://schemas.openxmlformats.org/drawingml/2006/wordprocessingDrawing" xmlns:w10="urn:schemas-microsoft-com:office:word" xmlns:w="http://schemas.openxmlformats.org/wordprocessingml/2006/main" xmlns:w14="http://schemas.microsoft.com/office/word/2010/wordml" xmlns:w15="http://schemas.microsoft.com/office/word/2012/wordml" xmlns:w16cex="http://schemas.microsoft.com/office/word/2018/wordml/cex" xmlns:w16cid="http://schemas.microsoft.com/office/word/2016/wordml/cid" xmlns:w16="http://schemas.microsoft.com/office/word/2018/wordml" xmlns:w16du="http://schemas.microsoft.com/office/word/2023/wordml/word16du" xmlns:w16sdtdh="http://schemas.microsoft.com/office/word/2020/wordml/sdtdatahash" xmlns:w16sdtfl="http://schemas.microsoft.com/office/word/2024/wordml/sdtformatlock" xmlns:w16se="http://schemas.microsoft.com/office/word/2015/wordml/symex" xmlns:wpg="http://schemas.microsoft.com/office/word/2010/wordprocessingGroup" xmlns:wpi="http://schemas.microsoft.com/office/word/2010/wordprocessingInk" xmlns:wne="http://schemas.microsoft.com/office/word/2006/wordml" xmlns:wps="http://schemas.microsoft.com/office/word/2010/wordprocessingShape" mc:Ignorable="w14 w15 w16se w16cid w16 w16cex w16sdtdh w16sdtfl w16du wp14">
   <w:abstractNum w:abstractNumId="0" w15:restartNumberingAfterBreak="0">
     <w:nsid w:val="070452AE"/>
     <w:multiLevelType w:val="multilevel"/>
@@ -10065,207 +9540,8 @@
 </w:numbering>
 </file>
 
-<file path=word\settings.xml><?xml version="1.0" encoding="utf-8"?>
-<w:settings xmlns:mc="http://schemas.openxmlformats.org/markup-compatibility/2006" xmlns:o="urn:schemas-microsoft-com:office:office" xmlns:r="http://schemas.openxmlformats.org/officeDocument/2006/relationships" xmlns:m="http://schemas.openxmlformats.org/officeDocument/2006/math" xmlns:v="urn:schemas-microsoft-com:vml" xmlns:w10="urn:schemas-microsoft-com:office:word" xmlns:w="http://schemas.openxmlformats.org/wordprocessingml/2006/main" xmlns:w14="http://schemas.microsoft.com/office/word/2010/wordml" xmlns:w15="http://schemas.microsoft.com/office/word/2012/wordml" xmlns:w16cex="http://schemas.microsoft.com/office/word/2018/wordml/cex" xmlns:w16cid="http://schemas.microsoft.com/office/word/2016/wordml/cid" xmlns:w16="http://schemas.microsoft.com/office/word/2018/wordml" xmlns:w16sdtdh="http://schemas.microsoft.com/office/word/2020/wordml/sdtdatahash" xmlns:w16se="http://schemas.microsoft.com/office/word/2015/wordml/symex" xmlns:sl="http://schemas.openxmlformats.org/schemaLibrary/2006/main" mc:Ignorable="w14 w15 w16se w16cid w16 w16cex w16sdtdh">
-  <w:zoom w:percent="152"/>
-  <w:defaultTabStop w:val="720"/>
-  <w:drawingGridHorizontalSpacing w:val="110"/>
-  <w:displayHorizontalDrawingGridEvery w:val="2"/>
-  <w:displayVerticalDrawingGridEvery w:val="2"/>
-  <w:characterSpacingControl w:val="doNotCompress"/>
-  <w:hdrShapeDefaults>
-    <o:shapedefaults v:ext="edit" spidmax="2050"/>
-  </w:hdrShapeDefaults>
-  <w:footnotePr>
-    <w:footnote w:id="-1"/>
-    <w:footnote w:id="0"/>
-  </w:footnotePr>
-  <w:endnotePr>
-    <w:endnote w:id="-1"/>
-    <w:endnote w:id="0"/>
-  </w:endnotePr>
-  <w:compat>
-    <w:compatSetting w:name="compatibilityMode" w:uri="http://schemas.microsoft.com/office/word" w:val="15"/>
-    <w:compatSetting w:name="overrideTableStyleFontSizeAndJustification" w:uri="http://schemas.microsoft.com/office/word" w:val="1"/>
-    <w:compatSetting w:name="enableOpenTypeFeatures" w:uri="http://schemas.microsoft.com/office/word" w:val="1"/>
-    <w:compatSetting w:name="doNotFlipMirrorIndents" w:uri="http://schemas.microsoft.com/office/word" w:val="1"/>
-    <w:compatSetting w:name="differentiateMultirowTableHeaders" w:uri="http://schemas.microsoft.com/office/word" w:val="1"/>
-    <w:compatSetting w:name="useWord2013TrackBottomHyphenation" w:uri="http://schemas.microsoft.com/office/word" w:val="0"/>
-  </w:compat>
-  <w:rsids>
-    <w:rsidRoot w:val="00A13FD9"/>
-    <w:rsid w:val="00024473"/>
-    <w:rsid w:val="00037B5B"/>
-    <w:rsid w:val="00081DCC"/>
-    <w:rsid w:val="000872B1"/>
-    <w:rsid w:val="000B0452"/>
-    <w:rsid w:val="000C1102"/>
-    <w:rsid w:val="000C595E"/>
-    <w:rsid w:val="000E57AC"/>
-    <w:rsid w:val="000E76D5"/>
-    <w:rsid w:val="00107866"/>
-    <w:rsid w:val="001269FC"/>
-    <w:rsid w:val="0013131B"/>
-    <w:rsid w:val="00150F0C"/>
-    <w:rsid w:val="00171F7D"/>
-    <w:rsid w:val="00196E03"/>
-    <w:rsid w:val="001B0DDD"/>
-    <w:rsid w:val="001C1884"/>
-    <w:rsid w:val="001C266C"/>
-    <w:rsid w:val="001F2116"/>
-    <w:rsid w:val="00212417"/>
-    <w:rsid w:val="00265E6E"/>
-    <w:rsid w:val="002757AD"/>
-    <w:rsid w:val="00296F47"/>
-    <w:rsid w:val="002D498B"/>
-    <w:rsid w:val="002D587B"/>
-    <w:rsid w:val="002D777D"/>
-    <w:rsid w:val="0030336C"/>
-    <w:rsid w:val="00323755"/>
-    <w:rsid w:val="00345561"/>
-    <w:rsid w:val="00345EA2"/>
-    <w:rsid w:val="003725DF"/>
-    <w:rsid w:val="003941CD"/>
-    <w:rsid w:val="003B38CF"/>
-    <w:rsid w:val="003B5B93"/>
-    <w:rsid w:val="003B7871"/>
-    <w:rsid w:val="003E7BC1"/>
-    <w:rsid w:val="003F5306"/>
-    <w:rsid w:val="00413515"/>
-    <w:rsid w:val="00442AE8"/>
-    <w:rsid w:val="004557A7"/>
-    <w:rsid w:val="004F3F07"/>
-    <w:rsid w:val="00520394"/>
-    <w:rsid w:val="00530ACF"/>
-    <w:rsid w:val="00562BAD"/>
-    <w:rsid w:val="005722F9"/>
-    <w:rsid w:val="00577DA7"/>
-    <w:rsid w:val="00583552"/>
-    <w:rsid w:val="005A129F"/>
-    <w:rsid w:val="005E18F3"/>
-    <w:rsid w:val="00607E0D"/>
-    <w:rsid w:val="006234C9"/>
-    <w:rsid w:val="00623763"/>
-    <w:rsid w:val="0062496C"/>
-    <w:rsid w:val="00625059"/>
-    <w:rsid w:val="006371D0"/>
-    <w:rsid w:val="0064326D"/>
-    <w:rsid w:val="006457E0"/>
-    <w:rsid w:val="00655ABD"/>
-    <w:rsid w:val="006D171D"/>
-    <w:rsid w:val="00767B85"/>
-    <w:rsid w:val="0079414E"/>
-    <w:rsid w:val="00796A23"/>
-    <w:rsid w:val="007A1A4F"/>
-    <w:rsid w:val="007A3D63"/>
-    <w:rsid w:val="007A3DEF"/>
-    <w:rsid w:val="007F3A9E"/>
-    <w:rsid w:val="008159DB"/>
-    <w:rsid w:val="008261EE"/>
-    <w:rsid w:val="00826298"/>
-    <w:rsid w:val="0085632F"/>
-    <w:rsid w:val="008609EA"/>
-    <w:rsid w:val="00876080"/>
-    <w:rsid w:val="00931B5E"/>
-    <w:rsid w:val="00963AE2"/>
-    <w:rsid w:val="00967054"/>
-    <w:rsid w:val="0096705F"/>
-    <w:rsid w:val="009B4B8A"/>
-    <w:rsid w:val="009C10C9"/>
-    <w:rsid w:val="009C5AE5"/>
-    <w:rsid w:val="009C6A54"/>
-    <w:rsid w:val="009D3F00"/>
-    <w:rsid w:val="00A13A75"/>
-    <w:rsid w:val="00A13FD9"/>
-    <w:rsid w:val="00A179E6"/>
-    <w:rsid w:val="00A35F9B"/>
-    <w:rsid w:val="00A45782"/>
-    <w:rsid w:val="00A708F7"/>
-    <w:rsid w:val="00A70B5D"/>
-    <w:rsid w:val="00A769D9"/>
-    <w:rsid w:val="00AC387A"/>
-    <w:rsid w:val="00AC7927"/>
-    <w:rsid w:val="00AD0FE5"/>
-    <w:rsid w:val="00B104BA"/>
-    <w:rsid w:val="00B11DB7"/>
-    <w:rsid w:val="00B37D2C"/>
-    <w:rsid w:val="00B451AB"/>
-    <w:rsid w:val="00B46CE2"/>
-    <w:rsid w:val="00B97CF1"/>
-    <w:rsid w:val="00BD4A39"/>
-    <w:rsid w:val="00BE402D"/>
-    <w:rsid w:val="00C56FFA"/>
-    <w:rsid w:val="00C70D38"/>
-    <w:rsid w:val="00C73D7D"/>
-    <w:rsid w:val="00C86ED2"/>
-    <w:rsid w:val="00C930E7"/>
-    <w:rsid w:val="00C95D25"/>
-    <w:rsid w:val="00C97654"/>
-    <w:rsid w:val="00CD79DF"/>
-    <w:rsid w:val="00CE04DC"/>
-    <w:rsid w:val="00CE5F1A"/>
-    <w:rsid w:val="00D036C9"/>
-    <w:rsid w:val="00D3191B"/>
-    <w:rsid w:val="00D42DFA"/>
-    <w:rsid w:val="00D43244"/>
-    <w:rsid w:val="00D74067"/>
-    <w:rsid w:val="00D811A2"/>
-    <w:rsid w:val="00D82A19"/>
-    <w:rsid w:val="00D9009D"/>
-    <w:rsid w:val="00DB5802"/>
-    <w:rsid w:val="00DB7E0E"/>
-    <w:rsid w:val="00DC43C6"/>
-    <w:rsid w:val="00DD2F5A"/>
-    <w:rsid w:val="00DD499C"/>
-    <w:rsid w:val="00E06B27"/>
-    <w:rsid w:val="00E22A0C"/>
-    <w:rsid w:val="00E27EA2"/>
-    <w:rsid w:val="00E34256"/>
-    <w:rsid w:val="00E77F45"/>
-    <w:rsid w:val="00E84117"/>
-    <w:rsid w:val="00ED6FC4"/>
-    <w:rsid w:val="00F13D1D"/>
-    <w:rsid w:val="00F22A18"/>
-    <w:rsid w:val="00F51FF4"/>
-    <w:rsid w:val="00F93949"/>
-    <w:rsid w:val="00F93C9E"/>
-    <w:rsid w:val="00FA47CC"/>
-    <w:rsid w:val="00FB2EBE"/>
-    <w:rsid w:val="00FC0B63"/>
-    <w:rsid w:val="00FC66EC"/>
-    <w:rsid w:val="00FD202B"/>
-  </w:rsids>
-  <m:mathPr>
-    <m:mathFont m:val="Cambria Math"/>
-    <m:brkBin m:val="before"/>
-    <m:brkBinSub m:val="--"/>
-    <m:smallFrac m:val="0"/>
-    <m:dispDef/>
-    <m:lMargin m:val="0"/>
-    <m:rMargin m:val="0"/>
-    <m:defJc m:val="centerGroup"/>
-    <m:wrapIndent m:val="1440"/>
-    <m:intLim m:val="subSup"/>
-    <m:naryLim m:val="undOvr"/>
-  </m:mathPr>
-  <w:themeFontLang w:val="en-VN"/>
-  <w:clrSchemeMapping w:bg1="light1" w:t1="dark1" w:bg2="light2" w:t2="dark2" w:accent1="accent1" w:accent2="accent2" w:accent3="accent3" w:accent4="accent4" w:accent5="accent5" w:accent6="accent6" w:hyperlink="hyperlink" w:followedHyperlink="followedHyperlink"/>
-  <w:shapeDefaults>
-    <o:shapedefaults v:ext="edit" spidmax="2050"/>
-    <o:shapelayout v:ext="edit">
-      <o:idmap v:ext="edit" data="2"/>
-    </o:shapelayout>
-  </w:shapeDefaults>
-  <w:decimalSymbol w:val="."/>
-  <w:listSeparator w:val=","/>
-  <w14:docId w14:val="2090C8D1"/>
-  <w15:chartTrackingRefBased/>
-  <w15:docId w15:val="{CF374CFA-30F1-3E46-AA65-F03F80DB9E66}"/>
-</w:settings>
-</file>
-
-<file path=word\styles.xml><?xml version="1.0" encoding="utf-8"?>
-<w:styles xmlns:mc="http://schemas.openxmlformats.org/markup-compatibility/2006" xmlns:r="http://schemas.openxmlformats.org/officeDocument/2006/relationships" xmlns:w="http://schemas.openxmlformats.org/wordprocessingml/2006/main" xmlns:w14="http://schemas.microsoft.com/office/word/2010/wordml" xmlns:w15="http://schemas.microsoft.com/office/word/2012/wordml" xmlns:w16cex="http://schemas.microsoft.com/office/word/2018/wordml/cex" xmlns:w16cid="http://schemas.microsoft.com/office/word/2016/wordml/cid" xmlns:w16="http://schemas.microsoft.com/office/word/2018/wordml" xmlns:w16sdtdh="http://schemas.microsoft.com/office/word/2020/wordml/sdtdatahash" xmlns:w16se="http://schemas.microsoft.com/office/word/2015/wordml/symex" mc:Ignorable="w14 w15 w16se w16cid w16 w16cex w16sdtdh">
+<file path=word/styles.xml><?xml version="1.0" encoding="utf-8"?>
+<w:styles xmlns:mc="http://schemas.openxmlformats.org/markup-compatibility/2006" xmlns:r="http://schemas.openxmlformats.org/officeDocument/2006/relationships" xmlns:w="http://schemas.openxmlformats.org/wordprocessingml/2006/main" xmlns:w14="http://schemas.microsoft.com/office/word/2010/wordml" xmlns:w15="http://schemas.microsoft.com/office/word/2012/wordml" xmlns:w16cex="http://schemas.microsoft.com/office/word/2018/wordml/cex" xmlns:w16cid="http://schemas.microsoft.com/office/word/2016/wordml/cid" xmlns:w16="http://schemas.microsoft.com/office/word/2018/wordml" xmlns:w16du="http://schemas.microsoft.com/office/word/2023/wordml/word16du" xmlns:w16sdtdh="http://schemas.microsoft.com/office/word/2020/wordml/sdtdatahash" xmlns:w16sdtfl="http://schemas.microsoft.com/office/word/2024/wordml/sdtformatlock" xmlns:w16se="http://schemas.microsoft.com/office/word/2015/wordml/symex" mc:Ignorable="w14 w15 w16se w16cid w16 w16cex w16sdtdh w16sdtfl w16du">
   <w:docDefaults>
     <w:rPrDefault>
       <w:rPr>
@@ -10274,7 +9550,7 @@
         <w:kern w:val="2"/>
         <w:sz w:val="26"/>
         <w:szCs w:val="24"/>
-        <w:lang w:val="en-VN" w:eastAsia="en-US" w:bidi="ar-SA"/>
+        <w:lang w:eastAsia="en-US" w:bidi="ar-SA"/>
         <w14:ligatures w14:val="standardContextual"/>
       </w:rPr>
     </w:rPrDefault>
@@ -11537,13 +10813,13 @@
       <w:rFonts w:eastAsia="Times New Roman" w:cs="Times New Roman"/>
       <w:sz w:val="24"/>
       <w:szCs w:val="24"/>
-      <w:lang w:val="en-VN"/>
+      <w:lang/>
     </w:rPr>
   </w:style>
 </w:styles>
 </file>
 
-<file path=word\theme\theme1.xml><?xml version="1.0" encoding="utf-8"?>
+<file path=word/theme/theme1.xml><?xml version="1.0" encoding="utf-8"?>
 <a:theme xmlns:a="http://schemas.openxmlformats.org/drawingml/2006/main" name="Office Theme">
   <a:themeElements>
     <a:clrScheme name="Office">
@@ -11838,66 +11114,14 @@
 </a:theme>
 </file>
 
-<file path=word\webSettings.xml><?xml version="1.0" encoding="utf-8"?>
-<w:webSettings xmlns:mc="http://schemas.openxmlformats.org/markup-compatibility/2006" xmlns:r="http://schemas.openxmlformats.org/officeDocument/2006/relationships" xmlns:w="http://schemas.openxmlformats.org/wordprocessingml/2006/main" xmlns:w14="http://schemas.microsoft.com/office/word/2010/wordml" xmlns:w15="http://schemas.microsoft.com/office/word/2012/wordml" xmlns:w16cex="http://schemas.microsoft.com/office/word/2018/wordml/cex" xmlns:w16cid="http://schemas.microsoft.com/office/word/2016/wordml/cid" xmlns:w16="http://schemas.microsoft.com/office/word/2018/wordml" xmlns:w16sdtdh="http://schemas.microsoft.com/office/word/2020/wordml/sdtdatahash" xmlns:w16se="http://schemas.microsoft.com/office/word/2015/wordml/symex" mc:Ignorable="w14 w15 w16se w16cid w16 w16cex w16sdtdh">
-  <w:divs>
-    <w:div w:id="1236208726">
-      <w:bodyDiv w:val="1"/>
-      <w:marLeft w:val="0"/>
-      <w:marRight w:val="0"/>
-      <w:marTop w:val="0"/>
-      <w:marBottom w:val="0"/>
-      <w:divBdr>
-        <w:top w:val="none" w:sz="0" w:space="0" w:color="auto"/>
-        <w:left w:val="none" w:sz="0" w:space="0" w:color="auto"/>
-        <w:bottom w:val="none" w:sz="0" w:space="0" w:color="auto"/>
-        <w:right w:val="none" w:sz="0" w:space="0" w:color="auto"/>
-      </w:divBdr>
-      <w:divsChild>
-        <w:div w:id="1719010843">
-          <w:marLeft w:val="0"/>
-          <w:marRight w:val="0"/>
-          <w:marTop w:val="0"/>
-          <w:marBottom w:val="0"/>
-          <w:divBdr>
-            <w:top w:val="none" w:sz="0" w:space="0" w:color="auto"/>
-            <w:left w:val="none" w:sz="0" w:space="0" w:color="auto"/>
-            <w:bottom w:val="none" w:sz="0" w:space="0" w:color="auto"/>
-            <w:right w:val="none" w:sz="0" w:space="0" w:color="auto"/>
-          </w:divBdr>
-          <w:divsChild>
-            <w:div w:id="1041828147">
-              <w:marLeft w:val="0"/>
-              <w:marRight w:val="0"/>
-              <w:marTop w:val="0"/>
-              <w:marBottom w:val="0"/>
-              <w:divBdr>
-                <w:top w:val="none" w:sz="0" w:space="0" w:color="auto"/>
-                <w:left w:val="none" w:sz="0" w:space="0" w:color="auto"/>
-                <w:bottom w:val="none" w:sz="0" w:space="0" w:color="auto"/>
-                <w:right w:val="none" w:sz="0" w:space="0" w:color="auto"/>
-              </w:divBdr>
-              <w:divsChild>
-                <w:div w:id="425348063">
-                  <w:marLeft w:val="0"/>
-                  <w:marRight w:val="0"/>
-                  <w:marTop w:val="0"/>
-                  <w:marBottom w:val="0"/>
-                  <w:divBdr>
-                    <w:top w:val="none" w:sz="0" w:space="0" w:color="auto"/>
-                    <w:left w:val="none" w:sz="0" w:space="0" w:color="auto"/>
-                    <w:bottom w:val="none" w:sz="0" w:space="0" w:color="auto"/>
-                    <w:right w:val="none" w:sz="0" w:space="0" w:color="auto"/>
-                  </w:divBdr>
-                </w:div>
-              </w:divsChild>
-            </w:div>
-          </w:divsChild>
-        </w:div>
-      </w:divsChild>
-    </w:div>
-  </w:divs>
-  <w:optimizeForBrowser/>
-  <w:allowPNG/>
-</w:webSettings>
+<file path=customXml/item1.xml><?xml version="1.0" encoding="utf-8"?>
+<b:Sources xmlns:b="http://schemas.openxmlformats.org/officeDocument/2006/bibliography" xmlns="http://schemas.openxmlformats.org/officeDocument/2006/bibliography" SelectedStyle="/APASixthEditionOfficeOnline.xsl" StyleName="APA" Version="6"/>
+</file>
+
+<file path=customXml/itemProps1.xml><?xml version="1.0" encoding="utf-8"?>
+<ds:datastoreItem xmlns:ds="http://schemas.openxmlformats.org/officeDocument/2006/customXml" ds:itemID="{4B7C3B75-6202-F241-B286-EFD9F064274F}">
+  <ds:schemaRefs>
+    <ds:schemaRef ds:uri="http://schemas.openxmlformats.org/officeDocument/2006/bibliography"/>
+  </ds:schemaRefs>
+</ds:datastoreItem>
 </file>
</xml_diff>

<commit_message>
feat: implement result entry UI with draft saving, version history restoration, and report publishing functionality
</commit_message>
<xml_diff>
--- a/FILEBIEUMAUGOC/filebieumau_FORM_TRANG4.docx
+++ b/FILEBIEUMAUGOC/filebieumau_FORM_TRANG4.docx
@@ -91,11 +91,15 @@
     </w:p>
     <w:p>
       <w:pPr>
-        <w:spacing w:after="120" w:line="276" w:lineRule="auto"/>
+        <w:tabs>
+          <w:tab w:val="right" w:pos="9923"/>
+        </w:tabs>
+        <w:spacing w:line="276" w:lineRule="auto"/>
         <w:jc w:val="left"/>
         <w:rPr>
           <w:rFonts w:eastAsia="Arial"/>
-          <w:szCs w:val="26"/>
+          <w:sz w:val="24"/>
+          <w:szCs w:val="24"/>
         </w:rPr>
       </w:pPr>
       <w:r>
@@ -109,47 +113,7 @@
       <w:r>
         <w:rPr>
           <w:rFonts w:eastAsia="Arial"/>
-          <w:szCs w:val="26"/>
-          <w:u w:val="single"/>
-        </w:rPr>
-        <w:t xml:space="preserve"> </w:t>
-      </w:r>
-      <w:r>
-        <w:rPr>
-          <w:rFonts w:eastAsia="Arial"/>
-          <w:szCs w:val="26"/>
-          <w:u w:val="single"/>
-        </w:rPr>
-        <w:tab/>
-      </w:r>
-      <w:r>
-        <w:rPr>
-          <w:rFonts w:eastAsia="Arial"/>
-          <w:szCs w:val="26"/>
-          <w:u w:val="single"/>
-        </w:rPr>
-        <w:tab/>
-      </w:r>
-      <w:r>
-        <w:rPr>
-          <w:rFonts w:eastAsia="Arial"/>
-          <w:szCs w:val="26"/>
-          <w:u w:val="single"/>
-        </w:rPr>
-        <w:tab/>
-        <w:t xml:space="preserve">     </w:t>
-      </w:r>
-      <w:r>
-        <w:rPr>
-          <w:rFonts w:eastAsia="Arial"/>
-          <w:szCs w:val="26"/>
-          <w:u w:val="single"/>
-        </w:rPr>
-        <w:t xml:space="preserve">             </w:t>
-      </w:r>
-      <w:r>
-        <w:rPr>
-          <w:rFonts w:eastAsia="Arial"/>
+          <w:b/>
           <w:szCs w:val="26"/>
         </w:rPr>
         <w:t xml:space="preserve"> </w:t>
@@ -159,7 +123,7 @@
           <w:rFonts w:eastAsia="Arial"/>
           <w:szCs w:val="26"/>
         </w:rPr>
-        <w:t xml:space="preserve"> </w:t>
+        <w:tab/>
       </w:r>
       <w:r>
         <w:rPr>
@@ -208,20 +172,19 @@
         </w:rPr>
         <w:t>10.0 ;..…..</w:t>
       </w:r>
-      <w:r>
+    </w:p>
+    <w:p>
+      <w:pPr>
+        <w:tabs>
+          <w:tab w:val="right" w:leader="dot" w:pos="9923"/>
+        </w:tabs>
+        <w:spacing w:line="276" w:lineRule="auto"/>
+        <w:jc w:val="left"/>
         <w:rPr>
           <w:rFonts w:eastAsia="Arial"/>
           <w:szCs w:val="26"/>
         </w:rPr>
-        <w:t xml:space="preserve">                    </w:t>
-      </w:r>
-      <w:r>
-        <w:rPr>
-          <w:rFonts w:eastAsia="Arial"/>
-          <w:szCs w:val="26"/>
-        </w:rPr>
-        <w:t xml:space="preserve"> </w:t>
-      </w:r>
+      </w:pPr>
       <w:r>
         <w:rPr>
           <w:rFonts w:eastAsia="Arial"/>
@@ -295,34 +258,23 @@
           <w:rFonts w:eastAsia="Arial"/>
           <w:szCs w:val="26"/>
         </w:rPr>
-        <w:t>Khác:……………</w:t>
+        <w:t>Khác:</w:t>
       </w:r>
       <w:r>
         <w:rPr>
           <w:rFonts w:eastAsia="Arial"/>
           <w:szCs w:val="26"/>
         </w:rPr>
-        <w:t>…</w:t>
-      </w:r>
-      <w:r>
-        <w:rPr>
-          <w:rFonts w:eastAsia="Arial"/>
-          <w:szCs w:val="26"/>
-          <w:u w:val="single"/>
-        </w:rPr>
-        <w:t xml:space="preserve">            </w:t>
-      </w:r>
-      <w:r>
-        <w:rPr>
-          <w:rFonts w:eastAsia="Arial"/>
-          <w:szCs w:val="26"/>
-        </w:rPr>
-        <w:t xml:space="preserve">   </w:t>
+        <w:tab/>
       </w:r>
     </w:p>
     <w:p>
       <w:pPr>
-        <w:spacing w:after="120" w:line="276" w:lineRule="auto"/>
+        <w:tabs>
+          <w:tab w:val="left" w:pos="4253"/>
+          <w:tab w:val="center" w:leader="dot" w:pos="9923"/>
+        </w:tabs>
+        <w:spacing w:line="276" w:lineRule="auto"/>
         <w:jc w:val="left"/>
         <w:rPr>
           <w:rFonts w:eastAsia="Arial"/>
@@ -336,6 +288,29 @@
           <w:szCs w:val="26"/>
         </w:rPr>
         <w:t>4. Tình trạng mẫu:</w:t>
+      </w:r>
+      <w:r>
+        <w:rPr>
+          <w:rFonts w:eastAsia="Arial"/>
+          <w:b/>
+          <w:szCs w:val="26"/>
+        </w:rPr>
+        <w:t xml:space="preserve"> </w:t>
+      </w:r>
+      <w:r>
+        <w:rPr>
+          <w:rFonts w:eastAsia="Arial"/>
+          <w:sz w:val="38"/>
+          <w:szCs w:val="26"/>
+        </w:rPr>
+        <w:t xml:space="preserve">□ </w:t>
+      </w:r>
+      <w:r>
+        <w:rPr>
+          <w:rFonts w:eastAsia="Arial"/>
+          <w:szCs w:val="26"/>
+        </w:rPr>
+        <w:t>Bình thường;</w:t>
       </w:r>
       <w:r>
         <w:rPr>
@@ -357,7 +332,7 @@
           <w:rFonts w:eastAsia="Arial"/>
           <w:szCs w:val="26"/>
         </w:rPr>
-        <w:t xml:space="preserve">Bình thường; </w:t>
+        <w:t xml:space="preserve">Khác: </w:t>
       </w:r>
       <w:r>
         <w:rPr>
@@ -366,32 +341,10 @@
         </w:rPr>
         <w:tab/>
       </w:r>
-      <w:r>
-        <w:rPr>
-          <w:rFonts w:eastAsia="Arial"/>
-          <w:sz w:val="38"/>
-          <w:szCs w:val="26"/>
-        </w:rPr>
-        <w:t xml:space="preserve">□ </w:t>
-      </w:r>
-      <w:r>
-        <w:rPr>
-          <w:rFonts w:eastAsia="Arial"/>
-          <w:szCs w:val="26"/>
-        </w:rPr>
-        <w:t>Khác: ……………………………………</w:t>
-      </w:r>
-      <w:r>
-        <w:rPr>
-          <w:rFonts w:eastAsia="Arial"/>
-          <w:szCs w:val="26"/>
-        </w:rPr>
-        <w:t>….</w:t>
-      </w:r>
     </w:p>
     <w:p>
       <w:pPr>
-        <w:spacing w:after="120" w:line="276" w:lineRule="auto"/>
+        <w:spacing w:line="276" w:lineRule="auto"/>
         <w:jc w:val="left"/>
         <w:rPr>
           <w:rFonts w:eastAsia="Arial" w:cs="Times New Roman"/>
@@ -2979,82 +2932,92 @@
     </w:p>
     <w:p>
       <w:pPr>
-        <w:spacing w:after="200" w:line="276" w:lineRule="auto"/>
-        <w:jc w:val="center"/>
+        <w:tabs>
+          <w:tab w:val="center" w:pos="1701"/>
+          <w:tab w:val="center" w:pos="8222"/>
+        </w:tabs>
+        <w:spacing w:line="240" w:lineRule="auto"/>
         <w:rPr>
-          <w:rFonts w:eastAsia="Arial" w:cs="Times New Roman"/>
           <w:b/>
-          <w:szCs w:val="26"/>
+          <w:bCs/>
         </w:rPr>
       </w:pPr>
       <w:r>
         <w:rPr>
-          <w:rFonts w:eastAsia="Arial" w:cs="Times New Roman"/>
           <w:b/>
-          <w:szCs w:val="26"/>
+          <w:bCs/>
+        </w:rPr>
+        <w:tab/>
+      </w:r>
+      <w:r>
+        <w:rPr>
+          <w:b/>
+          <w:bCs/>
         </w:rPr>
         <w:t>Ngày/ Người phân tích</w:t>
       </w:r>
       <w:r>
         <w:rPr>
-          <w:rFonts w:eastAsia="Arial" w:cs="Times New Roman"/>
           <w:b/>
-          <w:szCs w:val="26"/>
+          <w:bCs/>
         </w:rPr>
         <w:tab/>
       </w:r>
       <w:r>
         <w:rPr>
-          <w:rFonts w:eastAsia="Arial" w:cs="Times New Roman"/>
           <w:b/>
-          <w:szCs w:val="26"/>
+          <w:bCs/>
         </w:rPr>
-        <w:tab/>
-      </w:r>
-      <w:r>
-        <w:rPr>
-          <w:rFonts w:eastAsia="Arial" w:cs="Times New Roman"/>
-          <w:b/>
-          <w:szCs w:val="26"/>
-        </w:rPr>
-        <w:tab/>
-      </w:r>
-      <w:r>
-        <w:rPr>
-          <w:rFonts w:eastAsia="Arial" w:cs="Times New Roman"/>
-          <w:b/>
-          <w:szCs w:val="26"/>
-        </w:rPr>
-        <w:tab/>
-      </w:r>
-      <w:r>
-        <w:rPr>
-          <w:rFonts w:eastAsia="Arial" w:cs="Times New Roman"/>
-          <w:b/>
-          <w:szCs w:val="26"/>
-        </w:rPr>
-        <w:tab/>
-        <w:t xml:space="preserve">            Ngày/ Người thẩm tra</w:t>
+        <w:t>Ngày/ Người thẩm tra</w:t>
       </w:r>
     </w:p>
     <w:p>
       <w:pPr>
+        <w:tabs>
+          <w:tab w:val="center" w:pos="1843"/>
+          <w:tab w:val="center" w:pos="8222"/>
+        </w:tabs>
+        <w:spacing w:line="240" w:lineRule="auto"/>
+        <w:rPr>
+          <w:b/>
+          <w:bCs/>
+        </w:rPr>
         <w:sectPr>
           <w:headerReference w:type="default" r:id="rId8"/>
           <w:footerReference w:type="default" r:id="rId9"/>
+          <w:headerReference w:type="first" r:id="rId10"/>
+          <w:footerReference w:type="first" r:id="rId11"/>
           <w:pgSz w:w="11909" w:h="16834" w:code="9"/>
           <w:pgMar w:top="851" w:right="851" w:bottom="851" w:left="1134" w:header="720" w:footer="720" w:gutter="0"/>
           <w:cols w:space="708"/>
           <w:docGrid w:linePitch="360"/>
         </w:sectPr>
       </w:pPr>
+      <w:r>
+        <w:tab/>
+      </w:r>
+      <w:r>
+        <w:rPr>
+          <w:b/>
+          <w:bCs/>
+        </w:rPr>
+        <w:t>date1</w:t>
+      </w:r>
+      <w:r>
+        <w:rPr>
+          <w:b/>
+          <w:bCs/>
+        </w:rPr>
+        <w:tab/>
+        <w:t>date2</w:t>
+      </w:r>
     </w:p>
     <w:p>
       <w:pPr>
         <w:tabs>
           <w:tab w:val="left" w:pos="8205"/>
         </w:tabs>
-        <w:spacing w:after="200" w:line="276" w:lineRule="auto"/>
+        <w:spacing w:line="276" w:lineRule="auto"/>
         <w:jc w:val="left"/>
         <w:rPr>
           <w:rFonts w:eastAsia="Calibri"/>
@@ -7817,7 +7780,7 @@
     </w:tbl>
     <w:p>
       <w:pPr>
-        <w:spacing w:before="60" w:after="60" w:line="240" w:lineRule="auto"/>
+        <w:spacing w:line="240" w:lineRule="auto"/>
         <w:jc w:val="left"/>
         <w:rPr>
           <w:rFonts w:eastAsia="Calibri"/>
@@ -7826,8 +7789,8 @@
       </w:pPr>
     </w:p>
     <w:sectPr>
-      <w:headerReference w:type="default" r:id="rId10"/>
-      <w:footerReference w:type="default" r:id="rId11"/>
+      <w:headerReference w:type="default" r:id="rId12"/>
+      <w:footerReference w:type="default" r:id="rId13"/>
       <w:pgSz w:w="11906" w:h="16838" w:code="9"/>
       <w:pgMar w:top="1134" w:right="849" w:bottom="1134" w:left="1134" w:header="709" w:footer="709" w:gutter="0"/>
       <w:cols w:space="487"/>
@@ -7941,6 +7904,44 @@
 </w:ftr>
 </file>
 
+<file path=word/footer3.xml><?xml version="1.0" encoding="utf-8"?>
+<w:ftr xmlns:wpc="http://schemas.microsoft.com/office/word/2010/wordprocessingCanvas" xmlns:cx="http://schemas.microsoft.com/office/drawing/2014/chartex" xmlns:cx1="http://schemas.microsoft.com/office/drawing/2015/9/8/chartex" xmlns:cx2="http://schemas.microsoft.com/office/drawing/2015/10/21/chartex" xmlns:cx3="http://schemas.microsoft.com/office/drawing/2016/5/9/chartex" xmlns:cx4="http://schemas.microsoft.com/office/drawing/2016/5/10/chartex" xmlns:cx5="http://schemas.microsoft.com/office/drawing/2016/5/11/chartex" xmlns:cx6="http://schemas.microsoft.com/office/drawing/2016/5/12/chartex" xmlns:cx7="http://schemas.microsoft.com/office/drawing/2016/5/13/chartex" xmlns:cx8="http://schemas.microsoft.com/office/drawing/2016/5/14/chartex" xmlns:mc="http://schemas.openxmlformats.org/markup-compatibility/2006" xmlns:aink="http://schemas.microsoft.com/office/drawing/2016/ink" xmlns:am3d="http://schemas.microsoft.com/office/drawing/2017/model3d" xmlns:o="urn:schemas-microsoft-com:office:office" xmlns:oel="http://schemas.microsoft.com/office/2019/extlst" xmlns:r="http://schemas.openxmlformats.org/officeDocument/2006/relationships" xmlns:m="http://schemas.openxmlformats.org/officeDocument/2006/math" xmlns:v="urn:schemas-microsoft-com:vml" xmlns:wp14="http://schemas.microsoft.com/office/word/2010/wordprocessingDrawing" xmlns:wp="http://schemas.openxmlformats.org/drawingml/2006/wordprocessingDrawing" xmlns:w10="urn:schemas-microsoft-com:office:word" xmlns:w="http://schemas.openxmlformats.org/wordprocessingml/2006/main" xmlns:w14="http://schemas.microsoft.com/office/word/2010/wordml" xmlns:w15="http://schemas.microsoft.com/office/word/2012/wordml" xmlns:w16cex="http://schemas.microsoft.com/office/word/2018/wordml/cex" xmlns:w16cid="http://schemas.microsoft.com/office/word/2016/wordml/cid" xmlns:w16="http://schemas.microsoft.com/office/word/2018/wordml" xmlns:w16du="http://schemas.microsoft.com/office/word/2023/wordml/word16du" xmlns:w16sdtdh="http://schemas.microsoft.com/office/word/2020/wordml/sdtdatahash" xmlns:w16sdtfl="http://schemas.microsoft.com/office/word/2024/wordml/sdtformatlock" xmlns:w16se="http://schemas.microsoft.com/office/word/2015/wordml/symex" xmlns:wpg="http://schemas.microsoft.com/office/word/2010/wordprocessingGroup" xmlns:wpi="http://schemas.microsoft.com/office/word/2010/wordprocessingInk" xmlns:wne="http://schemas.microsoft.com/office/word/2006/wordml" xmlns:wps="http://schemas.microsoft.com/office/word/2010/wordprocessingShape" mc:Ignorable="w14 w15 w16se w16cid w16 w16cex w16sdtdh w16sdtfl w16du wp14">
+  <w:p>
+    <w:pPr>
+      <w:pStyle w:val="Footer"/>
+      <w:pBdr>
+        <w:bottom w:val="single" w:sz="6" w:space="1" w:color="auto"/>
+      </w:pBdr>
+      <w:tabs>
+        <w:tab w:val="clear" w:pos="9360"/>
+        <w:tab w:val="right" w:pos="9184"/>
+      </w:tabs>
+    </w:pPr>
+  </w:p>
+  <w:p>
+    <w:pPr>
+      <w:pStyle w:val="Footer"/>
+      <w:tabs>
+        <w:tab w:val="clear" w:pos="9360"/>
+        <w:tab w:val="left" w:pos="142"/>
+        <w:tab w:val="right" w:pos="9781"/>
+      </w:tabs>
+    </w:pPr>
+    <w:r>
+      <w:tab/>
+      <w:t>Lần ban hành: 04</w:t>
+    </w:r>
+    <w:r>
+      <w:tab/>
+    </w:r>
+    <w:r>
+      <w:tab/>
+      <w:t>Ngày có hiệu lực: 01.05.2024</w:t>
+    </w:r>
+  </w:p>
+</w:ftr>
+</file>
+
 <file path=word/footnotes.xml><?xml version="1.0" encoding="utf-8"?>
 <w:footnotes xmlns:wpc="http://schemas.microsoft.com/office/word/2010/wordprocessingCanvas" xmlns:cx="http://schemas.microsoft.com/office/drawing/2014/chartex" xmlns:cx1="http://schemas.microsoft.com/office/drawing/2015/9/8/chartex" xmlns:cx2="http://schemas.microsoft.com/office/drawing/2015/10/21/chartex" xmlns:cx3="http://schemas.microsoft.com/office/drawing/2016/5/9/chartex" xmlns:cx4="http://schemas.microsoft.com/office/drawing/2016/5/10/chartex" xmlns:cx5="http://schemas.microsoft.com/office/drawing/2016/5/11/chartex" xmlns:cx6="http://schemas.microsoft.com/office/drawing/2016/5/12/chartex" xmlns:cx7="http://schemas.microsoft.com/office/drawing/2016/5/13/chartex" xmlns:cx8="http://schemas.microsoft.com/office/drawing/2016/5/14/chartex" xmlns:mc="http://schemas.openxmlformats.org/markup-compatibility/2006" xmlns:aink="http://schemas.microsoft.com/office/drawing/2016/ink" xmlns:am3d="http://schemas.microsoft.com/office/drawing/2017/model3d" xmlns:o="urn:schemas-microsoft-com:office:office" xmlns:oel="http://schemas.microsoft.com/office/2019/extlst" xmlns:r="http://schemas.openxmlformats.org/officeDocument/2006/relationships" xmlns:m="http://schemas.openxmlformats.org/officeDocument/2006/math" xmlns:v="urn:schemas-microsoft-com:vml" xmlns:wp14="http://schemas.microsoft.com/office/word/2010/wordprocessingDrawing" xmlns:wp="http://schemas.openxmlformats.org/drawingml/2006/wordprocessingDrawing" xmlns:w10="urn:schemas-microsoft-com:office:word" xmlns:w="http://schemas.openxmlformats.org/wordprocessingml/2006/main" xmlns:w14="http://schemas.microsoft.com/office/word/2010/wordml" xmlns:w15="http://schemas.microsoft.com/office/word/2012/wordml" xmlns:w16cex="http://schemas.microsoft.com/office/word/2018/wordml/cex" xmlns:w16cid="http://schemas.microsoft.com/office/word/2016/wordml/cid" xmlns:w16="http://schemas.microsoft.com/office/word/2018/wordml" xmlns:w16du="http://schemas.microsoft.com/office/word/2023/wordml/word16du" xmlns:w16sdtdh="http://schemas.microsoft.com/office/word/2020/wordml/sdtdatahash" xmlns:w16sdtfl="http://schemas.microsoft.com/office/word/2024/wordml/sdtformatlock" xmlns:w16se="http://schemas.microsoft.com/office/word/2015/wordml/symex" xmlns:wpg="http://schemas.microsoft.com/office/word/2010/wordprocessingGroup" xmlns:wpi="http://schemas.microsoft.com/office/word/2010/wordprocessingInk" xmlns:wne="http://schemas.microsoft.com/office/word/2006/wordml" xmlns:wps="http://schemas.microsoft.com/office/word/2010/wordprocessingShape" mc:Ignorable="w14 w15 w16se w16cid w16 w16cex w16sdtdh w16sdtfl w16du wp14">
   <w:footnote w:type="separator" w:id="-1">
@@ -8001,19 +8002,7 @@
       <w:t xml:space="preserve">Trang: </w:t>
     </w:r>
     <w:r>
-      <w:fldChar w:fldCharType="begin"/>
-    </w:r>
-    <w:r>
-      <w:instrText xml:space="preserve"> PAGE </w:instrText>
-    </w:r>
-    <w:r>
-      <w:fldChar w:fldCharType="separate"/>
-    </w:r>
-    <w:r>
-      <w:t>1</w:t>
-    </w:r>
-    <w:r>
-      <w:fldChar w:fldCharType="end"/>
+      <w:t>7</w:t>
     </w:r>
     <w:r>
       <w:t>/</w:t>
@@ -8022,16 +8011,49 @@
       <w:t>12</w:t>
     </w:r>
   </w:p>
+</w:hdr>
+</file>
+
+<file path=word/header2.xml><?xml version="1.0" encoding="utf-8"?>
+<w:hdr xmlns:wpc="http://schemas.microsoft.com/office/word/2010/wordprocessingCanvas" xmlns:cx="http://schemas.microsoft.com/office/drawing/2014/chartex" xmlns:cx1="http://schemas.microsoft.com/office/drawing/2015/9/8/chartex" xmlns:cx2="http://schemas.microsoft.com/office/drawing/2015/10/21/chartex" xmlns:cx3="http://schemas.microsoft.com/office/drawing/2016/5/9/chartex" xmlns:cx4="http://schemas.microsoft.com/office/drawing/2016/5/10/chartex" xmlns:cx5="http://schemas.microsoft.com/office/drawing/2016/5/11/chartex" xmlns:cx6="http://schemas.microsoft.com/office/drawing/2016/5/12/chartex" xmlns:cx7="http://schemas.microsoft.com/office/drawing/2016/5/13/chartex" xmlns:cx8="http://schemas.microsoft.com/office/drawing/2016/5/14/chartex" xmlns:mc="http://schemas.openxmlformats.org/markup-compatibility/2006" xmlns:aink="http://schemas.microsoft.com/office/drawing/2016/ink" xmlns:am3d="http://schemas.microsoft.com/office/drawing/2017/model3d" xmlns:o="urn:schemas-microsoft-com:office:office" xmlns:oel="http://schemas.microsoft.com/office/2019/extlst" xmlns:r="http://schemas.openxmlformats.org/officeDocument/2006/relationships" xmlns:m="http://schemas.openxmlformats.org/officeDocument/2006/math" xmlns:v="urn:schemas-microsoft-com:vml" xmlns:wp14="http://schemas.microsoft.com/office/word/2010/wordprocessingDrawing" xmlns:wp="http://schemas.openxmlformats.org/drawingml/2006/wordprocessingDrawing" xmlns:w10="urn:schemas-microsoft-com:office:word" xmlns:w="http://schemas.openxmlformats.org/wordprocessingml/2006/main" xmlns:w14="http://schemas.microsoft.com/office/word/2010/wordml" xmlns:w15="http://schemas.microsoft.com/office/word/2012/wordml" xmlns:w16cex="http://schemas.microsoft.com/office/word/2018/wordml/cex" xmlns:w16cid="http://schemas.microsoft.com/office/word/2016/wordml/cid" xmlns:w16="http://schemas.microsoft.com/office/word/2018/wordml" xmlns:w16du="http://schemas.microsoft.com/office/word/2023/wordml/word16du" xmlns:w16sdtdh="http://schemas.microsoft.com/office/word/2020/wordml/sdtdatahash" xmlns:w16sdtfl="http://schemas.microsoft.com/office/word/2024/wordml/sdtformatlock" xmlns:w16se="http://schemas.microsoft.com/office/word/2015/wordml/symex" xmlns:wpg="http://schemas.microsoft.com/office/word/2010/wordprocessingGroup" xmlns:wpi="http://schemas.microsoft.com/office/word/2010/wordprocessingInk" xmlns:wne="http://schemas.microsoft.com/office/word/2006/wordml" xmlns:wps="http://schemas.microsoft.com/office/word/2010/wordprocessingShape" mc:Ignorable="w14 w15 w16se w16cid w16 w16cex w16sdtdh w16sdtfl w16du wp14">
   <w:p>
     <w:pPr>
       <w:pStyle w:val="Header"/>
-      <w:ind w:right="360"/>
+      <w:pBdr>
+        <w:bottom w:val="single" w:sz="6" w:space="1" w:color="auto"/>
+      </w:pBdr>
+      <w:tabs>
+        <w:tab w:val="clear" w:pos="9360"/>
+        <w:tab w:val="left" w:pos="142"/>
+        <w:tab w:val="right" w:pos="9781"/>
+      </w:tabs>
+      <w:ind w:right="1"/>
     </w:pPr>
+    <w:r>
+      <w:tab/>
+      <w:t>05.2.9.4-ST</w:t>
+    </w:r>
+    <w:r>
+      <w:tab/>
+    </w:r>
+    <w:r>
+      <w:tab/>
+      <w:t xml:space="preserve">Trang: </w:t>
+    </w:r>
+    <w:r>
+      <w:t>8</w:t>
+    </w:r>
+    <w:r>
+      <w:t>/</w:t>
+    </w:r>
+    <w:r>
+      <w:t>12</w:t>
+    </w:r>
   </w:p>
 </w:hdr>
 </file>
 
-<file path=word/header2.xml><?xml version="1.0" encoding="utf-8"?>
+<file path=word/header3.xml><?xml version="1.0" encoding="utf-8"?>
 <w:hdr xmlns:wpc="http://schemas.microsoft.com/office/word/2010/wordprocessingCanvas" xmlns:cx="http://schemas.microsoft.com/office/drawing/2014/chartex" xmlns:cx1="http://schemas.microsoft.com/office/drawing/2015/9/8/chartex" xmlns:cx2="http://schemas.microsoft.com/office/drawing/2015/10/21/chartex" xmlns:cx3="http://schemas.microsoft.com/office/drawing/2016/5/9/chartex" xmlns:cx4="http://schemas.microsoft.com/office/drawing/2016/5/10/chartex" xmlns:cx5="http://schemas.microsoft.com/office/drawing/2016/5/11/chartex" xmlns:cx6="http://schemas.microsoft.com/office/drawing/2016/5/12/chartex" xmlns:cx7="http://schemas.microsoft.com/office/drawing/2016/5/13/chartex" xmlns:cx8="http://schemas.microsoft.com/office/drawing/2016/5/14/chartex" xmlns:mc="http://schemas.openxmlformats.org/markup-compatibility/2006" xmlns:aink="http://schemas.microsoft.com/office/drawing/2016/ink" xmlns:am3d="http://schemas.microsoft.com/office/drawing/2017/model3d" xmlns:o="urn:schemas-microsoft-com:office:office" xmlns:oel="http://schemas.microsoft.com/office/2019/extlst" xmlns:r="http://schemas.openxmlformats.org/officeDocument/2006/relationships" xmlns:m="http://schemas.openxmlformats.org/officeDocument/2006/math" xmlns:v="urn:schemas-microsoft-com:vml" xmlns:wp14="http://schemas.microsoft.com/office/word/2010/wordprocessingDrawing" xmlns:wp="http://schemas.openxmlformats.org/drawingml/2006/wordprocessingDrawing" xmlns:w10="urn:schemas-microsoft-com:office:word" xmlns:w="http://schemas.openxmlformats.org/wordprocessingml/2006/main" xmlns:w14="http://schemas.microsoft.com/office/word/2010/wordml" xmlns:w15="http://schemas.microsoft.com/office/word/2012/wordml" xmlns:w16cex="http://schemas.microsoft.com/office/word/2018/wordml/cex" xmlns:w16cid="http://schemas.microsoft.com/office/word/2016/wordml/cid" xmlns:w16="http://schemas.microsoft.com/office/word/2018/wordml" xmlns:w16du="http://schemas.microsoft.com/office/word/2023/wordml/word16du" xmlns:w16sdtdh="http://schemas.microsoft.com/office/word/2020/wordml/sdtdatahash" xmlns:w16sdtfl="http://schemas.microsoft.com/office/word/2024/wordml/sdtformatlock" xmlns:w16se="http://schemas.microsoft.com/office/word/2015/wordml/symex" xmlns:wpg="http://schemas.microsoft.com/office/word/2010/wordprocessingGroup" xmlns:wpi="http://schemas.microsoft.com/office/word/2010/wordprocessingInk" xmlns:wne="http://schemas.microsoft.com/office/word/2006/wordml" xmlns:wps="http://schemas.microsoft.com/office/word/2010/wordprocessingShape" mc:Ignorable="w14 w15 w16se w16cid w16 w16cex w16sdtdh w16sdtfl w16du wp14">
   <w:p>
     <w:pPr>
@@ -9550,7 +9572,7 @@
         <w:kern w:val="2"/>
         <w:sz w:val="26"/>
         <w:szCs w:val="24"/>
-        <w:lang w:eastAsia="en-US" w:bidi="ar-SA"/>
+        <w:lang w:val="en-US" w:eastAsia="en-US" w:bidi="ar-SA"/>
         <w14:ligatures w14:val="standardContextual"/>
       </w:rPr>
     </w:rPrDefault>
@@ -9947,7 +9969,6 @@
       <w:color w:val="auto"/>
       <w:kern w:val="0"/>
       <w:szCs w:val="22"/>
-      <w:lang w:val="en-US"/>
       <w14:ligatures w14:val="none"/>
     </w:rPr>
   </w:style>
@@ -10775,7 +10796,6 @@
       <w:rFonts w:eastAsia="Times New Roman"/>
       <w:kern w:val="0"/>
       <w:szCs w:val="20"/>
-      <w:lang w:val="en-US"/>
       <w14:ligatures w14:val="none"/>
     </w:rPr>
   </w:style>
@@ -10813,7 +10833,6 @@
       <w:rFonts w:eastAsia="Times New Roman" w:cs="Times New Roman"/>
       <w:sz w:val="24"/>
       <w:szCs w:val="24"/>
-      <w:lang/>
     </w:rPr>
   </w:style>
 </w:styles>

</xml_diff>